<commit_message>
09/21/26-09/28/26 update time log Liza
</commit_message>
<xml_diff>
--- a/docs/Time Log Liza.docx
+++ b/docs/Time Log Liza.docx
@@ -570,82 +570,79 @@
               <w:rPr>
                 <w:rtl w:val="0"/>
               </w:rPr>
-              <w:t xml:space="preserve">Week 2 ...</w:t>
-            </w:r>
-          </w:p>
-          <w:p>
-            <w:pPr>
-              <w:rPr/>
-            </w:pPr>
-            <w:r>
-              <w:rPr>
-                <w:rtl w:val="0"/>
-              </w:rPr>
-            </w:r>
-          </w:p>
-        </w:tc>
-        <w:tc>
-          <w:tcPr/>
-          <w:p>
-            <w:pPr>
-              <w:rPr/>
-            </w:pPr>
-            <w:r>
-              <w:rPr>
-                <w:rtl w:val="0"/>
-              </w:rPr>
-            </w:r>
-          </w:p>
-        </w:tc>
-        <w:tc>
-          <w:tcPr/>
-          <w:p>
-            <w:pPr>
-              <w:rPr/>
-            </w:pPr>
-            <w:r>
-              <w:rPr>
-                <w:rtl w:val="0"/>
-              </w:rPr>
-            </w:r>
-          </w:p>
-        </w:tc>
-        <w:tc>
-          <w:tcPr/>
-          <w:p>
-            <w:pPr>
-              <w:rPr/>
-            </w:pPr>
-            <w:r>
-              <w:rPr>
-                <w:rtl w:val="0"/>
-              </w:rPr>
-            </w:r>
-          </w:p>
-        </w:tc>
-        <w:tc>
-          <w:tcPr/>
-          <w:p>
-            <w:pPr>
-              <w:rPr/>
-            </w:pPr>
-            <w:r>
-              <w:rPr>
-                <w:rtl w:val="0"/>
-              </w:rPr>
-            </w:r>
-          </w:p>
-        </w:tc>
-        <w:tc>
-          <w:tcPr/>
-          <w:p>
-            <w:pPr>
-              <w:rPr/>
-            </w:pPr>
-            <w:r>
-              <w:rPr>
-                <w:rtl w:val="0"/>
-              </w:rPr>
+              <w:t xml:space="preserve">Week 2:</w:t>
+              <w:br w:type="textWrapping"/>
+              <w:t xml:space="preserve">09/21/26- 09/28/26</w:t>
+            </w:r>
+          </w:p>
+        </w:tc>
+        <w:tc>
+          <w:tcPr/>
+          <w:p>
+            <w:pPr>
+              <w:rPr/>
+            </w:pPr>
+            <w:r>
+              <w:rPr>
+                <w:rtl w:val="0"/>
+              </w:rPr>
+              <w:t xml:space="preserve">Group meeting</w:t>
+            </w:r>
+          </w:p>
+        </w:tc>
+        <w:tc>
+          <w:tcPr/>
+          <w:p>
+            <w:pPr>
+              <w:rPr/>
+            </w:pPr>
+            <w:r>
+              <w:rPr>
+                <w:rtl w:val="0"/>
+              </w:rPr>
+              <w:t xml:space="preserve">09/22/26</w:t>
+            </w:r>
+          </w:p>
+        </w:tc>
+        <w:tc>
+          <w:tcPr/>
+          <w:p>
+            <w:pPr>
+              <w:rPr/>
+            </w:pPr>
+            <w:r>
+              <w:rPr>
+                <w:rtl w:val="0"/>
+              </w:rPr>
+              <w:t xml:space="preserve">2pm</w:t>
+            </w:r>
+          </w:p>
+        </w:tc>
+        <w:tc>
+          <w:tcPr/>
+          <w:p>
+            <w:pPr>
+              <w:rPr/>
+            </w:pPr>
+            <w:r>
+              <w:rPr>
+                <w:rtl w:val="0"/>
+              </w:rPr>
+              <w:t xml:space="preserve">2:20pm</w:t>
+            </w:r>
+          </w:p>
+        </w:tc>
+        <w:tc>
+          <w:tcPr/>
+          <w:p>
+            <w:pPr>
+              <w:rPr/>
+            </w:pPr>
+            <w:r>
+              <w:rPr>
+                <w:rtl w:val="0"/>
+              </w:rPr>
+              <w:t xml:space="preserve">20 min</w:t>
             </w:r>
           </w:p>
         </w:tc>
@@ -678,58 +675,63 @@
               <w:rPr>
                 <w:rtl w:val="0"/>
               </w:rPr>
-            </w:r>
-          </w:p>
-        </w:tc>
-        <w:tc>
-          <w:tcPr/>
-          <w:p>
-            <w:pPr>
-              <w:rPr/>
-            </w:pPr>
-            <w:r>
-              <w:rPr>
-                <w:rtl w:val="0"/>
-              </w:rPr>
-            </w:r>
-          </w:p>
-        </w:tc>
-        <w:tc>
-          <w:tcPr/>
-          <w:p>
-            <w:pPr>
-              <w:rPr/>
-            </w:pPr>
-            <w:r>
-              <w:rPr>
-                <w:rtl w:val="0"/>
-              </w:rPr>
-            </w:r>
-          </w:p>
-        </w:tc>
-        <w:tc>
-          <w:tcPr/>
-          <w:p>
-            <w:pPr>
-              <w:rPr/>
-            </w:pPr>
-            <w:r>
-              <w:rPr>
-                <w:rtl w:val="0"/>
-              </w:rPr>
-            </w:r>
-          </w:p>
-        </w:tc>
-        <w:tc>
-          <w:tcPr/>
-          <w:p>
-            <w:pPr>
-              <w:rPr/>
-            </w:pPr>
-            <w:r>
-              <w:rPr>
-                <w:rtl w:val="0"/>
-              </w:rPr>
+              <w:t xml:space="preserve">Requirements </w:t>
+            </w:r>
+          </w:p>
+        </w:tc>
+        <w:tc>
+          <w:tcPr/>
+          <w:p>
+            <w:pPr>
+              <w:rPr/>
+            </w:pPr>
+            <w:r>
+              <w:rPr>
+                <w:rtl w:val="0"/>
+              </w:rPr>
+              <w:t xml:space="preserve">09/22/26</w:t>
+            </w:r>
+          </w:p>
+        </w:tc>
+        <w:tc>
+          <w:tcPr/>
+          <w:p>
+            <w:pPr>
+              <w:rPr/>
+            </w:pPr>
+            <w:r>
+              <w:rPr>
+                <w:rtl w:val="0"/>
+              </w:rPr>
+              <w:t xml:space="preserve">2:20pm</w:t>
+            </w:r>
+          </w:p>
+        </w:tc>
+        <w:tc>
+          <w:tcPr/>
+          <w:p>
+            <w:pPr>
+              <w:rPr/>
+            </w:pPr>
+            <w:r>
+              <w:rPr>
+                <w:rtl w:val="0"/>
+              </w:rPr>
+              <w:t xml:space="preserve">3pm</w:t>
+            </w:r>
+          </w:p>
+        </w:tc>
+        <w:tc>
+          <w:tcPr/>
+          <w:p>
+            <w:pPr>
+              <w:rPr/>
+            </w:pPr>
+            <w:r>
+              <w:rPr>
+                <w:rtl w:val="0"/>
+              </w:rPr>
+              <w:t xml:space="preserve">40min</w:t>
             </w:r>
           </w:p>
         </w:tc>
@@ -762,58 +764,248 @@
               <w:rPr>
                 <w:rtl w:val="0"/>
               </w:rPr>
-            </w:r>
-          </w:p>
-        </w:tc>
-        <w:tc>
-          <w:tcPr/>
-          <w:p>
-            <w:pPr>
-              <w:rPr/>
-            </w:pPr>
-            <w:r>
-              <w:rPr>
-                <w:rtl w:val="0"/>
-              </w:rPr>
-            </w:r>
-          </w:p>
-        </w:tc>
-        <w:tc>
-          <w:tcPr/>
-          <w:p>
-            <w:pPr>
-              <w:rPr/>
-            </w:pPr>
-            <w:r>
-              <w:rPr>
-                <w:rtl w:val="0"/>
-              </w:rPr>
-            </w:r>
-          </w:p>
-        </w:tc>
-        <w:tc>
-          <w:tcPr/>
-          <w:p>
-            <w:pPr>
-              <w:rPr/>
-            </w:pPr>
-            <w:r>
-              <w:rPr>
-                <w:rtl w:val="0"/>
-              </w:rPr>
-            </w:r>
-          </w:p>
-        </w:tc>
-        <w:tc>
-          <w:tcPr/>
-          <w:p>
-            <w:pPr>
-              <w:rPr/>
-            </w:pPr>
-            <w:r>
-              <w:rPr>
-                <w:rtl w:val="0"/>
-              </w:rPr>
+              <w:t xml:space="preserve">Interview questions</w:t>
+            </w:r>
+          </w:p>
+        </w:tc>
+        <w:tc>
+          <w:tcPr/>
+          <w:p>
+            <w:pPr>
+              <w:rPr/>
+            </w:pPr>
+            <w:r>
+              <w:rPr>
+                <w:rtl w:val="0"/>
+              </w:rPr>
+              <w:t xml:space="preserve">09/23/26</w:t>
+            </w:r>
+          </w:p>
+        </w:tc>
+        <w:tc>
+          <w:tcPr/>
+          <w:p>
+            <w:pPr>
+              <w:rPr/>
+            </w:pPr>
+            <w:r>
+              <w:rPr>
+                <w:rtl w:val="0"/>
+              </w:rPr>
+              <w:t xml:space="preserve">2pm</w:t>
+            </w:r>
+          </w:p>
+        </w:tc>
+        <w:tc>
+          <w:tcPr/>
+          <w:p>
+            <w:pPr>
+              <w:rPr/>
+            </w:pPr>
+            <w:r>
+              <w:rPr>
+                <w:rtl w:val="0"/>
+              </w:rPr>
+              <w:t xml:space="preserve">2:15pm</w:t>
+            </w:r>
+          </w:p>
+        </w:tc>
+        <w:tc>
+          <w:tcPr/>
+          <w:p>
+            <w:pPr>
+              <w:rPr/>
+            </w:pPr>
+            <w:r>
+              <w:rPr>
+                <w:rtl w:val="0"/>
+              </w:rPr>
+              <w:t xml:space="preserve">15min</w:t>
+            </w:r>
+          </w:p>
+        </w:tc>
+      </w:tr>
+      <w:tr>
+        <w:trPr>
+          <w:cantSplit w:val="0"/>
+          <w:tblHeader w:val="0"/>
+        </w:trPr>
+        <w:tc>
+          <w:tcPr/>
+          <w:p>
+            <w:pPr>
+              <w:rPr/>
+            </w:pPr>
+            <w:r>
+              <w:rPr>
+                <w:rtl w:val="0"/>
+              </w:rPr>
+            </w:r>
+          </w:p>
+        </w:tc>
+        <w:tc>
+          <w:tcPr/>
+          <w:p>
+            <w:pPr>
+              <w:rPr/>
+            </w:pPr>
+            <w:r>
+              <w:rPr>
+                <w:rtl w:val="0"/>
+              </w:rPr>
+              <w:t xml:space="preserve">Requirements </w:t>
+            </w:r>
+          </w:p>
+        </w:tc>
+        <w:tc>
+          <w:tcPr/>
+          <w:p>
+            <w:pPr>
+              <w:rPr/>
+            </w:pPr>
+            <w:r>
+              <w:rPr>
+                <w:rtl w:val="0"/>
+              </w:rPr>
+              <w:t xml:space="preserve">09/24/26</w:t>
+            </w:r>
+          </w:p>
+        </w:tc>
+        <w:tc>
+          <w:tcPr/>
+          <w:p>
+            <w:pPr>
+              <w:rPr/>
+            </w:pPr>
+            <w:r>
+              <w:rPr>
+                <w:rtl w:val="0"/>
+              </w:rPr>
+              <w:t xml:space="preserve">2:45pm</w:t>
+            </w:r>
+          </w:p>
+        </w:tc>
+        <w:tc>
+          <w:tcPr/>
+          <w:p>
+            <w:pPr>
+              <w:rPr/>
+            </w:pPr>
+            <w:r>
+              <w:rPr>
+                <w:rtl w:val="0"/>
+              </w:rPr>
+              <w:t xml:space="preserve">3:50pm</w:t>
+            </w:r>
+          </w:p>
+        </w:tc>
+        <w:tc>
+          <w:tcPr/>
+          <w:p>
+            <w:pPr>
+              <w:rPr/>
+            </w:pPr>
+            <w:r>
+              <w:rPr>
+                <w:rtl w:val="0"/>
+              </w:rPr>
+              <w:t xml:space="preserve">65min</w:t>
+            </w:r>
+          </w:p>
+        </w:tc>
+      </w:tr>
+      <w:tr>
+        <w:trPr>
+          <w:cantSplit w:val="0"/>
+          <w:tblHeader w:val="0"/>
+        </w:trPr>
+        <w:tc>
+          <w:tcPr/>
+          <w:p>
+            <w:pPr>
+              <w:rPr/>
+            </w:pPr>
+            <w:r>
+              <w:rPr>
+                <w:rtl w:val="0"/>
+              </w:rPr>
+            </w:r>
+          </w:p>
+        </w:tc>
+        <w:tc>
+          <w:tcPr/>
+          <w:p>
+            <w:pPr>
+              <w:rPr/>
+            </w:pPr>
+            <w:r>
+              <w:rPr>
+                <w:rtl w:val="0"/>
+              </w:rPr>
+            </w:r>
+          </w:p>
+        </w:tc>
+        <w:tc>
+          <w:tcPr/>
+          <w:p>
+            <w:pPr>
+              <w:rPr/>
+            </w:pPr>
+            <w:r>
+              <w:rPr>
+                <w:rtl w:val="0"/>
+              </w:rPr>
+            </w:r>
+          </w:p>
+        </w:tc>
+        <w:tc>
+          <w:tcPr/>
+          <w:p>
+            <w:pPr>
+              <w:rPr/>
+            </w:pPr>
+            <w:r>
+              <w:rPr>
+                <w:rtl w:val="0"/>
+              </w:rPr>
+            </w:r>
+          </w:p>
+        </w:tc>
+        <w:tc>
+          <w:tcPr/>
+          <w:p>
+            <w:pPr>
+              <w:rPr/>
+            </w:pPr>
+            <w:r>
+              <w:rPr>
+                <w:rtl w:val="0"/>
+              </w:rPr>
+            </w:r>
+          </w:p>
+        </w:tc>
+        <w:tc>
+          <w:tcPr/>
+          <w:p>
+            <w:pPr>
+              <w:rPr/>
+            </w:pPr>
+            <w:r>
+              <w:rPr>
+                <w:rtl w:val="0"/>
+              </w:rPr>
+              <w:t xml:space="preserve">Week total: </w:t>
+            </w:r>
+          </w:p>
+          <w:p>
+            <w:pPr>
+              <w:rPr/>
+            </w:pPr>
+            <w:r>
+              <w:rPr>
+                <w:rtl w:val="0"/>
+              </w:rPr>
+              <w:t xml:space="preserve">140 min</w:t>
             </w:r>
           </w:p>
         </w:tc>

</xml_diff>

<commit_message>
09/29/26-10/04/26 update time log Liza
</commit_message>
<xml_diff>
--- a/docs/Time Log Liza.docx
+++ b/docs/Time Log Liza.docx
@@ -1006,6 +1006,387 @@
                 <w:rtl w:val="0"/>
               </w:rPr>
               <w:t xml:space="preserve">140 min</w:t>
+            </w:r>
+          </w:p>
+        </w:tc>
+      </w:tr>
+      <w:tr>
+        <w:trPr>
+          <w:cantSplit w:val="0"/>
+          <w:tblHeader w:val="0"/>
+        </w:trPr>
+        <w:tc>
+          <w:tcPr/>
+          <w:p>
+            <w:pPr>
+              <w:spacing w:after="200" w:line="276" w:lineRule="auto"/>
+              <w:rPr/>
+            </w:pPr>
+            <w:r>
+              <w:rPr>
+                <w:rtl w:val="0"/>
+              </w:rPr>
+              <w:t xml:space="preserve">Week 3: 09/29/26-10/04/26</w:t>
+            </w:r>
+          </w:p>
+        </w:tc>
+        <w:tc>
+          <w:tcPr/>
+          <w:p>
+            <w:pPr>
+              <w:rPr/>
+            </w:pPr>
+            <w:r>
+              <w:rPr>
+                <w:rtl w:val="0"/>
+              </w:rPr>
+              <w:t xml:space="preserve">Group meeting</w:t>
+            </w:r>
+          </w:p>
+        </w:tc>
+        <w:tc>
+          <w:tcPr/>
+          <w:p>
+            <w:pPr>
+              <w:rPr/>
+            </w:pPr>
+            <w:r>
+              <w:rPr>
+                <w:rtl w:val="0"/>
+              </w:rPr>
+              <w:t xml:space="preserve">10/01/26</w:t>
+            </w:r>
+          </w:p>
+        </w:tc>
+        <w:tc>
+          <w:tcPr/>
+          <w:p>
+            <w:pPr>
+              <w:rPr/>
+            </w:pPr>
+            <w:r>
+              <w:rPr>
+                <w:rtl w:val="0"/>
+              </w:rPr>
+              <w:t xml:space="preserve">2:30pm</w:t>
+            </w:r>
+          </w:p>
+        </w:tc>
+        <w:tc>
+          <w:tcPr/>
+          <w:p>
+            <w:pPr>
+              <w:rPr/>
+            </w:pPr>
+            <w:r>
+              <w:rPr>
+                <w:rtl w:val="0"/>
+              </w:rPr>
+              <w:t xml:space="preserve">3pm</w:t>
+            </w:r>
+          </w:p>
+        </w:tc>
+        <w:tc>
+          <w:tcPr/>
+          <w:p>
+            <w:pPr>
+              <w:rPr/>
+            </w:pPr>
+            <w:r>
+              <w:rPr>
+                <w:rtl w:val="0"/>
+              </w:rPr>
+              <w:t xml:space="preserve">30min</w:t>
+            </w:r>
+          </w:p>
+        </w:tc>
+      </w:tr>
+      <w:tr>
+        <w:trPr>
+          <w:cantSplit w:val="0"/>
+          <w:tblHeader w:val="0"/>
+        </w:trPr>
+        <w:tc>
+          <w:tcPr/>
+          <w:p>
+            <w:pPr>
+              <w:rPr/>
+            </w:pPr>
+            <w:r>
+              <w:rPr>
+                <w:rtl w:val="0"/>
+              </w:rPr>
+            </w:r>
+          </w:p>
+        </w:tc>
+        <w:tc>
+          <w:tcPr/>
+          <w:p>
+            <w:pPr>
+              <w:spacing w:after="200" w:line="276" w:lineRule="auto"/>
+              <w:rPr/>
+            </w:pPr>
+            <w:r>
+              <w:rPr>
+                <w:rtl w:val="0"/>
+              </w:rPr>
+              <w:t xml:space="preserve">Use Case Diagram</w:t>
+            </w:r>
+          </w:p>
+        </w:tc>
+        <w:tc>
+          <w:tcPr/>
+          <w:p>
+            <w:pPr>
+              <w:rPr/>
+            </w:pPr>
+            <w:r>
+              <w:rPr>
+                <w:rtl w:val="0"/>
+              </w:rPr>
+              <w:t xml:space="preserve">10/02/26</w:t>
+            </w:r>
+          </w:p>
+        </w:tc>
+        <w:tc>
+          <w:tcPr/>
+          <w:p>
+            <w:pPr>
+              <w:rPr/>
+            </w:pPr>
+            <w:r>
+              <w:rPr>
+                <w:rtl w:val="0"/>
+              </w:rPr>
+              <w:t xml:space="preserve">4:30pm</w:t>
+            </w:r>
+          </w:p>
+        </w:tc>
+        <w:tc>
+          <w:tcPr/>
+          <w:p>
+            <w:pPr>
+              <w:rPr/>
+            </w:pPr>
+            <w:r>
+              <w:rPr>
+                <w:rtl w:val="0"/>
+              </w:rPr>
+              <w:t xml:space="preserve">5:30pm</w:t>
+            </w:r>
+          </w:p>
+        </w:tc>
+        <w:tc>
+          <w:tcPr/>
+          <w:p>
+            <w:pPr>
+              <w:rPr/>
+            </w:pPr>
+            <w:r>
+              <w:rPr>
+                <w:rtl w:val="0"/>
+              </w:rPr>
+              <w:t xml:space="preserve">60min</w:t>
+            </w:r>
+          </w:p>
+        </w:tc>
+      </w:tr>
+      <w:tr>
+        <w:trPr>
+          <w:cantSplit w:val="0"/>
+          <w:tblHeader w:val="0"/>
+        </w:trPr>
+        <w:tc>
+          <w:tcPr/>
+          <w:p>
+            <w:pPr>
+              <w:rPr/>
+            </w:pPr>
+            <w:r>
+              <w:rPr>
+                <w:rtl w:val="0"/>
+              </w:rPr>
+            </w:r>
+          </w:p>
+        </w:tc>
+        <w:tc>
+          <w:tcPr/>
+          <w:p>
+            <w:pPr>
+              <w:keepNext w:val="0"/>
+              <w:keepLines w:val="0"/>
+              <w:rPr/>
+            </w:pPr>
+            <w:r>
+              <w:rPr>
+                <w:rtl w:val="0"/>
+              </w:rPr>
+              <w:t xml:space="preserve">Use Case Scenarios</w:t>
+            </w:r>
+          </w:p>
+          <w:p>
+            <w:pPr>
+              <w:spacing w:after="200" w:line="276" w:lineRule="auto"/>
+              <w:rPr/>
+            </w:pPr>
+            <w:r>
+              <w:rPr>
+                <w:rtl w:val="0"/>
+              </w:rPr>
+            </w:r>
+          </w:p>
+        </w:tc>
+        <w:tc>
+          <w:tcPr/>
+          <w:p>
+            <w:pPr>
+              <w:rPr/>
+            </w:pPr>
+            <w:r>
+              <w:rPr>
+                <w:rtl w:val="0"/>
+              </w:rPr>
+              <w:t xml:space="preserve">10/02/26</w:t>
+            </w:r>
+          </w:p>
+        </w:tc>
+        <w:tc>
+          <w:tcPr/>
+          <w:p>
+            <w:pPr>
+              <w:rPr/>
+            </w:pPr>
+            <w:r>
+              <w:rPr>
+                <w:rtl w:val="0"/>
+              </w:rPr>
+              <w:t xml:space="preserve">7pm</w:t>
+            </w:r>
+          </w:p>
+        </w:tc>
+        <w:tc>
+          <w:tcPr/>
+          <w:p>
+            <w:pPr>
+              <w:rPr/>
+            </w:pPr>
+            <w:r>
+              <w:rPr>
+                <w:rtl w:val="0"/>
+              </w:rPr>
+              <w:t xml:space="preserve">8pm</w:t>
+            </w:r>
+          </w:p>
+        </w:tc>
+        <w:tc>
+          <w:tcPr/>
+          <w:p>
+            <w:pPr>
+              <w:rPr/>
+            </w:pPr>
+            <w:r>
+              <w:rPr>
+                <w:rtl w:val="0"/>
+              </w:rPr>
+              <w:t xml:space="preserve">60min</w:t>
+            </w:r>
+          </w:p>
+        </w:tc>
+      </w:tr>
+      <w:tr>
+        <w:trPr>
+          <w:cantSplit w:val="0"/>
+          <w:tblHeader w:val="0"/>
+        </w:trPr>
+        <w:tc>
+          <w:tcPr/>
+          <w:p>
+            <w:pPr>
+              <w:rPr/>
+            </w:pPr>
+            <w:r>
+              <w:rPr>
+                <w:rtl w:val="0"/>
+              </w:rPr>
+            </w:r>
+          </w:p>
+        </w:tc>
+        <w:tc>
+          <w:tcPr/>
+          <w:p>
+            <w:pPr>
+              <w:keepNext w:val="0"/>
+              <w:keepLines w:val="0"/>
+              <w:rPr/>
+            </w:pPr>
+            <w:r>
+              <w:rPr>
+                <w:rtl w:val="0"/>
+              </w:rPr>
+            </w:r>
+          </w:p>
+        </w:tc>
+        <w:tc>
+          <w:tcPr/>
+          <w:p>
+            <w:pPr>
+              <w:rPr/>
+            </w:pPr>
+            <w:r>
+              <w:rPr>
+                <w:rtl w:val="0"/>
+              </w:rPr>
+            </w:r>
+          </w:p>
+        </w:tc>
+        <w:tc>
+          <w:tcPr/>
+          <w:p>
+            <w:pPr>
+              <w:rPr/>
+            </w:pPr>
+            <w:r>
+              <w:rPr>
+                <w:rtl w:val="0"/>
+              </w:rPr>
+            </w:r>
+          </w:p>
+        </w:tc>
+        <w:tc>
+          <w:tcPr/>
+          <w:p>
+            <w:pPr>
+              <w:rPr/>
+            </w:pPr>
+            <w:r>
+              <w:rPr>
+                <w:rtl w:val="0"/>
+              </w:rPr>
+            </w:r>
+          </w:p>
+        </w:tc>
+        <w:tc>
+          <w:tcPr/>
+          <w:p>
+            <w:pPr>
+              <w:rPr/>
+            </w:pPr>
+            <w:r>
+              <w:rPr>
+                <w:rtl w:val="0"/>
+              </w:rPr>
+              <w:t xml:space="preserve">Week total: </w:t>
+            </w:r>
+          </w:p>
+          <w:p>
+            <w:pPr>
+              <w:rPr/>
+            </w:pPr>
+            <w:r>
+              <w:rPr>
+                <w:rtl w:val="0"/>
+              </w:rPr>
+              <w:t xml:space="preserve">150 min</w:t>
             </w:r>
           </w:p>
         </w:tc>

</xml_diff>

<commit_message>
10/05/26-10/11/26 update time log
</commit_message>
<xml_diff>
--- a/docs/Time Log Liza.docx
+++ b/docs/Time Log Liza.docx
@@ -1387,6 +1387,3057 @@
                 <w:rtl w:val="0"/>
               </w:rPr>
               <w:t xml:space="preserve">150 min</w:t>
+            </w:r>
+          </w:p>
+        </w:tc>
+      </w:tr>
+      <w:tr>
+        <w:trPr>
+          <w:cantSplit w:val="0"/>
+          <w:tblHeader w:val="0"/>
+        </w:trPr>
+        <w:tc>
+          <w:tcPr/>
+          <w:p>
+            <w:pPr>
+              <w:spacing w:after="200" w:line="276" w:lineRule="auto"/>
+              <w:rPr/>
+            </w:pPr>
+            <w:r>
+              <w:rPr>
+                <w:rtl w:val="0"/>
+              </w:rPr>
+              <w:t xml:space="preserve">Week 4: 10/05/26-10/11/26</w:t>
+            </w:r>
+          </w:p>
+        </w:tc>
+        <w:tc>
+          <w:tcPr/>
+          <w:p>
+            <w:pPr>
+              <w:rPr/>
+            </w:pPr>
+            <w:r>
+              <w:rPr>
+                <w:rtl w:val="0"/>
+              </w:rPr>
+              <w:t xml:space="preserve">Use Case Scenarios</w:t>
+            </w:r>
+          </w:p>
+        </w:tc>
+        <w:tc>
+          <w:tcPr/>
+          <w:p>
+            <w:pPr>
+              <w:rPr/>
+            </w:pPr>
+            <w:r>
+              <w:rPr>
+                <w:rtl w:val="0"/>
+              </w:rPr>
+              <w:t xml:space="preserve">10/06/26</w:t>
+            </w:r>
+          </w:p>
+        </w:tc>
+        <w:tc>
+          <w:tcPr/>
+          <w:p>
+            <w:pPr>
+              <w:rPr/>
+            </w:pPr>
+            <w:r>
+              <w:rPr>
+                <w:rtl w:val="0"/>
+              </w:rPr>
+              <w:t xml:space="preserve">2:30pm</w:t>
+            </w:r>
+          </w:p>
+        </w:tc>
+        <w:tc>
+          <w:tcPr/>
+          <w:p>
+            <w:pPr>
+              <w:rPr/>
+            </w:pPr>
+            <w:r>
+              <w:rPr>
+                <w:rtl w:val="0"/>
+              </w:rPr>
+              <w:t xml:space="preserve">4pm</w:t>
+            </w:r>
+          </w:p>
+        </w:tc>
+        <w:tc>
+          <w:tcPr/>
+          <w:p>
+            <w:pPr>
+              <w:rPr/>
+            </w:pPr>
+            <w:r>
+              <w:rPr>
+                <w:rtl w:val="0"/>
+              </w:rPr>
+              <w:t xml:space="preserve">90min</w:t>
+            </w:r>
+          </w:p>
+        </w:tc>
+      </w:tr>
+      <w:tr>
+        <w:trPr>
+          <w:cantSplit w:val="0"/>
+          <w:tblHeader w:val="0"/>
+        </w:trPr>
+        <w:tc>
+          <w:tcPr/>
+          <w:p>
+            <w:pPr>
+              <w:rPr/>
+            </w:pPr>
+            <w:r>
+              <w:rPr>
+                <w:rtl w:val="0"/>
+              </w:rPr>
+            </w:r>
+          </w:p>
+        </w:tc>
+        <w:tc>
+          <w:tcPr/>
+          <w:p>
+            <w:pPr>
+              <w:rPr/>
+            </w:pPr>
+            <w:r>
+              <w:rPr>
+                <w:rtl w:val="0"/>
+              </w:rPr>
+              <w:t xml:space="preserve">Group meeting</w:t>
+            </w:r>
+          </w:p>
+        </w:tc>
+        <w:tc>
+          <w:tcPr/>
+          <w:p>
+            <w:pPr>
+              <w:rPr/>
+            </w:pPr>
+            <w:r>
+              <w:rPr>
+                <w:rtl w:val="0"/>
+              </w:rPr>
+              <w:t xml:space="preserve">10/06/26</w:t>
+            </w:r>
+          </w:p>
+        </w:tc>
+        <w:tc>
+          <w:tcPr/>
+          <w:p>
+            <w:pPr>
+              <w:rPr/>
+            </w:pPr>
+            <w:r>
+              <w:rPr>
+                <w:rtl w:val="0"/>
+              </w:rPr>
+              <w:t xml:space="preserve">4pm</w:t>
+            </w:r>
+          </w:p>
+        </w:tc>
+        <w:tc>
+          <w:tcPr/>
+          <w:p>
+            <w:pPr>
+              <w:rPr/>
+            </w:pPr>
+            <w:r>
+              <w:rPr>
+                <w:rtl w:val="0"/>
+              </w:rPr>
+              <w:t xml:space="preserve">4:30pm</w:t>
+            </w:r>
+          </w:p>
+        </w:tc>
+        <w:tc>
+          <w:tcPr/>
+          <w:p>
+            <w:pPr>
+              <w:rPr/>
+            </w:pPr>
+            <w:r>
+              <w:rPr>
+                <w:rtl w:val="0"/>
+              </w:rPr>
+              <w:t xml:space="preserve">30min</w:t>
+            </w:r>
+          </w:p>
+        </w:tc>
+      </w:tr>
+      <w:tr>
+        <w:trPr>
+          <w:cantSplit w:val="0"/>
+          <w:tblHeader w:val="0"/>
+        </w:trPr>
+        <w:tc>
+          <w:tcPr/>
+          <w:p>
+            <w:pPr>
+              <w:rPr/>
+            </w:pPr>
+            <w:r>
+              <w:rPr>
+                <w:rtl w:val="0"/>
+              </w:rPr>
+            </w:r>
+          </w:p>
+        </w:tc>
+        <w:tc>
+          <w:tcPr/>
+          <w:p>
+            <w:pPr>
+              <w:keepNext w:val="0"/>
+              <w:keepLines w:val="0"/>
+              <w:rPr/>
+            </w:pPr>
+            <w:r>
+              <w:rPr>
+                <w:rtl w:val="0"/>
+              </w:rPr>
+              <w:t xml:space="preserve">Test plan</w:t>
+            </w:r>
+          </w:p>
+        </w:tc>
+        <w:tc>
+          <w:tcPr/>
+          <w:p>
+            <w:pPr>
+              <w:rPr/>
+            </w:pPr>
+            <w:r>
+              <w:rPr>
+                <w:rtl w:val="0"/>
+              </w:rPr>
+              <w:t xml:space="preserve">10/08/26</w:t>
+            </w:r>
+          </w:p>
+        </w:tc>
+        <w:tc>
+          <w:tcPr/>
+          <w:p>
+            <w:pPr>
+              <w:rPr/>
+            </w:pPr>
+            <w:r>
+              <w:rPr>
+                <w:rtl w:val="0"/>
+              </w:rPr>
+              <w:t xml:space="preserve">9pm</w:t>
+            </w:r>
+          </w:p>
+        </w:tc>
+        <w:tc>
+          <w:tcPr/>
+          <w:p>
+            <w:pPr>
+              <w:rPr/>
+            </w:pPr>
+            <w:r>
+              <w:rPr>
+                <w:rtl w:val="0"/>
+              </w:rPr>
+              <w:t xml:space="preserve">10:05pm</w:t>
+            </w:r>
+          </w:p>
+        </w:tc>
+        <w:tc>
+          <w:tcPr/>
+          <w:p>
+            <w:pPr>
+              <w:rPr/>
+            </w:pPr>
+            <w:r>
+              <w:rPr>
+                <w:rtl w:val="0"/>
+              </w:rPr>
+              <w:t xml:space="preserve">65min</w:t>
+            </w:r>
+          </w:p>
+        </w:tc>
+      </w:tr>
+    </w:tbl>
+    <w:p>
+      <w:pPr>
+        <w:rPr/>
+      </w:pPr>
+      <w:r>
+        <w:rPr>
+          <w:rtl w:val="0"/>
+        </w:rPr>
+      </w:r>
+    </w:p>
+    <w:tbl>
+      <w:tblPr>
+        <w:tblStyle w:val="Table2"/>
+        <w:tblW w:w="9360.0" w:type="dxa"/>
+        <w:jc w:val="left"/>
+        <w:tblBorders>
+          <w:top w:color="000000" w:space="0" w:sz="8" w:val="single"/>
+          <w:left w:color="000000" w:space="0" w:sz="8" w:val="single"/>
+          <w:bottom w:color="000000" w:space="0" w:sz="8" w:val="single"/>
+          <w:right w:color="000000" w:space="0" w:sz="8" w:val="single"/>
+          <w:insideH w:color="000000" w:space="0" w:sz="8" w:val="single"/>
+          <w:insideV w:color="000000" w:space="0" w:sz="8" w:val="single"/>
+        </w:tblBorders>
+        <w:tblLayout w:type="fixed"/>
+        <w:tblLook w:val="0600"/>
+      </w:tblPr>
+      <w:tblGrid>
+        <w:gridCol w:w="1560"/>
+        <w:gridCol w:w="1560"/>
+        <w:gridCol w:w="1560"/>
+        <w:gridCol w:w="1560"/>
+        <w:gridCol w:w="1560"/>
+        <w:gridCol w:w="1560"/>
+        <w:tblGridChange w:id="0">
+          <w:tblGrid>
+            <w:gridCol w:w="1560"/>
+            <w:gridCol w:w="1560"/>
+            <w:gridCol w:w="1560"/>
+            <w:gridCol w:w="1560"/>
+            <w:gridCol w:w="1560"/>
+            <w:gridCol w:w="1560"/>
+          </w:tblGrid>
+        </w:tblGridChange>
+      </w:tblGrid>
+      <w:tr>
+        <w:trPr>
+          <w:cantSplit w:val="0"/>
+          <w:tblHeader w:val="0"/>
+        </w:trPr>
+        <w:tc>
+          <w:tcPr>
+            <w:shd w:fill="auto" w:val="clear"/>
+            <w:tcMar>
+              <w:top w:w="100.0" w:type="dxa"/>
+              <w:left w:w="100.0" w:type="dxa"/>
+              <w:bottom w:w="100.0" w:type="dxa"/>
+              <w:right w:w="100.0" w:type="dxa"/>
+            </w:tcMar>
+            <w:vAlign w:val="top"/>
+          </w:tcPr>
+          <w:p>
+            <w:pPr>
+              <w:keepNext w:val="0"/>
+              <w:keepLines w:val="0"/>
+              <w:pageBreakBefore w:val="0"/>
+              <w:widowControl w:val="0"/>
+              <w:pBdr>
+                <w:top w:space="0" w:sz="0" w:val="nil"/>
+                <w:left w:space="0" w:sz="0" w:val="nil"/>
+                <w:bottom w:space="0" w:sz="0" w:val="nil"/>
+                <w:right w:space="0" w:sz="0" w:val="nil"/>
+                <w:between w:space="0" w:sz="0" w:val="nil"/>
+              </w:pBdr>
+              <w:shd w:fill="auto" w:val="clear"/>
+              <w:spacing w:after="0" w:before="0" w:line="240" w:lineRule="auto"/>
+              <w:ind w:left="0" w:right="0" w:firstLine="0"/>
+              <w:jc w:val="left"/>
+              <w:rPr/>
+            </w:pPr>
+            <w:r>
+              <w:rPr>
+                <w:rtl w:val="0"/>
+              </w:rPr>
+            </w:r>
+          </w:p>
+        </w:tc>
+        <w:tc>
+          <w:tcPr>
+            <w:shd w:fill="auto" w:val="clear"/>
+            <w:tcMar>
+              <w:top w:w="100.0" w:type="dxa"/>
+              <w:left w:w="100.0" w:type="dxa"/>
+              <w:bottom w:w="100.0" w:type="dxa"/>
+              <w:right w:w="100.0" w:type="dxa"/>
+            </w:tcMar>
+            <w:vAlign w:val="top"/>
+          </w:tcPr>
+          <w:p>
+            <w:pPr>
+              <w:keepNext w:val="0"/>
+              <w:keepLines w:val="0"/>
+              <w:pageBreakBefore w:val="0"/>
+              <w:widowControl w:val="0"/>
+              <w:pBdr>
+                <w:top w:space="0" w:sz="0" w:val="nil"/>
+                <w:left w:space="0" w:sz="0" w:val="nil"/>
+                <w:bottom w:space="0" w:sz="0" w:val="nil"/>
+                <w:right w:space="0" w:sz="0" w:val="nil"/>
+                <w:between w:space="0" w:sz="0" w:val="nil"/>
+              </w:pBdr>
+              <w:shd w:fill="auto" w:val="clear"/>
+              <w:spacing w:after="0" w:before="0" w:line="240" w:lineRule="auto"/>
+              <w:ind w:left="0" w:right="0" w:firstLine="0"/>
+              <w:jc w:val="left"/>
+              <w:rPr/>
+            </w:pPr>
+            <w:r>
+              <w:rPr>
+                <w:rtl w:val="0"/>
+              </w:rPr>
+            </w:r>
+          </w:p>
+        </w:tc>
+        <w:tc>
+          <w:tcPr>
+            <w:shd w:fill="auto" w:val="clear"/>
+            <w:tcMar>
+              <w:top w:w="100.0" w:type="dxa"/>
+              <w:left w:w="100.0" w:type="dxa"/>
+              <w:bottom w:w="100.0" w:type="dxa"/>
+              <w:right w:w="100.0" w:type="dxa"/>
+            </w:tcMar>
+            <w:vAlign w:val="top"/>
+          </w:tcPr>
+          <w:p>
+            <w:pPr>
+              <w:keepNext w:val="0"/>
+              <w:keepLines w:val="0"/>
+              <w:pageBreakBefore w:val="0"/>
+              <w:widowControl w:val="0"/>
+              <w:pBdr>
+                <w:top w:space="0" w:sz="0" w:val="nil"/>
+                <w:left w:space="0" w:sz="0" w:val="nil"/>
+                <w:bottom w:space="0" w:sz="0" w:val="nil"/>
+                <w:right w:space="0" w:sz="0" w:val="nil"/>
+                <w:between w:space="0" w:sz="0" w:val="nil"/>
+              </w:pBdr>
+              <w:shd w:fill="auto" w:val="clear"/>
+              <w:spacing w:after="0" w:before="0" w:line="240" w:lineRule="auto"/>
+              <w:ind w:left="0" w:right="0" w:firstLine="0"/>
+              <w:jc w:val="left"/>
+              <w:rPr/>
+            </w:pPr>
+            <w:r>
+              <w:rPr>
+                <w:rtl w:val="0"/>
+              </w:rPr>
+            </w:r>
+          </w:p>
+        </w:tc>
+        <w:tc>
+          <w:tcPr>
+            <w:shd w:fill="auto" w:val="clear"/>
+            <w:tcMar>
+              <w:top w:w="100.0" w:type="dxa"/>
+              <w:left w:w="100.0" w:type="dxa"/>
+              <w:bottom w:w="100.0" w:type="dxa"/>
+              <w:right w:w="100.0" w:type="dxa"/>
+            </w:tcMar>
+            <w:vAlign w:val="top"/>
+          </w:tcPr>
+          <w:p>
+            <w:pPr>
+              <w:keepNext w:val="0"/>
+              <w:keepLines w:val="0"/>
+              <w:pageBreakBefore w:val="0"/>
+              <w:widowControl w:val="0"/>
+              <w:pBdr>
+                <w:top w:space="0" w:sz="0" w:val="nil"/>
+                <w:left w:space="0" w:sz="0" w:val="nil"/>
+                <w:bottom w:space="0" w:sz="0" w:val="nil"/>
+                <w:right w:space="0" w:sz="0" w:val="nil"/>
+                <w:between w:space="0" w:sz="0" w:val="nil"/>
+              </w:pBdr>
+              <w:shd w:fill="auto" w:val="clear"/>
+              <w:spacing w:after="0" w:before="0" w:line="240" w:lineRule="auto"/>
+              <w:ind w:left="0" w:right="0" w:firstLine="0"/>
+              <w:jc w:val="left"/>
+              <w:rPr/>
+            </w:pPr>
+            <w:r>
+              <w:rPr>
+                <w:rtl w:val="0"/>
+              </w:rPr>
+            </w:r>
+          </w:p>
+        </w:tc>
+        <w:tc>
+          <w:tcPr>
+            <w:shd w:fill="auto" w:val="clear"/>
+            <w:tcMar>
+              <w:top w:w="100.0" w:type="dxa"/>
+              <w:left w:w="100.0" w:type="dxa"/>
+              <w:bottom w:w="100.0" w:type="dxa"/>
+              <w:right w:w="100.0" w:type="dxa"/>
+            </w:tcMar>
+            <w:vAlign w:val="top"/>
+          </w:tcPr>
+          <w:p>
+            <w:pPr>
+              <w:keepNext w:val="0"/>
+              <w:keepLines w:val="0"/>
+              <w:pageBreakBefore w:val="0"/>
+              <w:widowControl w:val="0"/>
+              <w:pBdr>
+                <w:top w:space="0" w:sz="0" w:val="nil"/>
+                <w:left w:space="0" w:sz="0" w:val="nil"/>
+                <w:bottom w:space="0" w:sz="0" w:val="nil"/>
+                <w:right w:space="0" w:sz="0" w:val="nil"/>
+                <w:between w:space="0" w:sz="0" w:val="nil"/>
+              </w:pBdr>
+              <w:shd w:fill="auto" w:val="clear"/>
+              <w:spacing w:after="0" w:before="0" w:line="240" w:lineRule="auto"/>
+              <w:ind w:left="0" w:right="0" w:firstLine="0"/>
+              <w:jc w:val="left"/>
+              <w:rPr/>
+            </w:pPr>
+            <w:r>
+              <w:rPr>
+                <w:rtl w:val="0"/>
+              </w:rPr>
+            </w:r>
+          </w:p>
+        </w:tc>
+        <w:tc>
+          <w:tcPr>
+            <w:shd w:fill="auto" w:val="clear"/>
+            <w:tcMar>
+              <w:top w:w="100.0" w:type="dxa"/>
+              <w:left w:w="100.0" w:type="dxa"/>
+              <w:bottom w:w="100.0" w:type="dxa"/>
+              <w:right w:w="100.0" w:type="dxa"/>
+            </w:tcMar>
+            <w:vAlign w:val="top"/>
+          </w:tcPr>
+          <w:p>
+            <w:pPr>
+              <w:spacing w:after="0" w:line="240" w:lineRule="auto"/>
+              <w:rPr/>
+            </w:pPr>
+            <w:r>
+              <w:rPr>
+                <w:rtl w:val="0"/>
+              </w:rPr>
+              <w:t xml:space="preserve">Week total: </w:t>
+            </w:r>
+          </w:p>
+          <w:p>
+            <w:pPr>
+              <w:spacing w:after="0" w:line="240" w:lineRule="auto"/>
+              <w:rPr/>
+            </w:pPr>
+            <w:r>
+              <w:rPr>
+                <w:rtl w:val="0"/>
+              </w:rPr>
+              <w:t xml:space="preserve">185 min</w:t>
+            </w:r>
+          </w:p>
+        </w:tc>
+      </w:tr>
+      <w:tr>
+        <w:trPr>
+          <w:cantSplit w:val="0"/>
+          <w:tblHeader w:val="0"/>
+        </w:trPr>
+        <w:tc>
+          <w:tcPr>
+            <w:shd w:fill="auto" w:val="clear"/>
+            <w:tcMar>
+              <w:top w:w="100.0" w:type="dxa"/>
+              <w:left w:w="100.0" w:type="dxa"/>
+              <w:bottom w:w="100.0" w:type="dxa"/>
+              <w:right w:w="100.0" w:type="dxa"/>
+            </w:tcMar>
+            <w:vAlign w:val="top"/>
+          </w:tcPr>
+          <w:p>
+            <w:pPr>
+              <w:keepNext w:val="0"/>
+              <w:keepLines w:val="0"/>
+              <w:pageBreakBefore w:val="0"/>
+              <w:widowControl w:val="0"/>
+              <w:pBdr>
+                <w:top w:space="0" w:sz="0" w:val="nil"/>
+                <w:left w:space="0" w:sz="0" w:val="nil"/>
+                <w:bottom w:space="0" w:sz="0" w:val="nil"/>
+                <w:right w:space="0" w:sz="0" w:val="nil"/>
+                <w:between w:space="0" w:sz="0" w:val="nil"/>
+              </w:pBdr>
+              <w:shd w:fill="auto" w:val="clear"/>
+              <w:spacing w:after="0" w:before="0" w:line="240" w:lineRule="auto"/>
+              <w:ind w:left="0" w:right="0" w:firstLine="0"/>
+              <w:jc w:val="left"/>
+              <w:rPr/>
+            </w:pPr>
+            <w:r>
+              <w:rPr>
+                <w:rtl w:val="0"/>
+              </w:rPr>
+            </w:r>
+          </w:p>
+        </w:tc>
+        <w:tc>
+          <w:tcPr>
+            <w:shd w:fill="auto" w:val="clear"/>
+            <w:tcMar>
+              <w:top w:w="100.0" w:type="dxa"/>
+              <w:left w:w="100.0" w:type="dxa"/>
+              <w:bottom w:w="100.0" w:type="dxa"/>
+              <w:right w:w="100.0" w:type="dxa"/>
+            </w:tcMar>
+            <w:vAlign w:val="top"/>
+          </w:tcPr>
+          <w:p>
+            <w:pPr>
+              <w:keepNext w:val="0"/>
+              <w:keepLines w:val="0"/>
+              <w:pageBreakBefore w:val="0"/>
+              <w:widowControl w:val="0"/>
+              <w:pBdr>
+                <w:top w:space="0" w:sz="0" w:val="nil"/>
+                <w:left w:space="0" w:sz="0" w:val="nil"/>
+                <w:bottom w:space="0" w:sz="0" w:val="nil"/>
+                <w:right w:space="0" w:sz="0" w:val="nil"/>
+                <w:between w:space="0" w:sz="0" w:val="nil"/>
+              </w:pBdr>
+              <w:shd w:fill="auto" w:val="clear"/>
+              <w:spacing w:after="0" w:before="0" w:line="240" w:lineRule="auto"/>
+              <w:ind w:left="0" w:right="0" w:firstLine="0"/>
+              <w:jc w:val="left"/>
+              <w:rPr/>
+            </w:pPr>
+            <w:r>
+              <w:rPr>
+                <w:rtl w:val="0"/>
+              </w:rPr>
+            </w:r>
+          </w:p>
+        </w:tc>
+        <w:tc>
+          <w:tcPr>
+            <w:shd w:fill="auto" w:val="clear"/>
+            <w:tcMar>
+              <w:top w:w="100.0" w:type="dxa"/>
+              <w:left w:w="100.0" w:type="dxa"/>
+              <w:bottom w:w="100.0" w:type="dxa"/>
+              <w:right w:w="100.0" w:type="dxa"/>
+            </w:tcMar>
+            <w:vAlign w:val="top"/>
+          </w:tcPr>
+          <w:p>
+            <w:pPr>
+              <w:keepNext w:val="0"/>
+              <w:keepLines w:val="0"/>
+              <w:pageBreakBefore w:val="0"/>
+              <w:widowControl w:val="0"/>
+              <w:pBdr>
+                <w:top w:space="0" w:sz="0" w:val="nil"/>
+                <w:left w:space="0" w:sz="0" w:val="nil"/>
+                <w:bottom w:space="0" w:sz="0" w:val="nil"/>
+                <w:right w:space="0" w:sz="0" w:val="nil"/>
+                <w:between w:space="0" w:sz="0" w:val="nil"/>
+              </w:pBdr>
+              <w:shd w:fill="auto" w:val="clear"/>
+              <w:spacing w:after="0" w:before="0" w:line="240" w:lineRule="auto"/>
+              <w:ind w:left="0" w:right="0" w:firstLine="0"/>
+              <w:jc w:val="left"/>
+              <w:rPr/>
+            </w:pPr>
+            <w:r>
+              <w:rPr>
+                <w:rtl w:val="0"/>
+              </w:rPr>
+            </w:r>
+          </w:p>
+        </w:tc>
+        <w:tc>
+          <w:tcPr>
+            <w:shd w:fill="auto" w:val="clear"/>
+            <w:tcMar>
+              <w:top w:w="100.0" w:type="dxa"/>
+              <w:left w:w="100.0" w:type="dxa"/>
+              <w:bottom w:w="100.0" w:type="dxa"/>
+              <w:right w:w="100.0" w:type="dxa"/>
+            </w:tcMar>
+            <w:vAlign w:val="top"/>
+          </w:tcPr>
+          <w:p>
+            <w:pPr>
+              <w:keepNext w:val="0"/>
+              <w:keepLines w:val="0"/>
+              <w:pageBreakBefore w:val="0"/>
+              <w:widowControl w:val="0"/>
+              <w:pBdr>
+                <w:top w:space="0" w:sz="0" w:val="nil"/>
+                <w:left w:space="0" w:sz="0" w:val="nil"/>
+                <w:bottom w:space="0" w:sz="0" w:val="nil"/>
+                <w:right w:space="0" w:sz="0" w:val="nil"/>
+                <w:between w:space="0" w:sz="0" w:val="nil"/>
+              </w:pBdr>
+              <w:shd w:fill="auto" w:val="clear"/>
+              <w:spacing w:after="0" w:before="0" w:line="240" w:lineRule="auto"/>
+              <w:ind w:left="0" w:right="0" w:firstLine="0"/>
+              <w:jc w:val="left"/>
+              <w:rPr/>
+            </w:pPr>
+            <w:r>
+              <w:rPr>
+                <w:rtl w:val="0"/>
+              </w:rPr>
+            </w:r>
+          </w:p>
+        </w:tc>
+        <w:tc>
+          <w:tcPr>
+            <w:shd w:fill="auto" w:val="clear"/>
+            <w:tcMar>
+              <w:top w:w="100.0" w:type="dxa"/>
+              <w:left w:w="100.0" w:type="dxa"/>
+              <w:bottom w:w="100.0" w:type="dxa"/>
+              <w:right w:w="100.0" w:type="dxa"/>
+            </w:tcMar>
+            <w:vAlign w:val="top"/>
+          </w:tcPr>
+          <w:p>
+            <w:pPr>
+              <w:keepNext w:val="0"/>
+              <w:keepLines w:val="0"/>
+              <w:pageBreakBefore w:val="0"/>
+              <w:widowControl w:val="0"/>
+              <w:pBdr>
+                <w:top w:space="0" w:sz="0" w:val="nil"/>
+                <w:left w:space="0" w:sz="0" w:val="nil"/>
+                <w:bottom w:space="0" w:sz="0" w:val="nil"/>
+                <w:right w:space="0" w:sz="0" w:val="nil"/>
+                <w:between w:space="0" w:sz="0" w:val="nil"/>
+              </w:pBdr>
+              <w:shd w:fill="auto" w:val="clear"/>
+              <w:spacing w:after="0" w:before="0" w:line="240" w:lineRule="auto"/>
+              <w:ind w:left="0" w:right="0" w:firstLine="0"/>
+              <w:jc w:val="left"/>
+              <w:rPr/>
+            </w:pPr>
+            <w:r>
+              <w:rPr>
+                <w:rtl w:val="0"/>
+              </w:rPr>
+            </w:r>
+          </w:p>
+        </w:tc>
+        <w:tc>
+          <w:tcPr>
+            <w:shd w:fill="auto" w:val="clear"/>
+            <w:tcMar>
+              <w:top w:w="100.0" w:type="dxa"/>
+              <w:left w:w="100.0" w:type="dxa"/>
+              <w:bottom w:w="100.0" w:type="dxa"/>
+              <w:right w:w="100.0" w:type="dxa"/>
+            </w:tcMar>
+            <w:vAlign w:val="top"/>
+          </w:tcPr>
+          <w:p>
+            <w:pPr>
+              <w:keepNext w:val="0"/>
+              <w:keepLines w:val="0"/>
+              <w:pageBreakBefore w:val="0"/>
+              <w:widowControl w:val="0"/>
+              <w:pBdr>
+                <w:top w:space="0" w:sz="0" w:val="nil"/>
+                <w:left w:space="0" w:sz="0" w:val="nil"/>
+                <w:bottom w:space="0" w:sz="0" w:val="nil"/>
+                <w:right w:space="0" w:sz="0" w:val="nil"/>
+                <w:between w:space="0" w:sz="0" w:val="nil"/>
+              </w:pBdr>
+              <w:shd w:fill="auto" w:val="clear"/>
+              <w:spacing w:after="0" w:before="0" w:line="240" w:lineRule="auto"/>
+              <w:ind w:left="0" w:right="0" w:firstLine="0"/>
+              <w:jc w:val="left"/>
+              <w:rPr/>
+            </w:pPr>
+            <w:r>
+              <w:rPr>
+                <w:rtl w:val="0"/>
+              </w:rPr>
+            </w:r>
+          </w:p>
+        </w:tc>
+      </w:tr>
+      <w:tr>
+        <w:trPr>
+          <w:cantSplit w:val="0"/>
+          <w:tblHeader w:val="0"/>
+        </w:trPr>
+        <w:tc>
+          <w:tcPr>
+            <w:shd w:fill="auto" w:val="clear"/>
+            <w:tcMar>
+              <w:top w:w="100.0" w:type="dxa"/>
+              <w:left w:w="100.0" w:type="dxa"/>
+              <w:bottom w:w="100.0" w:type="dxa"/>
+              <w:right w:w="100.0" w:type="dxa"/>
+            </w:tcMar>
+            <w:vAlign w:val="top"/>
+          </w:tcPr>
+          <w:p>
+            <w:pPr>
+              <w:keepNext w:val="0"/>
+              <w:keepLines w:val="0"/>
+              <w:pageBreakBefore w:val="0"/>
+              <w:widowControl w:val="0"/>
+              <w:pBdr>
+                <w:top w:space="0" w:sz="0" w:val="nil"/>
+                <w:left w:space="0" w:sz="0" w:val="nil"/>
+                <w:bottom w:space="0" w:sz="0" w:val="nil"/>
+                <w:right w:space="0" w:sz="0" w:val="nil"/>
+                <w:between w:space="0" w:sz="0" w:val="nil"/>
+              </w:pBdr>
+              <w:shd w:fill="auto" w:val="clear"/>
+              <w:spacing w:after="0" w:before="0" w:line="240" w:lineRule="auto"/>
+              <w:ind w:left="0" w:right="0" w:firstLine="0"/>
+              <w:jc w:val="left"/>
+              <w:rPr/>
+            </w:pPr>
+            <w:r>
+              <w:rPr>
+                <w:rtl w:val="0"/>
+              </w:rPr>
+            </w:r>
+          </w:p>
+        </w:tc>
+        <w:tc>
+          <w:tcPr>
+            <w:shd w:fill="auto" w:val="clear"/>
+            <w:tcMar>
+              <w:top w:w="100.0" w:type="dxa"/>
+              <w:left w:w="100.0" w:type="dxa"/>
+              <w:bottom w:w="100.0" w:type="dxa"/>
+              <w:right w:w="100.0" w:type="dxa"/>
+            </w:tcMar>
+            <w:vAlign w:val="top"/>
+          </w:tcPr>
+          <w:p>
+            <w:pPr>
+              <w:keepNext w:val="0"/>
+              <w:keepLines w:val="0"/>
+              <w:pageBreakBefore w:val="0"/>
+              <w:widowControl w:val="0"/>
+              <w:pBdr>
+                <w:top w:space="0" w:sz="0" w:val="nil"/>
+                <w:left w:space="0" w:sz="0" w:val="nil"/>
+                <w:bottom w:space="0" w:sz="0" w:val="nil"/>
+                <w:right w:space="0" w:sz="0" w:val="nil"/>
+                <w:between w:space="0" w:sz="0" w:val="nil"/>
+              </w:pBdr>
+              <w:shd w:fill="auto" w:val="clear"/>
+              <w:spacing w:after="0" w:before="0" w:line="240" w:lineRule="auto"/>
+              <w:ind w:left="0" w:right="0" w:firstLine="0"/>
+              <w:jc w:val="left"/>
+              <w:rPr/>
+            </w:pPr>
+            <w:r>
+              <w:rPr>
+                <w:rtl w:val="0"/>
+              </w:rPr>
+            </w:r>
+          </w:p>
+        </w:tc>
+        <w:tc>
+          <w:tcPr>
+            <w:shd w:fill="auto" w:val="clear"/>
+            <w:tcMar>
+              <w:top w:w="100.0" w:type="dxa"/>
+              <w:left w:w="100.0" w:type="dxa"/>
+              <w:bottom w:w="100.0" w:type="dxa"/>
+              <w:right w:w="100.0" w:type="dxa"/>
+            </w:tcMar>
+            <w:vAlign w:val="top"/>
+          </w:tcPr>
+          <w:p>
+            <w:pPr>
+              <w:keepNext w:val="0"/>
+              <w:keepLines w:val="0"/>
+              <w:pageBreakBefore w:val="0"/>
+              <w:widowControl w:val="0"/>
+              <w:pBdr>
+                <w:top w:space="0" w:sz="0" w:val="nil"/>
+                <w:left w:space="0" w:sz="0" w:val="nil"/>
+                <w:bottom w:space="0" w:sz="0" w:val="nil"/>
+                <w:right w:space="0" w:sz="0" w:val="nil"/>
+                <w:between w:space="0" w:sz="0" w:val="nil"/>
+              </w:pBdr>
+              <w:shd w:fill="auto" w:val="clear"/>
+              <w:spacing w:after="0" w:before="0" w:line="240" w:lineRule="auto"/>
+              <w:ind w:left="0" w:right="0" w:firstLine="0"/>
+              <w:jc w:val="left"/>
+              <w:rPr/>
+            </w:pPr>
+            <w:r>
+              <w:rPr>
+                <w:rtl w:val="0"/>
+              </w:rPr>
+            </w:r>
+          </w:p>
+        </w:tc>
+        <w:tc>
+          <w:tcPr>
+            <w:shd w:fill="auto" w:val="clear"/>
+            <w:tcMar>
+              <w:top w:w="100.0" w:type="dxa"/>
+              <w:left w:w="100.0" w:type="dxa"/>
+              <w:bottom w:w="100.0" w:type="dxa"/>
+              <w:right w:w="100.0" w:type="dxa"/>
+            </w:tcMar>
+            <w:vAlign w:val="top"/>
+          </w:tcPr>
+          <w:p>
+            <w:pPr>
+              <w:keepNext w:val="0"/>
+              <w:keepLines w:val="0"/>
+              <w:pageBreakBefore w:val="0"/>
+              <w:widowControl w:val="0"/>
+              <w:pBdr>
+                <w:top w:space="0" w:sz="0" w:val="nil"/>
+                <w:left w:space="0" w:sz="0" w:val="nil"/>
+                <w:bottom w:space="0" w:sz="0" w:val="nil"/>
+                <w:right w:space="0" w:sz="0" w:val="nil"/>
+                <w:between w:space="0" w:sz="0" w:val="nil"/>
+              </w:pBdr>
+              <w:shd w:fill="auto" w:val="clear"/>
+              <w:spacing w:after="0" w:before="0" w:line="240" w:lineRule="auto"/>
+              <w:ind w:left="0" w:right="0" w:firstLine="0"/>
+              <w:jc w:val="left"/>
+              <w:rPr/>
+            </w:pPr>
+            <w:r>
+              <w:rPr>
+                <w:rtl w:val="0"/>
+              </w:rPr>
+            </w:r>
+          </w:p>
+        </w:tc>
+        <w:tc>
+          <w:tcPr>
+            <w:shd w:fill="auto" w:val="clear"/>
+            <w:tcMar>
+              <w:top w:w="100.0" w:type="dxa"/>
+              <w:left w:w="100.0" w:type="dxa"/>
+              <w:bottom w:w="100.0" w:type="dxa"/>
+              <w:right w:w="100.0" w:type="dxa"/>
+            </w:tcMar>
+            <w:vAlign w:val="top"/>
+          </w:tcPr>
+          <w:p>
+            <w:pPr>
+              <w:keepNext w:val="0"/>
+              <w:keepLines w:val="0"/>
+              <w:pageBreakBefore w:val="0"/>
+              <w:widowControl w:val="0"/>
+              <w:pBdr>
+                <w:top w:space="0" w:sz="0" w:val="nil"/>
+                <w:left w:space="0" w:sz="0" w:val="nil"/>
+                <w:bottom w:space="0" w:sz="0" w:val="nil"/>
+                <w:right w:space="0" w:sz="0" w:val="nil"/>
+                <w:between w:space="0" w:sz="0" w:val="nil"/>
+              </w:pBdr>
+              <w:shd w:fill="auto" w:val="clear"/>
+              <w:spacing w:after="0" w:before="0" w:line="240" w:lineRule="auto"/>
+              <w:ind w:left="0" w:right="0" w:firstLine="0"/>
+              <w:jc w:val="left"/>
+              <w:rPr/>
+            </w:pPr>
+            <w:r>
+              <w:rPr>
+                <w:rtl w:val="0"/>
+              </w:rPr>
+            </w:r>
+          </w:p>
+        </w:tc>
+        <w:tc>
+          <w:tcPr>
+            <w:shd w:fill="auto" w:val="clear"/>
+            <w:tcMar>
+              <w:top w:w="100.0" w:type="dxa"/>
+              <w:left w:w="100.0" w:type="dxa"/>
+              <w:bottom w:w="100.0" w:type="dxa"/>
+              <w:right w:w="100.0" w:type="dxa"/>
+            </w:tcMar>
+            <w:vAlign w:val="top"/>
+          </w:tcPr>
+          <w:p>
+            <w:pPr>
+              <w:keepNext w:val="0"/>
+              <w:keepLines w:val="0"/>
+              <w:pageBreakBefore w:val="0"/>
+              <w:widowControl w:val="0"/>
+              <w:pBdr>
+                <w:top w:space="0" w:sz="0" w:val="nil"/>
+                <w:left w:space="0" w:sz="0" w:val="nil"/>
+                <w:bottom w:space="0" w:sz="0" w:val="nil"/>
+                <w:right w:space="0" w:sz="0" w:val="nil"/>
+                <w:between w:space="0" w:sz="0" w:val="nil"/>
+              </w:pBdr>
+              <w:shd w:fill="auto" w:val="clear"/>
+              <w:spacing w:after="0" w:before="0" w:line="240" w:lineRule="auto"/>
+              <w:ind w:left="0" w:right="0" w:firstLine="0"/>
+              <w:jc w:val="left"/>
+              <w:rPr/>
+            </w:pPr>
+            <w:r>
+              <w:rPr>
+                <w:rtl w:val="0"/>
+              </w:rPr>
+            </w:r>
+          </w:p>
+        </w:tc>
+      </w:tr>
+      <w:tr>
+        <w:trPr>
+          <w:cantSplit w:val="0"/>
+          <w:tblHeader w:val="0"/>
+        </w:trPr>
+        <w:tc>
+          <w:tcPr>
+            <w:shd w:fill="auto" w:val="clear"/>
+            <w:tcMar>
+              <w:top w:w="100.0" w:type="dxa"/>
+              <w:left w:w="100.0" w:type="dxa"/>
+              <w:bottom w:w="100.0" w:type="dxa"/>
+              <w:right w:w="100.0" w:type="dxa"/>
+            </w:tcMar>
+            <w:vAlign w:val="top"/>
+          </w:tcPr>
+          <w:p>
+            <w:pPr>
+              <w:keepNext w:val="0"/>
+              <w:keepLines w:val="0"/>
+              <w:pageBreakBefore w:val="0"/>
+              <w:widowControl w:val="0"/>
+              <w:pBdr>
+                <w:top w:space="0" w:sz="0" w:val="nil"/>
+                <w:left w:space="0" w:sz="0" w:val="nil"/>
+                <w:bottom w:space="0" w:sz="0" w:val="nil"/>
+                <w:right w:space="0" w:sz="0" w:val="nil"/>
+                <w:between w:space="0" w:sz="0" w:val="nil"/>
+              </w:pBdr>
+              <w:shd w:fill="auto" w:val="clear"/>
+              <w:spacing w:after="0" w:before="0" w:line="240" w:lineRule="auto"/>
+              <w:ind w:left="0" w:right="0" w:firstLine="0"/>
+              <w:jc w:val="left"/>
+              <w:rPr/>
+            </w:pPr>
+            <w:r>
+              <w:rPr>
+                <w:rtl w:val="0"/>
+              </w:rPr>
+            </w:r>
+          </w:p>
+        </w:tc>
+        <w:tc>
+          <w:tcPr>
+            <w:shd w:fill="auto" w:val="clear"/>
+            <w:tcMar>
+              <w:top w:w="100.0" w:type="dxa"/>
+              <w:left w:w="100.0" w:type="dxa"/>
+              <w:bottom w:w="100.0" w:type="dxa"/>
+              <w:right w:w="100.0" w:type="dxa"/>
+            </w:tcMar>
+            <w:vAlign w:val="top"/>
+          </w:tcPr>
+          <w:p>
+            <w:pPr>
+              <w:keepNext w:val="0"/>
+              <w:keepLines w:val="0"/>
+              <w:pageBreakBefore w:val="0"/>
+              <w:widowControl w:val="0"/>
+              <w:pBdr>
+                <w:top w:space="0" w:sz="0" w:val="nil"/>
+                <w:left w:space="0" w:sz="0" w:val="nil"/>
+                <w:bottom w:space="0" w:sz="0" w:val="nil"/>
+                <w:right w:space="0" w:sz="0" w:val="nil"/>
+                <w:between w:space="0" w:sz="0" w:val="nil"/>
+              </w:pBdr>
+              <w:shd w:fill="auto" w:val="clear"/>
+              <w:spacing w:after="0" w:before="0" w:line="240" w:lineRule="auto"/>
+              <w:ind w:left="0" w:right="0" w:firstLine="0"/>
+              <w:jc w:val="left"/>
+              <w:rPr/>
+            </w:pPr>
+            <w:r>
+              <w:rPr>
+                <w:rtl w:val="0"/>
+              </w:rPr>
+            </w:r>
+          </w:p>
+        </w:tc>
+        <w:tc>
+          <w:tcPr>
+            <w:shd w:fill="auto" w:val="clear"/>
+            <w:tcMar>
+              <w:top w:w="100.0" w:type="dxa"/>
+              <w:left w:w="100.0" w:type="dxa"/>
+              <w:bottom w:w="100.0" w:type="dxa"/>
+              <w:right w:w="100.0" w:type="dxa"/>
+            </w:tcMar>
+            <w:vAlign w:val="top"/>
+          </w:tcPr>
+          <w:p>
+            <w:pPr>
+              <w:keepNext w:val="0"/>
+              <w:keepLines w:val="0"/>
+              <w:pageBreakBefore w:val="0"/>
+              <w:widowControl w:val="0"/>
+              <w:pBdr>
+                <w:top w:space="0" w:sz="0" w:val="nil"/>
+                <w:left w:space="0" w:sz="0" w:val="nil"/>
+                <w:bottom w:space="0" w:sz="0" w:val="nil"/>
+                <w:right w:space="0" w:sz="0" w:val="nil"/>
+                <w:between w:space="0" w:sz="0" w:val="nil"/>
+              </w:pBdr>
+              <w:shd w:fill="auto" w:val="clear"/>
+              <w:spacing w:after="0" w:before="0" w:line="240" w:lineRule="auto"/>
+              <w:ind w:left="0" w:right="0" w:firstLine="0"/>
+              <w:jc w:val="left"/>
+              <w:rPr/>
+            </w:pPr>
+            <w:r>
+              <w:rPr>
+                <w:rtl w:val="0"/>
+              </w:rPr>
+            </w:r>
+          </w:p>
+        </w:tc>
+        <w:tc>
+          <w:tcPr>
+            <w:shd w:fill="auto" w:val="clear"/>
+            <w:tcMar>
+              <w:top w:w="100.0" w:type="dxa"/>
+              <w:left w:w="100.0" w:type="dxa"/>
+              <w:bottom w:w="100.0" w:type="dxa"/>
+              <w:right w:w="100.0" w:type="dxa"/>
+            </w:tcMar>
+            <w:vAlign w:val="top"/>
+          </w:tcPr>
+          <w:p>
+            <w:pPr>
+              <w:keepNext w:val="0"/>
+              <w:keepLines w:val="0"/>
+              <w:pageBreakBefore w:val="0"/>
+              <w:widowControl w:val="0"/>
+              <w:pBdr>
+                <w:top w:space="0" w:sz="0" w:val="nil"/>
+                <w:left w:space="0" w:sz="0" w:val="nil"/>
+                <w:bottom w:space="0" w:sz="0" w:val="nil"/>
+                <w:right w:space="0" w:sz="0" w:val="nil"/>
+                <w:between w:space="0" w:sz="0" w:val="nil"/>
+              </w:pBdr>
+              <w:shd w:fill="auto" w:val="clear"/>
+              <w:spacing w:after="0" w:before="0" w:line="240" w:lineRule="auto"/>
+              <w:ind w:left="0" w:right="0" w:firstLine="0"/>
+              <w:jc w:val="left"/>
+              <w:rPr/>
+            </w:pPr>
+            <w:r>
+              <w:rPr>
+                <w:rtl w:val="0"/>
+              </w:rPr>
+            </w:r>
+          </w:p>
+        </w:tc>
+        <w:tc>
+          <w:tcPr>
+            <w:shd w:fill="auto" w:val="clear"/>
+            <w:tcMar>
+              <w:top w:w="100.0" w:type="dxa"/>
+              <w:left w:w="100.0" w:type="dxa"/>
+              <w:bottom w:w="100.0" w:type="dxa"/>
+              <w:right w:w="100.0" w:type="dxa"/>
+            </w:tcMar>
+            <w:vAlign w:val="top"/>
+          </w:tcPr>
+          <w:p>
+            <w:pPr>
+              <w:keepNext w:val="0"/>
+              <w:keepLines w:val="0"/>
+              <w:pageBreakBefore w:val="0"/>
+              <w:widowControl w:val="0"/>
+              <w:pBdr>
+                <w:top w:space="0" w:sz="0" w:val="nil"/>
+                <w:left w:space="0" w:sz="0" w:val="nil"/>
+                <w:bottom w:space="0" w:sz="0" w:val="nil"/>
+                <w:right w:space="0" w:sz="0" w:val="nil"/>
+                <w:between w:space="0" w:sz="0" w:val="nil"/>
+              </w:pBdr>
+              <w:shd w:fill="auto" w:val="clear"/>
+              <w:spacing w:after="0" w:before="0" w:line="240" w:lineRule="auto"/>
+              <w:ind w:left="0" w:right="0" w:firstLine="0"/>
+              <w:jc w:val="left"/>
+              <w:rPr/>
+            </w:pPr>
+            <w:r>
+              <w:rPr>
+                <w:rtl w:val="0"/>
+              </w:rPr>
+            </w:r>
+          </w:p>
+        </w:tc>
+        <w:tc>
+          <w:tcPr>
+            <w:shd w:fill="auto" w:val="clear"/>
+            <w:tcMar>
+              <w:top w:w="100.0" w:type="dxa"/>
+              <w:left w:w="100.0" w:type="dxa"/>
+              <w:bottom w:w="100.0" w:type="dxa"/>
+              <w:right w:w="100.0" w:type="dxa"/>
+            </w:tcMar>
+            <w:vAlign w:val="top"/>
+          </w:tcPr>
+          <w:p>
+            <w:pPr>
+              <w:keepNext w:val="0"/>
+              <w:keepLines w:val="0"/>
+              <w:pageBreakBefore w:val="0"/>
+              <w:widowControl w:val="0"/>
+              <w:pBdr>
+                <w:top w:space="0" w:sz="0" w:val="nil"/>
+                <w:left w:space="0" w:sz="0" w:val="nil"/>
+                <w:bottom w:space="0" w:sz="0" w:val="nil"/>
+                <w:right w:space="0" w:sz="0" w:val="nil"/>
+                <w:between w:space="0" w:sz="0" w:val="nil"/>
+              </w:pBdr>
+              <w:shd w:fill="auto" w:val="clear"/>
+              <w:spacing w:after="0" w:before="0" w:line="240" w:lineRule="auto"/>
+              <w:ind w:left="0" w:right="0" w:firstLine="0"/>
+              <w:jc w:val="left"/>
+              <w:rPr/>
+            </w:pPr>
+            <w:r>
+              <w:rPr>
+                <w:rtl w:val="0"/>
+              </w:rPr>
+            </w:r>
+          </w:p>
+        </w:tc>
+      </w:tr>
+      <w:tr>
+        <w:trPr>
+          <w:cantSplit w:val="0"/>
+          <w:tblHeader w:val="0"/>
+        </w:trPr>
+        <w:tc>
+          <w:tcPr>
+            <w:shd w:fill="auto" w:val="clear"/>
+            <w:tcMar>
+              <w:top w:w="100.0" w:type="dxa"/>
+              <w:left w:w="100.0" w:type="dxa"/>
+              <w:bottom w:w="100.0" w:type="dxa"/>
+              <w:right w:w="100.0" w:type="dxa"/>
+            </w:tcMar>
+            <w:vAlign w:val="top"/>
+          </w:tcPr>
+          <w:p>
+            <w:pPr>
+              <w:keepNext w:val="0"/>
+              <w:keepLines w:val="0"/>
+              <w:pageBreakBefore w:val="0"/>
+              <w:widowControl w:val="0"/>
+              <w:pBdr>
+                <w:top w:space="0" w:sz="0" w:val="nil"/>
+                <w:left w:space="0" w:sz="0" w:val="nil"/>
+                <w:bottom w:space="0" w:sz="0" w:val="nil"/>
+                <w:right w:space="0" w:sz="0" w:val="nil"/>
+                <w:between w:space="0" w:sz="0" w:val="nil"/>
+              </w:pBdr>
+              <w:shd w:fill="auto" w:val="clear"/>
+              <w:spacing w:after="0" w:before="0" w:line="240" w:lineRule="auto"/>
+              <w:ind w:left="0" w:right="0" w:firstLine="0"/>
+              <w:jc w:val="left"/>
+              <w:rPr/>
+            </w:pPr>
+            <w:r>
+              <w:rPr>
+                <w:rtl w:val="0"/>
+              </w:rPr>
+            </w:r>
+          </w:p>
+        </w:tc>
+        <w:tc>
+          <w:tcPr>
+            <w:shd w:fill="auto" w:val="clear"/>
+            <w:tcMar>
+              <w:top w:w="100.0" w:type="dxa"/>
+              <w:left w:w="100.0" w:type="dxa"/>
+              <w:bottom w:w="100.0" w:type="dxa"/>
+              <w:right w:w="100.0" w:type="dxa"/>
+            </w:tcMar>
+            <w:vAlign w:val="top"/>
+          </w:tcPr>
+          <w:p>
+            <w:pPr>
+              <w:keepNext w:val="0"/>
+              <w:keepLines w:val="0"/>
+              <w:pageBreakBefore w:val="0"/>
+              <w:widowControl w:val="0"/>
+              <w:pBdr>
+                <w:top w:space="0" w:sz="0" w:val="nil"/>
+                <w:left w:space="0" w:sz="0" w:val="nil"/>
+                <w:bottom w:space="0" w:sz="0" w:val="nil"/>
+                <w:right w:space="0" w:sz="0" w:val="nil"/>
+                <w:between w:space="0" w:sz="0" w:val="nil"/>
+              </w:pBdr>
+              <w:shd w:fill="auto" w:val="clear"/>
+              <w:spacing w:after="0" w:before="0" w:line="240" w:lineRule="auto"/>
+              <w:ind w:left="0" w:right="0" w:firstLine="0"/>
+              <w:jc w:val="left"/>
+              <w:rPr/>
+            </w:pPr>
+            <w:r>
+              <w:rPr>
+                <w:rtl w:val="0"/>
+              </w:rPr>
+            </w:r>
+          </w:p>
+        </w:tc>
+        <w:tc>
+          <w:tcPr>
+            <w:shd w:fill="auto" w:val="clear"/>
+            <w:tcMar>
+              <w:top w:w="100.0" w:type="dxa"/>
+              <w:left w:w="100.0" w:type="dxa"/>
+              <w:bottom w:w="100.0" w:type="dxa"/>
+              <w:right w:w="100.0" w:type="dxa"/>
+            </w:tcMar>
+            <w:vAlign w:val="top"/>
+          </w:tcPr>
+          <w:p>
+            <w:pPr>
+              <w:keepNext w:val="0"/>
+              <w:keepLines w:val="0"/>
+              <w:pageBreakBefore w:val="0"/>
+              <w:widowControl w:val="0"/>
+              <w:pBdr>
+                <w:top w:space="0" w:sz="0" w:val="nil"/>
+                <w:left w:space="0" w:sz="0" w:val="nil"/>
+                <w:bottom w:space="0" w:sz="0" w:val="nil"/>
+                <w:right w:space="0" w:sz="0" w:val="nil"/>
+                <w:between w:space="0" w:sz="0" w:val="nil"/>
+              </w:pBdr>
+              <w:shd w:fill="auto" w:val="clear"/>
+              <w:spacing w:after="0" w:before="0" w:line="240" w:lineRule="auto"/>
+              <w:ind w:left="0" w:right="0" w:firstLine="0"/>
+              <w:jc w:val="left"/>
+              <w:rPr/>
+            </w:pPr>
+            <w:r>
+              <w:rPr>
+                <w:rtl w:val="0"/>
+              </w:rPr>
+            </w:r>
+          </w:p>
+        </w:tc>
+        <w:tc>
+          <w:tcPr>
+            <w:shd w:fill="auto" w:val="clear"/>
+            <w:tcMar>
+              <w:top w:w="100.0" w:type="dxa"/>
+              <w:left w:w="100.0" w:type="dxa"/>
+              <w:bottom w:w="100.0" w:type="dxa"/>
+              <w:right w:w="100.0" w:type="dxa"/>
+            </w:tcMar>
+            <w:vAlign w:val="top"/>
+          </w:tcPr>
+          <w:p>
+            <w:pPr>
+              <w:keepNext w:val="0"/>
+              <w:keepLines w:val="0"/>
+              <w:pageBreakBefore w:val="0"/>
+              <w:widowControl w:val="0"/>
+              <w:pBdr>
+                <w:top w:space="0" w:sz="0" w:val="nil"/>
+                <w:left w:space="0" w:sz="0" w:val="nil"/>
+                <w:bottom w:space="0" w:sz="0" w:val="nil"/>
+                <w:right w:space="0" w:sz="0" w:val="nil"/>
+                <w:between w:space="0" w:sz="0" w:val="nil"/>
+              </w:pBdr>
+              <w:shd w:fill="auto" w:val="clear"/>
+              <w:spacing w:after="0" w:before="0" w:line="240" w:lineRule="auto"/>
+              <w:ind w:left="0" w:right="0" w:firstLine="0"/>
+              <w:jc w:val="left"/>
+              <w:rPr/>
+            </w:pPr>
+            <w:r>
+              <w:rPr>
+                <w:rtl w:val="0"/>
+              </w:rPr>
+            </w:r>
+          </w:p>
+        </w:tc>
+        <w:tc>
+          <w:tcPr>
+            <w:shd w:fill="auto" w:val="clear"/>
+            <w:tcMar>
+              <w:top w:w="100.0" w:type="dxa"/>
+              <w:left w:w="100.0" w:type="dxa"/>
+              <w:bottom w:w="100.0" w:type="dxa"/>
+              <w:right w:w="100.0" w:type="dxa"/>
+            </w:tcMar>
+            <w:vAlign w:val="top"/>
+          </w:tcPr>
+          <w:p>
+            <w:pPr>
+              <w:keepNext w:val="0"/>
+              <w:keepLines w:val="0"/>
+              <w:pageBreakBefore w:val="0"/>
+              <w:widowControl w:val="0"/>
+              <w:pBdr>
+                <w:top w:space="0" w:sz="0" w:val="nil"/>
+                <w:left w:space="0" w:sz="0" w:val="nil"/>
+                <w:bottom w:space="0" w:sz="0" w:val="nil"/>
+                <w:right w:space="0" w:sz="0" w:val="nil"/>
+                <w:between w:space="0" w:sz="0" w:val="nil"/>
+              </w:pBdr>
+              <w:shd w:fill="auto" w:val="clear"/>
+              <w:spacing w:after="0" w:before="0" w:line="240" w:lineRule="auto"/>
+              <w:ind w:left="0" w:right="0" w:firstLine="0"/>
+              <w:jc w:val="left"/>
+              <w:rPr/>
+            </w:pPr>
+            <w:r>
+              <w:rPr>
+                <w:rtl w:val="0"/>
+              </w:rPr>
+            </w:r>
+          </w:p>
+        </w:tc>
+        <w:tc>
+          <w:tcPr>
+            <w:shd w:fill="auto" w:val="clear"/>
+            <w:tcMar>
+              <w:top w:w="100.0" w:type="dxa"/>
+              <w:left w:w="100.0" w:type="dxa"/>
+              <w:bottom w:w="100.0" w:type="dxa"/>
+              <w:right w:w="100.0" w:type="dxa"/>
+            </w:tcMar>
+            <w:vAlign w:val="top"/>
+          </w:tcPr>
+          <w:p>
+            <w:pPr>
+              <w:keepNext w:val="0"/>
+              <w:keepLines w:val="0"/>
+              <w:pageBreakBefore w:val="0"/>
+              <w:widowControl w:val="0"/>
+              <w:pBdr>
+                <w:top w:space="0" w:sz="0" w:val="nil"/>
+                <w:left w:space="0" w:sz="0" w:val="nil"/>
+                <w:bottom w:space="0" w:sz="0" w:val="nil"/>
+                <w:right w:space="0" w:sz="0" w:val="nil"/>
+                <w:between w:space="0" w:sz="0" w:val="nil"/>
+              </w:pBdr>
+              <w:shd w:fill="auto" w:val="clear"/>
+              <w:spacing w:after="0" w:before="0" w:line="240" w:lineRule="auto"/>
+              <w:ind w:left="0" w:right="0" w:firstLine="0"/>
+              <w:jc w:val="left"/>
+              <w:rPr/>
+            </w:pPr>
+            <w:r>
+              <w:rPr>
+                <w:rtl w:val="0"/>
+              </w:rPr>
+            </w:r>
+          </w:p>
+        </w:tc>
+      </w:tr>
+      <w:tr>
+        <w:trPr>
+          <w:cantSplit w:val="0"/>
+          <w:tblHeader w:val="0"/>
+        </w:trPr>
+        <w:tc>
+          <w:tcPr>
+            <w:shd w:fill="auto" w:val="clear"/>
+            <w:tcMar>
+              <w:top w:w="100.0" w:type="dxa"/>
+              <w:left w:w="100.0" w:type="dxa"/>
+              <w:bottom w:w="100.0" w:type="dxa"/>
+              <w:right w:w="100.0" w:type="dxa"/>
+            </w:tcMar>
+            <w:vAlign w:val="top"/>
+          </w:tcPr>
+          <w:p>
+            <w:pPr>
+              <w:keepNext w:val="0"/>
+              <w:keepLines w:val="0"/>
+              <w:pageBreakBefore w:val="0"/>
+              <w:widowControl w:val="0"/>
+              <w:pBdr>
+                <w:top w:space="0" w:sz="0" w:val="nil"/>
+                <w:left w:space="0" w:sz="0" w:val="nil"/>
+                <w:bottom w:space="0" w:sz="0" w:val="nil"/>
+                <w:right w:space="0" w:sz="0" w:val="nil"/>
+                <w:between w:space="0" w:sz="0" w:val="nil"/>
+              </w:pBdr>
+              <w:shd w:fill="auto" w:val="clear"/>
+              <w:spacing w:after="0" w:before="0" w:line="240" w:lineRule="auto"/>
+              <w:ind w:left="0" w:right="0" w:firstLine="0"/>
+              <w:jc w:val="left"/>
+              <w:rPr/>
+            </w:pPr>
+            <w:r>
+              <w:rPr>
+                <w:rtl w:val="0"/>
+              </w:rPr>
+            </w:r>
+          </w:p>
+        </w:tc>
+        <w:tc>
+          <w:tcPr>
+            <w:shd w:fill="auto" w:val="clear"/>
+            <w:tcMar>
+              <w:top w:w="100.0" w:type="dxa"/>
+              <w:left w:w="100.0" w:type="dxa"/>
+              <w:bottom w:w="100.0" w:type="dxa"/>
+              <w:right w:w="100.0" w:type="dxa"/>
+            </w:tcMar>
+            <w:vAlign w:val="top"/>
+          </w:tcPr>
+          <w:p>
+            <w:pPr>
+              <w:keepNext w:val="0"/>
+              <w:keepLines w:val="0"/>
+              <w:pageBreakBefore w:val="0"/>
+              <w:widowControl w:val="0"/>
+              <w:pBdr>
+                <w:top w:space="0" w:sz="0" w:val="nil"/>
+                <w:left w:space="0" w:sz="0" w:val="nil"/>
+                <w:bottom w:space="0" w:sz="0" w:val="nil"/>
+                <w:right w:space="0" w:sz="0" w:val="nil"/>
+                <w:between w:space="0" w:sz="0" w:val="nil"/>
+              </w:pBdr>
+              <w:shd w:fill="auto" w:val="clear"/>
+              <w:spacing w:after="0" w:before="0" w:line="240" w:lineRule="auto"/>
+              <w:ind w:left="0" w:right="0" w:firstLine="0"/>
+              <w:jc w:val="left"/>
+              <w:rPr/>
+            </w:pPr>
+            <w:r>
+              <w:rPr>
+                <w:rtl w:val="0"/>
+              </w:rPr>
+            </w:r>
+          </w:p>
+        </w:tc>
+        <w:tc>
+          <w:tcPr>
+            <w:shd w:fill="auto" w:val="clear"/>
+            <w:tcMar>
+              <w:top w:w="100.0" w:type="dxa"/>
+              <w:left w:w="100.0" w:type="dxa"/>
+              <w:bottom w:w="100.0" w:type="dxa"/>
+              <w:right w:w="100.0" w:type="dxa"/>
+            </w:tcMar>
+            <w:vAlign w:val="top"/>
+          </w:tcPr>
+          <w:p>
+            <w:pPr>
+              <w:keepNext w:val="0"/>
+              <w:keepLines w:val="0"/>
+              <w:pageBreakBefore w:val="0"/>
+              <w:widowControl w:val="0"/>
+              <w:pBdr>
+                <w:top w:space="0" w:sz="0" w:val="nil"/>
+                <w:left w:space="0" w:sz="0" w:val="nil"/>
+                <w:bottom w:space="0" w:sz="0" w:val="nil"/>
+                <w:right w:space="0" w:sz="0" w:val="nil"/>
+                <w:between w:space="0" w:sz="0" w:val="nil"/>
+              </w:pBdr>
+              <w:shd w:fill="auto" w:val="clear"/>
+              <w:spacing w:after="0" w:before="0" w:line="240" w:lineRule="auto"/>
+              <w:ind w:left="0" w:right="0" w:firstLine="0"/>
+              <w:jc w:val="left"/>
+              <w:rPr/>
+            </w:pPr>
+            <w:r>
+              <w:rPr>
+                <w:rtl w:val="0"/>
+              </w:rPr>
+            </w:r>
+          </w:p>
+        </w:tc>
+        <w:tc>
+          <w:tcPr>
+            <w:shd w:fill="auto" w:val="clear"/>
+            <w:tcMar>
+              <w:top w:w="100.0" w:type="dxa"/>
+              <w:left w:w="100.0" w:type="dxa"/>
+              <w:bottom w:w="100.0" w:type="dxa"/>
+              <w:right w:w="100.0" w:type="dxa"/>
+            </w:tcMar>
+            <w:vAlign w:val="top"/>
+          </w:tcPr>
+          <w:p>
+            <w:pPr>
+              <w:keepNext w:val="0"/>
+              <w:keepLines w:val="0"/>
+              <w:pageBreakBefore w:val="0"/>
+              <w:widowControl w:val="0"/>
+              <w:pBdr>
+                <w:top w:space="0" w:sz="0" w:val="nil"/>
+                <w:left w:space="0" w:sz="0" w:val="nil"/>
+                <w:bottom w:space="0" w:sz="0" w:val="nil"/>
+                <w:right w:space="0" w:sz="0" w:val="nil"/>
+                <w:between w:space="0" w:sz="0" w:val="nil"/>
+              </w:pBdr>
+              <w:shd w:fill="auto" w:val="clear"/>
+              <w:spacing w:after="0" w:before="0" w:line="240" w:lineRule="auto"/>
+              <w:ind w:left="0" w:right="0" w:firstLine="0"/>
+              <w:jc w:val="left"/>
+              <w:rPr/>
+            </w:pPr>
+            <w:r>
+              <w:rPr>
+                <w:rtl w:val="0"/>
+              </w:rPr>
+            </w:r>
+          </w:p>
+        </w:tc>
+        <w:tc>
+          <w:tcPr>
+            <w:shd w:fill="auto" w:val="clear"/>
+            <w:tcMar>
+              <w:top w:w="100.0" w:type="dxa"/>
+              <w:left w:w="100.0" w:type="dxa"/>
+              <w:bottom w:w="100.0" w:type="dxa"/>
+              <w:right w:w="100.0" w:type="dxa"/>
+            </w:tcMar>
+            <w:vAlign w:val="top"/>
+          </w:tcPr>
+          <w:p>
+            <w:pPr>
+              <w:keepNext w:val="0"/>
+              <w:keepLines w:val="0"/>
+              <w:pageBreakBefore w:val="0"/>
+              <w:widowControl w:val="0"/>
+              <w:pBdr>
+                <w:top w:space="0" w:sz="0" w:val="nil"/>
+                <w:left w:space="0" w:sz="0" w:val="nil"/>
+                <w:bottom w:space="0" w:sz="0" w:val="nil"/>
+                <w:right w:space="0" w:sz="0" w:val="nil"/>
+                <w:between w:space="0" w:sz="0" w:val="nil"/>
+              </w:pBdr>
+              <w:shd w:fill="auto" w:val="clear"/>
+              <w:spacing w:after="0" w:before="0" w:line="240" w:lineRule="auto"/>
+              <w:ind w:left="0" w:right="0" w:firstLine="0"/>
+              <w:jc w:val="left"/>
+              <w:rPr/>
+            </w:pPr>
+            <w:r>
+              <w:rPr>
+                <w:rtl w:val="0"/>
+              </w:rPr>
+            </w:r>
+          </w:p>
+        </w:tc>
+        <w:tc>
+          <w:tcPr>
+            <w:shd w:fill="auto" w:val="clear"/>
+            <w:tcMar>
+              <w:top w:w="100.0" w:type="dxa"/>
+              <w:left w:w="100.0" w:type="dxa"/>
+              <w:bottom w:w="100.0" w:type="dxa"/>
+              <w:right w:w="100.0" w:type="dxa"/>
+            </w:tcMar>
+            <w:vAlign w:val="top"/>
+          </w:tcPr>
+          <w:p>
+            <w:pPr>
+              <w:keepNext w:val="0"/>
+              <w:keepLines w:val="0"/>
+              <w:pageBreakBefore w:val="0"/>
+              <w:widowControl w:val="0"/>
+              <w:pBdr>
+                <w:top w:space="0" w:sz="0" w:val="nil"/>
+                <w:left w:space="0" w:sz="0" w:val="nil"/>
+                <w:bottom w:space="0" w:sz="0" w:val="nil"/>
+                <w:right w:space="0" w:sz="0" w:val="nil"/>
+                <w:between w:space="0" w:sz="0" w:val="nil"/>
+              </w:pBdr>
+              <w:shd w:fill="auto" w:val="clear"/>
+              <w:spacing w:after="0" w:before="0" w:line="240" w:lineRule="auto"/>
+              <w:ind w:left="0" w:right="0" w:firstLine="0"/>
+              <w:jc w:val="left"/>
+              <w:rPr/>
+            </w:pPr>
+            <w:r>
+              <w:rPr>
+                <w:rtl w:val="0"/>
+              </w:rPr>
+            </w:r>
+          </w:p>
+        </w:tc>
+      </w:tr>
+      <w:tr>
+        <w:trPr>
+          <w:cantSplit w:val="0"/>
+          <w:tblHeader w:val="0"/>
+        </w:trPr>
+        <w:tc>
+          <w:tcPr>
+            <w:shd w:fill="auto" w:val="clear"/>
+            <w:tcMar>
+              <w:top w:w="100.0" w:type="dxa"/>
+              <w:left w:w="100.0" w:type="dxa"/>
+              <w:bottom w:w="100.0" w:type="dxa"/>
+              <w:right w:w="100.0" w:type="dxa"/>
+            </w:tcMar>
+            <w:vAlign w:val="top"/>
+          </w:tcPr>
+          <w:p>
+            <w:pPr>
+              <w:keepNext w:val="0"/>
+              <w:keepLines w:val="0"/>
+              <w:pageBreakBefore w:val="0"/>
+              <w:widowControl w:val="0"/>
+              <w:pBdr>
+                <w:top w:space="0" w:sz="0" w:val="nil"/>
+                <w:left w:space="0" w:sz="0" w:val="nil"/>
+                <w:bottom w:space="0" w:sz="0" w:val="nil"/>
+                <w:right w:space="0" w:sz="0" w:val="nil"/>
+                <w:between w:space="0" w:sz="0" w:val="nil"/>
+              </w:pBdr>
+              <w:shd w:fill="auto" w:val="clear"/>
+              <w:spacing w:after="0" w:before="0" w:line="240" w:lineRule="auto"/>
+              <w:ind w:left="0" w:right="0" w:firstLine="0"/>
+              <w:jc w:val="left"/>
+              <w:rPr/>
+            </w:pPr>
+            <w:r>
+              <w:rPr>
+                <w:rtl w:val="0"/>
+              </w:rPr>
+            </w:r>
+          </w:p>
+        </w:tc>
+        <w:tc>
+          <w:tcPr>
+            <w:shd w:fill="auto" w:val="clear"/>
+            <w:tcMar>
+              <w:top w:w="100.0" w:type="dxa"/>
+              <w:left w:w="100.0" w:type="dxa"/>
+              <w:bottom w:w="100.0" w:type="dxa"/>
+              <w:right w:w="100.0" w:type="dxa"/>
+            </w:tcMar>
+            <w:vAlign w:val="top"/>
+          </w:tcPr>
+          <w:p>
+            <w:pPr>
+              <w:keepNext w:val="0"/>
+              <w:keepLines w:val="0"/>
+              <w:pageBreakBefore w:val="0"/>
+              <w:widowControl w:val="0"/>
+              <w:pBdr>
+                <w:top w:space="0" w:sz="0" w:val="nil"/>
+                <w:left w:space="0" w:sz="0" w:val="nil"/>
+                <w:bottom w:space="0" w:sz="0" w:val="nil"/>
+                <w:right w:space="0" w:sz="0" w:val="nil"/>
+                <w:between w:space="0" w:sz="0" w:val="nil"/>
+              </w:pBdr>
+              <w:shd w:fill="auto" w:val="clear"/>
+              <w:spacing w:after="0" w:before="0" w:line="240" w:lineRule="auto"/>
+              <w:ind w:left="0" w:right="0" w:firstLine="0"/>
+              <w:jc w:val="left"/>
+              <w:rPr/>
+            </w:pPr>
+            <w:r>
+              <w:rPr>
+                <w:rtl w:val="0"/>
+              </w:rPr>
+            </w:r>
+          </w:p>
+        </w:tc>
+        <w:tc>
+          <w:tcPr>
+            <w:shd w:fill="auto" w:val="clear"/>
+            <w:tcMar>
+              <w:top w:w="100.0" w:type="dxa"/>
+              <w:left w:w="100.0" w:type="dxa"/>
+              <w:bottom w:w="100.0" w:type="dxa"/>
+              <w:right w:w="100.0" w:type="dxa"/>
+            </w:tcMar>
+            <w:vAlign w:val="top"/>
+          </w:tcPr>
+          <w:p>
+            <w:pPr>
+              <w:keepNext w:val="0"/>
+              <w:keepLines w:val="0"/>
+              <w:pageBreakBefore w:val="0"/>
+              <w:widowControl w:val="0"/>
+              <w:pBdr>
+                <w:top w:space="0" w:sz="0" w:val="nil"/>
+                <w:left w:space="0" w:sz="0" w:val="nil"/>
+                <w:bottom w:space="0" w:sz="0" w:val="nil"/>
+                <w:right w:space="0" w:sz="0" w:val="nil"/>
+                <w:between w:space="0" w:sz="0" w:val="nil"/>
+              </w:pBdr>
+              <w:shd w:fill="auto" w:val="clear"/>
+              <w:spacing w:after="0" w:before="0" w:line="240" w:lineRule="auto"/>
+              <w:ind w:left="0" w:right="0" w:firstLine="0"/>
+              <w:jc w:val="left"/>
+              <w:rPr/>
+            </w:pPr>
+            <w:r>
+              <w:rPr>
+                <w:rtl w:val="0"/>
+              </w:rPr>
+            </w:r>
+          </w:p>
+        </w:tc>
+        <w:tc>
+          <w:tcPr>
+            <w:shd w:fill="auto" w:val="clear"/>
+            <w:tcMar>
+              <w:top w:w="100.0" w:type="dxa"/>
+              <w:left w:w="100.0" w:type="dxa"/>
+              <w:bottom w:w="100.0" w:type="dxa"/>
+              <w:right w:w="100.0" w:type="dxa"/>
+            </w:tcMar>
+            <w:vAlign w:val="top"/>
+          </w:tcPr>
+          <w:p>
+            <w:pPr>
+              <w:keepNext w:val="0"/>
+              <w:keepLines w:val="0"/>
+              <w:pageBreakBefore w:val="0"/>
+              <w:widowControl w:val="0"/>
+              <w:pBdr>
+                <w:top w:space="0" w:sz="0" w:val="nil"/>
+                <w:left w:space="0" w:sz="0" w:val="nil"/>
+                <w:bottom w:space="0" w:sz="0" w:val="nil"/>
+                <w:right w:space="0" w:sz="0" w:val="nil"/>
+                <w:between w:space="0" w:sz="0" w:val="nil"/>
+              </w:pBdr>
+              <w:shd w:fill="auto" w:val="clear"/>
+              <w:spacing w:after="0" w:before="0" w:line="240" w:lineRule="auto"/>
+              <w:ind w:left="0" w:right="0" w:firstLine="0"/>
+              <w:jc w:val="left"/>
+              <w:rPr/>
+            </w:pPr>
+            <w:r>
+              <w:rPr>
+                <w:rtl w:val="0"/>
+              </w:rPr>
+            </w:r>
+          </w:p>
+        </w:tc>
+        <w:tc>
+          <w:tcPr>
+            <w:shd w:fill="auto" w:val="clear"/>
+            <w:tcMar>
+              <w:top w:w="100.0" w:type="dxa"/>
+              <w:left w:w="100.0" w:type="dxa"/>
+              <w:bottom w:w="100.0" w:type="dxa"/>
+              <w:right w:w="100.0" w:type="dxa"/>
+            </w:tcMar>
+            <w:vAlign w:val="top"/>
+          </w:tcPr>
+          <w:p>
+            <w:pPr>
+              <w:keepNext w:val="0"/>
+              <w:keepLines w:val="0"/>
+              <w:pageBreakBefore w:val="0"/>
+              <w:widowControl w:val="0"/>
+              <w:pBdr>
+                <w:top w:space="0" w:sz="0" w:val="nil"/>
+                <w:left w:space="0" w:sz="0" w:val="nil"/>
+                <w:bottom w:space="0" w:sz="0" w:val="nil"/>
+                <w:right w:space="0" w:sz="0" w:val="nil"/>
+                <w:between w:space="0" w:sz="0" w:val="nil"/>
+              </w:pBdr>
+              <w:shd w:fill="auto" w:val="clear"/>
+              <w:spacing w:after="0" w:before="0" w:line="240" w:lineRule="auto"/>
+              <w:ind w:left="0" w:right="0" w:firstLine="0"/>
+              <w:jc w:val="left"/>
+              <w:rPr/>
+            </w:pPr>
+            <w:r>
+              <w:rPr>
+                <w:rtl w:val="0"/>
+              </w:rPr>
+            </w:r>
+          </w:p>
+        </w:tc>
+        <w:tc>
+          <w:tcPr>
+            <w:shd w:fill="auto" w:val="clear"/>
+            <w:tcMar>
+              <w:top w:w="100.0" w:type="dxa"/>
+              <w:left w:w="100.0" w:type="dxa"/>
+              <w:bottom w:w="100.0" w:type="dxa"/>
+              <w:right w:w="100.0" w:type="dxa"/>
+            </w:tcMar>
+            <w:vAlign w:val="top"/>
+          </w:tcPr>
+          <w:p>
+            <w:pPr>
+              <w:keepNext w:val="0"/>
+              <w:keepLines w:val="0"/>
+              <w:pageBreakBefore w:val="0"/>
+              <w:widowControl w:val="0"/>
+              <w:pBdr>
+                <w:top w:space="0" w:sz="0" w:val="nil"/>
+                <w:left w:space="0" w:sz="0" w:val="nil"/>
+                <w:bottom w:space="0" w:sz="0" w:val="nil"/>
+                <w:right w:space="0" w:sz="0" w:val="nil"/>
+                <w:between w:space="0" w:sz="0" w:val="nil"/>
+              </w:pBdr>
+              <w:shd w:fill="auto" w:val="clear"/>
+              <w:spacing w:after="0" w:before="0" w:line="240" w:lineRule="auto"/>
+              <w:ind w:left="0" w:right="0" w:firstLine="0"/>
+              <w:jc w:val="left"/>
+              <w:rPr/>
+            </w:pPr>
+            <w:r>
+              <w:rPr>
+                <w:rtl w:val="0"/>
+              </w:rPr>
+            </w:r>
+          </w:p>
+        </w:tc>
+      </w:tr>
+      <w:tr>
+        <w:trPr>
+          <w:cantSplit w:val="0"/>
+          <w:tblHeader w:val="0"/>
+        </w:trPr>
+        <w:tc>
+          <w:tcPr>
+            <w:shd w:fill="auto" w:val="clear"/>
+            <w:tcMar>
+              <w:top w:w="100.0" w:type="dxa"/>
+              <w:left w:w="100.0" w:type="dxa"/>
+              <w:bottom w:w="100.0" w:type="dxa"/>
+              <w:right w:w="100.0" w:type="dxa"/>
+            </w:tcMar>
+            <w:vAlign w:val="top"/>
+          </w:tcPr>
+          <w:p>
+            <w:pPr>
+              <w:keepNext w:val="0"/>
+              <w:keepLines w:val="0"/>
+              <w:pageBreakBefore w:val="0"/>
+              <w:widowControl w:val="0"/>
+              <w:pBdr>
+                <w:top w:space="0" w:sz="0" w:val="nil"/>
+                <w:left w:space="0" w:sz="0" w:val="nil"/>
+                <w:bottom w:space="0" w:sz="0" w:val="nil"/>
+                <w:right w:space="0" w:sz="0" w:val="nil"/>
+                <w:between w:space="0" w:sz="0" w:val="nil"/>
+              </w:pBdr>
+              <w:shd w:fill="auto" w:val="clear"/>
+              <w:spacing w:after="0" w:before="0" w:line="240" w:lineRule="auto"/>
+              <w:ind w:left="0" w:right="0" w:firstLine="0"/>
+              <w:jc w:val="left"/>
+              <w:rPr/>
+            </w:pPr>
+            <w:r>
+              <w:rPr>
+                <w:rtl w:val="0"/>
+              </w:rPr>
+            </w:r>
+          </w:p>
+        </w:tc>
+        <w:tc>
+          <w:tcPr>
+            <w:shd w:fill="auto" w:val="clear"/>
+            <w:tcMar>
+              <w:top w:w="100.0" w:type="dxa"/>
+              <w:left w:w="100.0" w:type="dxa"/>
+              <w:bottom w:w="100.0" w:type="dxa"/>
+              <w:right w:w="100.0" w:type="dxa"/>
+            </w:tcMar>
+            <w:vAlign w:val="top"/>
+          </w:tcPr>
+          <w:p>
+            <w:pPr>
+              <w:keepNext w:val="0"/>
+              <w:keepLines w:val="0"/>
+              <w:pageBreakBefore w:val="0"/>
+              <w:widowControl w:val="0"/>
+              <w:pBdr>
+                <w:top w:space="0" w:sz="0" w:val="nil"/>
+                <w:left w:space="0" w:sz="0" w:val="nil"/>
+                <w:bottom w:space="0" w:sz="0" w:val="nil"/>
+                <w:right w:space="0" w:sz="0" w:val="nil"/>
+                <w:between w:space="0" w:sz="0" w:val="nil"/>
+              </w:pBdr>
+              <w:shd w:fill="auto" w:val="clear"/>
+              <w:spacing w:after="0" w:before="0" w:line="240" w:lineRule="auto"/>
+              <w:ind w:left="0" w:right="0" w:firstLine="0"/>
+              <w:jc w:val="left"/>
+              <w:rPr/>
+            </w:pPr>
+            <w:r>
+              <w:rPr>
+                <w:rtl w:val="0"/>
+              </w:rPr>
+            </w:r>
+          </w:p>
+        </w:tc>
+        <w:tc>
+          <w:tcPr>
+            <w:shd w:fill="auto" w:val="clear"/>
+            <w:tcMar>
+              <w:top w:w="100.0" w:type="dxa"/>
+              <w:left w:w="100.0" w:type="dxa"/>
+              <w:bottom w:w="100.0" w:type="dxa"/>
+              <w:right w:w="100.0" w:type="dxa"/>
+            </w:tcMar>
+            <w:vAlign w:val="top"/>
+          </w:tcPr>
+          <w:p>
+            <w:pPr>
+              <w:keepNext w:val="0"/>
+              <w:keepLines w:val="0"/>
+              <w:pageBreakBefore w:val="0"/>
+              <w:widowControl w:val="0"/>
+              <w:pBdr>
+                <w:top w:space="0" w:sz="0" w:val="nil"/>
+                <w:left w:space="0" w:sz="0" w:val="nil"/>
+                <w:bottom w:space="0" w:sz="0" w:val="nil"/>
+                <w:right w:space="0" w:sz="0" w:val="nil"/>
+                <w:between w:space="0" w:sz="0" w:val="nil"/>
+              </w:pBdr>
+              <w:shd w:fill="auto" w:val="clear"/>
+              <w:spacing w:after="0" w:before="0" w:line="240" w:lineRule="auto"/>
+              <w:ind w:left="0" w:right="0" w:firstLine="0"/>
+              <w:jc w:val="left"/>
+              <w:rPr/>
+            </w:pPr>
+            <w:r>
+              <w:rPr>
+                <w:rtl w:val="0"/>
+              </w:rPr>
+            </w:r>
+          </w:p>
+        </w:tc>
+        <w:tc>
+          <w:tcPr>
+            <w:shd w:fill="auto" w:val="clear"/>
+            <w:tcMar>
+              <w:top w:w="100.0" w:type="dxa"/>
+              <w:left w:w="100.0" w:type="dxa"/>
+              <w:bottom w:w="100.0" w:type="dxa"/>
+              <w:right w:w="100.0" w:type="dxa"/>
+            </w:tcMar>
+            <w:vAlign w:val="top"/>
+          </w:tcPr>
+          <w:p>
+            <w:pPr>
+              <w:keepNext w:val="0"/>
+              <w:keepLines w:val="0"/>
+              <w:pageBreakBefore w:val="0"/>
+              <w:widowControl w:val="0"/>
+              <w:pBdr>
+                <w:top w:space="0" w:sz="0" w:val="nil"/>
+                <w:left w:space="0" w:sz="0" w:val="nil"/>
+                <w:bottom w:space="0" w:sz="0" w:val="nil"/>
+                <w:right w:space="0" w:sz="0" w:val="nil"/>
+                <w:between w:space="0" w:sz="0" w:val="nil"/>
+              </w:pBdr>
+              <w:shd w:fill="auto" w:val="clear"/>
+              <w:spacing w:after="0" w:before="0" w:line="240" w:lineRule="auto"/>
+              <w:ind w:left="0" w:right="0" w:firstLine="0"/>
+              <w:jc w:val="left"/>
+              <w:rPr/>
+            </w:pPr>
+            <w:r>
+              <w:rPr>
+                <w:rtl w:val="0"/>
+              </w:rPr>
+            </w:r>
+          </w:p>
+        </w:tc>
+        <w:tc>
+          <w:tcPr>
+            <w:shd w:fill="auto" w:val="clear"/>
+            <w:tcMar>
+              <w:top w:w="100.0" w:type="dxa"/>
+              <w:left w:w="100.0" w:type="dxa"/>
+              <w:bottom w:w="100.0" w:type="dxa"/>
+              <w:right w:w="100.0" w:type="dxa"/>
+            </w:tcMar>
+            <w:vAlign w:val="top"/>
+          </w:tcPr>
+          <w:p>
+            <w:pPr>
+              <w:keepNext w:val="0"/>
+              <w:keepLines w:val="0"/>
+              <w:pageBreakBefore w:val="0"/>
+              <w:widowControl w:val="0"/>
+              <w:pBdr>
+                <w:top w:space="0" w:sz="0" w:val="nil"/>
+                <w:left w:space="0" w:sz="0" w:val="nil"/>
+                <w:bottom w:space="0" w:sz="0" w:val="nil"/>
+                <w:right w:space="0" w:sz="0" w:val="nil"/>
+                <w:between w:space="0" w:sz="0" w:val="nil"/>
+              </w:pBdr>
+              <w:shd w:fill="auto" w:val="clear"/>
+              <w:spacing w:after="0" w:before="0" w:line="240" w:lineRule="auto"/>
+              <w:ind w:left="0" w:right="0" w:firstLine="0"/>
+              <w:jc w:val="left"/>
+              <w:rPr/>
+            </w:pPr>
+            <w:r>
+              <w:rPr>
+                <w:rtl w:val="0"/>
+              </w:rPr>
+            </w:r>
+          </w:p>
+        </w:tc>
+        <w:tc>
+          <w:tcPr>
+            <w:shd w:fill="auto" w:val="clear"/>
+            <w:tcMar>
+              <w:top w:w="100.0" w:type="dxa"/>
+              <w:left w:w="100.0" w:type="dxa"/>
+              <w:bottom w:w="100.0" w:type="dxa"/>
+              <w:right w:w="100.0" w:type="dxa"/>
+            </w:tcMar>
+            <w:vAlign w:val="top"/>
+          </w:tcPr>
+          <w:p>
+            <w:pPr>
+              <w:keepNext w:val="0"/>
+              <w:keepLines w:val="0"/>
+              <w:pageBreakBefore w:val="0"/>
+              <w:widowControl w:val="0"/>
+              <w:pBdr>
+                <w:top w:space="0" w:sz="0" w:val="nil"/>
+                <w:left w:space="0" w:sz="0" w:val="nil"/>
+                <w:bottom w:space="0" w:sz="0" w:val="nil"/>
+                <w:right w:space="0" w:sz="0" w:val="nil"/>
+                <w:between w:space="0" w:sz="0" w:val="nil"/>
+              </w:pBdr>
+              <w:shd w:fill="auto" w:val="clear"/>
+              <w:spacing w:after="0" w:before="0" w:line="240" w:lineRule="auto"/>
+              <w:ind w:left="0" w:right="0" w:firstLine="0"/>
+              <w:jc w:val="left"/>
+              <w:rPr/>
+            </w:pPr>
+            <w:r>
+              <w:rPr>
+                <w:rtl w:val="0"/>
+              </w:rPr>
+            </w:r>
+          </w:p>
+        </w:tc>
+      </w:tr>
+      <w:tr>
+        <w:trPr>
+          <w:cantSplit w:val="0"/>
+          <w:tblHeader w:val="0"/>
+        </w:trPr>
+        <w:tc>
+          <w:tcPr>
+            <w:shd w:fill="auto" w:val="clear"/>
+            <w:tcMar>
+              <w:top w:w="100.0" w:type="dxa"/>
+              <w:left w:w="100.0" w:type="dxa"/>
+              <w:bottom w:w="100.0" w:type="dxa"/>
+              <w:right w:w="100.0" w:type="dxa"/>
+            </w:tcMar>
+            <w:vAlign w:val="top"/>
+          </w:tcPr>
+          <w:p>
+            <w:pPr>
+              <w:keepNext w:val="0"/>
+              <w:keepLines w:val="0"/>
+              <w:pageBreakBefore w:val="0"/>
+              <w:widowControl w:val="0"/>
+              <w:pBdr>
+                <w:top w:space="0" w:sz="0" w:val="nil"/>
+                <w:left w:space="0" w:sz="0" w:val="nil"/>
+                <w:bottom w:space="0" w:sz="0" w:val="nil"/>
+                <w:right w:space="0" w:sz="0" w:val="nil"/>
+                <w:between w:space="0" w:sz="0" w:val="nil"/>
+              </w:pBdr>
+              <w:shd w:fill="auto" w:val="clear"/>
+              <w:spacing w:after="0" w:before="0" w:line="240" w:lineRule="auto"/>
+              <w:ind w:left="0" w:right="0" w:firstLine="0"/>
+              <w:jc w:val="left"/>
+              <w:rPr/>
+            </w:pPr>
+            <w:r>
+              <w:rPr>
+                <w:rtl w:val="0"/>
+              </w:rPr>
+            </w:r>
+          </w:p>
+        </w:tc>
+        <w:tc>
+          <w:tcPr>
+            <w:shd w:fill="auto" w:val="clear"/>
+            <w:tcMar>
+              <w:top w:w="100.0" w:type="dxa"/>
+              <w:left w:w="100.0" w:type="dxa"/>
+              <w:bottom w:w="100.0" w:type="dxa"/>
+              <w:right w:w="100.0" w:type="dxa"/>
+            </w:tcMar>
+            <w:vAlign w:val="top"/>
+          </w:tcPr>
+          <w:p>
+            <w:pPr>
+              <w:keepNext w:val="0"/>
+              <w:keepLines w:val="0"/>
+              <w:pageBreakBefore w:val="0"/>
+              <w:widowControl w:val="0"/>
+              <w:pBdr>
+                <w:top w:space="0" w:sz="0" w:val="nil"/>
+                <w:left w:space="0" w:sz="0" w:val="nil"/>
+                <w:bottom w:space="0" w:sz="0" w:val="nil"/>
+                <w:right w:space="0" w:sz="0" w:val="nil"/>
+                <w:between w:space="0" w:sz="0" w:val="nil"/>
+              </w:pBdr>
+              <w:shd w:fill="auto" w:val="clear"/>
+              <w:spacing w:after="0" w:before="0" w:line="240" w:lineRule="auto"/>
+              <w:ind w:left="0" w:right="0" w:firstLine="0"/>
+              <w:jc w:val="left"/>
+              <w:rPr/>
+            </w:pPr>
+            <w:r>
+              <w:rPr>
+                <w:rtl w:val="0"/>
+              </w:rPr>
+            </w:r>
+          </w:p>
+        </w:tc>
+        <w:tc>
+          <w:tcPr>
+            <w:shd w:fill="auto" w:val="clear"/>
+            <w:tcMar>
+              <w:top w:w="100.0" w:type="dxa"/>
+              <w:left w:w="100.0" w:type="dxa"/>
+              <w:bottom w:w="100.0" w:type="dxa"/>
+              <w:right w:w="100.0" w:type="dxa"/>
+            </w:tcMar>
+            <w:vAlign w:val="top"/>
+          </w:tcPr>
+          <w:p>
+            <w:pPr>
+              <w:keepNext w:val="0"/>
+              <w:keepLines w:val="0"/>
+              <w:pageBreakBefore w:val="0"/>
+              <w:widowControl w:val="0"/>
+              <w:pBdr>
+                <w:top w:space="0" w:sz="0" w:val="nil"/>
+                <w:left w:space="0" w:sz="0" w:val="nil"/>
+                <w:bottom w:space="0" w:sz="0" w:val="nil"/>
+                <w:right w:space="0" w:sz="0" w:val="nil"/>
+                <w:between w:space="0" w:sz="0" w:val="nil"/>
+              </w:pBdr>
+              <w:shd w:fill="auto" w:val="clear"/>
+              <w:spacing w:after="0" w:before="0" w:line="240" w:lineRule="auto"/>
+              <w:ind w:left="0" w:right="0" w:firstLine="0"/>
+              <w:jc w:val="left"/>
+              <w:rPr/>
+            </w:pPr>
+            <w:r>
+              <w:rPr>
+                <w:rtl w:val="0"/>
+              </w:rPr>
+            </w:r>
+          </w:p>
+        </w:tc>
+        <w:tc>
+          <w:tcPr>
+            <w:shd w:fill="auto" w:val="clear"/>
+            <w:tcMar>
+              <w:top w:w="100.0" w:type="dxa"/>
+              <w:left w:w="100.0" w:type="dxa"/>
+              <w:bottom w:w="100.0" w:type="dxa"/>
+              <w:right w:w="100.0" w:type="dxa"/>
+            </w:tcMar>
+            <w:vAlign w:val="top"/>
+          </w:tcPr>
+          <w:p>
+            <w:pPr>
+              <w:keepNext w:val="0"/>
+              <w:keepLines w:val="0"/>
+              <w:pageBreakBefore w:val="0"/>
+              <w:widowControl w:val="0"/>
+              <w:pBdr>
+                <w:top w:space="0" w:sz="0" w:val="nil"/>
+                <w:left w:space="0" w:sz="0" w:val="nil"/>
+                <w:bottom w:space="0" w:sz="0" w:val="nil"/>
+                <w:right w:space="0" w:sz="0" w:val="nil"/>
+                <w:between w:space="0" w:sz="0" w:val="nil"/>
+              </w:pBdr>
+              <w:shd w:fill="auto" w:val="clear"/>
+              <w:spacing w:after="0" w:before="0" w:line="240" w:lineRule="auto"/>
+              <w:ind w:left="0" w:right="0" w:firstLine="0"/>
+              <w:jc w:val="left"/>
+              <w:rPr/>
+            </w:pPr>
+            <w:r>
+              <w:rPr>
+                <w:rtl w:val="0"/>
+              </w:rPr>
+            </w:r>
+          </w:p>
+        </w:tc>
+        <w:tc>
+          <w:tcPr>
+            <w:shd w:fill="auto" w:val="clear"/>
+            <w:tcMar>
+              <w:top w:w="100.0" w:type="dxa"/>
+              <w:left w:w="100.0" w:type="dxa"/>
+              <w:bottom w:w="100.0" w:type="dxa"/>
+              <w:right w:w="100.0" w:type="dxa"/>
+            </w:tcMar>
+            <w:vAlign w:val="top"/>
+          </w:tcPr>
+          <w:p>
+            <w:pPr>
+              <w:keepNext w:val="0"/>
+              <w:keepLines w:val="0"/>
+              <w:pageBreakBefore w:val="0"/>
+              <w:widowControl w:val="0"/>
+              <w:pBdr>
+                <w:top w:space="0" w:sz="0" w:val="nil"/>
+                <w:left w:space="0" w:sz="0" w:val="nil"/>
+                <w:bottom w:space="0" w:sz="0" w:val="nil"/>
+                <w:right w:space="0" w:sz="0" w:val="nil"/>
+                <w:between w:space="0" w:sz="0" w:val="nil"/>
+              </w:pBdr>
+              <w:shd w:fill="auto" w:val="clear"/>
+              <w:spacing w:after="0" w:before="0" w:line="240" w:lineRule="auto"/>
+              <w:ind w:left="0" w:right="0" w:firstLine="0"/>
+              <w:jc w:val="left"/>
+              <w:rPr/>
+            </w:pPr>
+            <w:r>
+              <w:rPr>
+                <w:rtl w:val="0"/>
+              </w:rPr>
+            </w:r>
+          </w:p>
+        </w:tc>
+        <w:tc>
+          <w:tcPr>
+            <w:shd w:fill="auto" w:val="clear"/>
+            <w:tcMar>
+              <w:top w:w="100.0" w:type="dxa"/>
+              <w:left w:w="100.0" w:type="dxa"/>
+              <w:bottom w:w="100.0" w:type="dxa"/>
+              <w:right w:w="100.0" w:type="dxa"/>
+            </w:tcMar>
+            <w:vAlign w:val="top"/>
+          </w:tcPr>
+          <w:p>
+            <w:pPr>
+              <w:keepNext w:val="0"/>
+              <w:keepLines w:val="0"/>
+              <w:pageBreakBefore w:val="0"/>
+              <w:widowControl w:val="0"/>
+              <w:pBdr>
+                <w:top w:space="0" w:sz="0" w:val="nil"/>
+                <w:left w:space="0" w:sz="0" w:val="nil"/>
+                <w:bottom w:space="0" w:sz="0" w:val="nil"/>
+                <w:right w:space="0" w:sz="0" w:val="nil"/>
+                <w:between w:space="0" w:sz="0" w:val="nil"/>
+              </w:pBdr>
+              <w:shd w:fill="auto" w:val="clear"/>
+              <w:spacing w:after="0" w:before="0" w:line="240" w:lineRule="auto"/>
+              <w:ind w:left="0" w:right="0" w:firstLine="0"/>
+              <w:jc w:val="left"/>
+              <w:rPr/>
+            </w:pPr>
+            <w:r>
+              <w:rPr>
+                <w:rtl w:val="0"/>
+              </w:rPr>
+            </w:r>
+          </w:p>
+        </w:tc>
+      </w:tr>
+      <w:tr>
+        <w:trPr>
+          <w:cantSplit w:val="0"/>
+          <w:tblHeader w:val="0"/>
+        </w:trPr>
+        <w:tc>
+          <w:tcPr>
+            <w:shd w:fill="auto" w:val="clear"/>
+            <w:tcMar>
+              <w:top w:w="100.0" w:type="dxa"/>
+              <w:left w:w="100.0" w:type="dxa"/>
+              <w:bottom w:w="100.0" w:type="dxa"/>
+              <w:right w:w="100.0" w:type="dxa"/>
+            </w:tcMar>
+            <w:vAlign w:val="top"/>
+          </w:tcPr>
+          <w:p>
+            <w:pPr>
+              <w:keepNext w:val="0"/>
+              <w:keepLines w:val="0"/>
+              <w:pageBreakBefore w:val="0"/>
+              <w:widowControl w:val="0"/>
+              <w:pBdr>
+                <w:top w:space="0" w:sz="0" w:val="nil"/>
+                <w:left w:space="0" w:sz="0" w:val="nil"/>
+                <w:bottom w:space="0" w:sz="0" w:val="nil"/>
+                <w:right w:space="0" w:sz="0" w:val="nil"/>
+                <w:between w:space="0" w:sz="0" w:val="nil"/>
+              </w:pBdr>
+              <w:shd w:fill="auto" w:val="clear"/>
+              <w:spacing w:after="0" w:before="0" w:line="240" w:lineRule="auto"/>
+              <w:ind w:left="0" w:right="0" w:firstLine="0"/>
+              <w:jc w:val="left"/>
+              <w:rPr/>
+            </w:pPr>
+            <w:r>
+              <w:rPr>
+                <w:rtl w:val="0"/>
+              </w:rPr>
+            </w:r>
+          </w:p>
+        </w:tc>
+        <w:tc>
+          <w:tcPr>
+            <w:shd w:fill="auto" w:val="clear"/>
+            <w:tcMar>
+              <w:top w:w="100.0" w:type="dxa"/>
+              <w:left w:w="100.0" w:type="dxa"/>
+              <w:bottom w:w="100.0" w:type="dxa"/>
+              <w:right w:w="100.0" w:type="dxa"/>
+            </w:tcMar>
+            <w:vAlign w:val="top"/>
+          </w:tcPr>
+          <w:p>
+            <w:pPr>
+              <w:keepNext w:val="0"/>
+              <w:keepLines w:val="0"/>
+              <w:pageBreakBefore w:val="0"/>
+              <w:widowControl w:val="0"/>
+              <w:pBdr>
+                <w:top w:space="0" w:sz="0" w:val="nil"/>
+                <w:left w:space="0" w:sz="0" w:val="nil"/>
+                <w:bottom w:space="0" w:sz="0" w:val="nil"/>
+                <w:right w:space="0" w:sz="0" w:val="nil"/>
+                <w:between w:space="0" w:sz="0" w:val="nil"/>
+              </w:pBdr>
+              <w:shd w:fill="auto" w:val="clear"/>
+              <w:spacing w:after="0" w:before="0" w:line="240" w:lineRule="auto"/>
+              <w:ind w:left="0" w:right="0" w:firstLine="0"/>
+              <w:jc w:val="left"/>
+              <w:rPr/>
+            </w:pPr>
+            <w:r>
+              <w:rPr>
+                <w:rtl w:val="0"/>
+              </w:rPr>
+            </w:r>
+          </w:p>
+        </w:tc>
+        <w:tc>
+          <w:tcPr>
+            <w:shd w:fill="auto" w:val="clear"/>
+            <w:tcMar>
+              <w:top w:w="100.0" w:type="dxa"/>
+              <w:left w:w="100.0" w:type="dxa"/>
+              <w:bottom w:w="100.0" w:type="dxa"/>
+              <w:right w:w="100.0" w:type="dxa"/>
+            </w:tcMar>
+            <w:vAlign w:val="top"/>
+          </w:tcPr>
+          <w:p>
+            <w:pPr>
+              <w:keepNext w:val="0"/>
+              <w:keepLines w:val="0"/>
+              <w:pageBreakBefore w:val="0"/>
+              <w:widowControl w:val="0"/>
+              <w:pBdr>
+                <w:top w:space="0" w:sz="0" w:val="nil"/>
+                <w:left w:space="0" w:sz="0" w:val="nil"/>
+                <w:bottom w:space="0" w:sz="0" w:val="nil"/>
+                <w:right w:space="0" w:sz="0" w:val="nil"/>
+                <w:between w:space="0" w:sz="0" w:val="nil"/>
+              </w:pBdr>
+              <w:shd w:fill="auto" w:val="clear"/>
+              <w:spacing w:after="0" w:before="0" w:line="240" w:lineRule="auto"/>
+              <w:ind w:left="0" w:right="0" w:firstLine="0"/>
+              <w:jc w:val="left"/>
+              <w:rPr/>
+            </w:pPr>
+            <w:r>
+              <w:rPr>
+                <w:rtl w:val="0"/>
+              </w:rPr>
+            </w:r>
+          </w:p>
+        </w:tc>
+        <w:tc>
+          <w:tcPr>
+            <w:shd w:fill="auto" w:val="clear"/>
+            <w:tcMar>
+              <w:top w:w="100.0" w:type="dxa"/>
+              <w:left w:w="100.0" w:type="dxa"/>
+              <w:bottom w:w="100.0" w:type="dxa"/>
+              <w:right w:w="100.0" w:type="dxa"/>
+            </w:tcMar>
+            <w:vAlign w:val="top"/>
+          </w:tcPr>
+          <w:p>
+            <w:pPr>
+              <w:keepNext w:val="0"/>
+              <w:keepLines w:val="0"/>
+              <w:pageBreakBefore w:val="0"/>
+              <w:widowControl w:val="0"/>
+              <w:pBdr>
+                <w:top w:space="0" w:sz="0" w:val="nil"/>
+                <w:left w:space="0" w:sz="0" w:val="nil"/>
+                <w:bottom w:space="0" w:sz="0" w:val="nil"/>
+                <w:right w:space="0" w:sz="0" w:val="nil"/>
+                <w:between w:space="0" w:sz="0" w:val="nil"/>
+              </w:pBdr>
+              <w:shd w:fill="auto" w:val="clear"/>
+              <w:spacing w:after="0" w:before="0" w:line="240" w:lineRule="auto"/>
+              <w:ind w:left="0" w:right="0" w:firstLine="0"/>
+              <w:jc w:val="left"/>
+              <w:rPr/>
+            </w:pPr>
+            <w:r>
+              <w:rPr>
+                <w:rtl w:val="0"/>
+              </w:rPr>
+            </w:r>
+          </w:p>
+        </w:tc>
+        <w:tc>
+          <w:tcPr>
+            <w:shd w:fill="auto" w:val="clear"/>
+            <w:tcMar>
+              <w:top w:w="100.0" w:type="dxa"/>
+              <w:left w:w="100.0" w:type="dxa"/>
+              <w:bottom w:w="100.0" w:type="dxa"/>
+              <w:right w:w="100.0" w:type="dxa"/>
+            </w:tcMar>
+            <w:vAlign w:val="top"/>
+          </w:tcPr>
+          <w:p>
+            <w:pPr>
+              <w:keepNext w:val="0"/>
+              <w:keepLines w:val="0"/>
+              <w:pageBreakBefore w:val="0"/>
+              <w:widowControl w:val="0"/>
+              <w:pBdr>
+                <w:top w:space="0" w:sz="0" w:val="nil"/>
+                <w:left w:space="0" w:sz="0" w:val="nil"/>
+                <w:bottom w:space="0" w:sz="0" w:val="nil"/>
+                <w:right w:space="0" w:sz="0" w:val="nil"/>
+                <w:between w:space="0" w:sz="0" w:val="nil"/>
+              </w:pBdr>
+              <w:shd w:fill="auto" w:val="clear"/>
+              <w:spacing w:after="0" w:before="0" w:line="240" w:lineRule="auto"/>
+              <w:ind w:left="0" w:right="0" w:firstLine="0"/>
+              <w:jc w:val="left"/>
+              <w:rPr/>
+            </w:pPr>
+            <w:r>
+              <w:rPr>
+                <w:rtl w:val="0"/>
+              </w:rPr>
+            </w:r>
+          </w:p>
+        </w:tc>
+        <w:tc>
+          <w:tcPr>
+            <w:shd w:fill="auto" w:val="clear"/>
+            <w:tcMar>
+              <w:top w:w="100.0" w:type="dxa"/>
+              <w:left w:w="100.0" w:type="dxa"/>
+              <w:bottom w:w="100.0" w:type="dxa"/>
+              <w:right w:w="100.0" w:type="dxa"/>
+            </w:tcMar>
+            <w:vAlign w:val="top"/>
+          </w:tcPr>
+          <w:p>
+            <w:pPr>
+              <w:keepNext w:val="0"/>
+              <w:keepLines w:val="0"/>
+              <w:pageBreakBefore w:val="0"/>
+              <w:widowControl w:val="0"/>
+              <w:pBdr>
+                <w:top w:space="0" w:sz="0" w:val="nil"/>
+                <w:left w:space="0" w:sz="0" w:val="nil"/>
+                <w:bottom w:space="0" w:sz="0" w:val="nil"/>
+                <w:right w:space="0" w:sz="0" w:val="nil"/>
+                <w:between w:space="0" w:sz="0" w:val="nil"/>
+              </w:pBdr>
+              <w:shd w:fill="auto" w:val="clear"/>
+              <w:spacing w:after="0" w:before="0" w:line="240" w:lineRule="auto"/>
+              <w:ind w:left="0" w:right="0" w:firstLine="0"/>
+              <w:jc w:val="left"/>
+              <w:rPr/>
+            </w:pPr>
+            <w:r>
+              <w:rPr>
+                <w:rtl w:val="0"/>
+              </w:rPr>
+            </w:r>
+          </w:p>
+        </w:tc>
+      </w:tr>
+      <w:tr>
+        <w:trPr>
+          <w:cantSplit w:val="0"/>
+          <w:tblHeader w:val="0"/>
+        </w:trPr>
+        <w:tc>
+          <w:tcPr>
+            <w:shd w:fill="auto" w:val="clear"/>
+            <w:tcMar>
+              <w:top w:w="100.0" w:type="dxa"/>
+              <w:left w:w="100.0" w:type="dxa"/>
+              <w:bottom w:w="100.0" w:type="dxa"/>
+              <w:right w:w="100.0" w:type="dxa"/>
+            </w:tcMar>
+            <w:vAlign w:val="top"/>
+          </w:tcPr>
+          <w:p>
+            <w:pPr>
+              <w:keepNext w:val="0"/>
+              <w:keepLines w:val="0"/>
+              <w:pageBreakBefore w:val="0"/>
+              <w:widowControl w:val="0"/>
+              <w:pBdr>
+                <w:top w:space="0" w:sz="0" w:val="nil"/>
+                <w:left w:space="0" w:sz="0" w:val="nil"/>
+                <w:bottom w:space="0" w:sz="0" w:val="nil"/>
+                <w:right w:space="0" w:sz="0" w:val="nil"/>
+                <w:between w:space="0" w:sz="0" w:val="nil"/>
+              </w:pBdr>
+              <w:shd w:fill="auto" w:val="clear"/>
+              <w:spacing w:after="0" w:before="0" w:line="240" w:lineRule="auto"/>
+              <w:ind w:left="0" w:right="0" w:firstLine="0"/>
+              <w:jc w:val="left"/>
+              <w:rPr/>
+            </w:pPr>
+            <w:r>
+              <w:rPr>
+                <w:rtl w:val="0"/>
+              </w:rPr>
+            </w:r>
+          </w:p>
+        </w:tc>
+        <w:tc>
+          <w:tcPr>
+            <w:shd w:fill="auto" w:val="clear"/>
+            <w:tcMar>
+              <w:top w:w="100.0" w:type="dxa"/>
+              <w:left w:w="100.0" w:type="dxa"/>
+              <w:bottom w:w="100.0" w:type="dxa"/>
+              <w:right w:w="100.0" w:type="dxa"/>
+            </w:tcMar>
+            <w:vAlign w:val="top"/>
+          </w:tcPr>
+          <w:p>
+            <w:pPr>
+              <w:keepNext w:val="0"/>
+              <w:keepLines w:val="0"/>
+              <w:pageBreakBefore w:val="0"/>
+              <w:widowControl w:val="0"/>
+              <w:pBdr>
+                <w:top w:space="0" w:sz="0" w:val="nil"/>
+                <w:left w:space="0" w:sz="0" w:val="nil"/>
+                <w:bottom w:space="0" w:sz="0" w:val="nil"/>
+                <w:right w:space="0" w:sz="0" w:val="nil"/>
+                <w:between w:space="0" w:sz="0" w:val="nil"/>
+              </w:pBdr>
+              <w:shd w:fill="auto" w:val="clear"/>
+              <w:spacing w:after="0" w:before="0" w:line="240" w:lineRule="auto"/>
+              <w:ind w:left="0" w:right="0" w:firstLine="0"/>
+              <w:jc w:val="left"/>
+              <w:rPr/>
+            </w:pPr>
+            <w:r>
+              <w:rPr>
+                <w:rtl w:val="0"/>
+              </w:rPr>
+            </w:r>
+          </w:p>
+        </w:tc>
+        <w:tc>
+          <w:tcPr>
+            <w:shd w:fill="auto" w:val="clear"/>
+            <w:tcMar>
+              <w:top w:w="100.0" w:type="dxa"/>
+              <w:left w:w="100.0" w:type="dxa"/>
+              <w:bottom w:w="100.0" w:type="dxa"/>
+              <w:right w:w="100.0" w:type="dxa"/>
+            </w:tcMar>
+            <w:vAlign w:val="top"/>
+          </w:tcPr>
+          <w:p>
+            <w:pPr>
+              <w:keepNext w:val="0"/>
+              <w:keepLines w:val="0"/>
+              <w:pageBreakBefore w:val="0"/>
+              <w:widowControl w:val="0"/>
+              <w:pBdr>
+                <w:top w:space="0" w:sz="0" w:val="nil"/>
+                <w:left w:space="0" w:sz="0" w:val="nil"/>
+                <w:bottom w:space="0" w:sz="0" w:val="nil"/>
+                <w:right w:space="0" w:sz="0" w:val="nil"/>
+                <w:between w:space="0" w:sz="0" w:val="nil"/>
+              </w:pBdr>
+              <w:shd w:fill="auto" w:val="clear"/>
+              <w:spacing w:after="0" w:before="0" w:line="240" w:lineRule="auto"/>
+              <w:ind w:left="0" w:right="0" w:firstLine="0"/>
+              <w:jc w:val="left"/>
+              <w:rPr/>
+            </w:pPr>
+            <w:r>
+              <w:rPr>
+                <w:rtl w:val="0"/>
+              </w:rPr>
+            </w:r>
+          </w:p>
+        </w:tc>
+        <w:tc>
+          <w:tcPr>
+            <w:shd w:fill="auto" w:val="clear"/>
+            <w:tcMar>
+              <w:top w:w="100.0" w:type="dxa"/>
+              <w:left w:w="100.0" w:type="dxa"/>
+              <w:bottom w:w="100.0" w:type="dxa"/>
+              <w:right w:w="100.0" w:type="dxa"/>
+            </w:tcMar>
+            <w:vAlign w:val="top"/>
+          </w:tcPr>
+          <w:p>
+            <w:pPr>
+              <w:keepNext w:val="0"/>
+              <w:keepLines w:val="0"/>
+              <w:pageBreakBefore w:val="0"/>
+              <w:widowControl w:val="0"/>
+              <w:pBdr>
+                <w:top w:space="0" w:sz="0" w:val="nil"/>
+                <w:left w:space="0" w:sz="0" w:val="nil"/>
+                <w:bottom w:space="0" w:sz="0" w:val="nil"/>
+                <w:right w:space="0" w:sz="0" w:val="nil"/>
+                <w:between w:space="0" w:sz="0" w:val="nil"/>
+              </w:pBdr>
+              <w:shd w:fill="auto" w:val="clear"/>
+              <w:spacing w:after="0" w:before="0" w:line="240" w:lineRule="auto"/>
+              <w:ind w:left="0" w:right="0" w:firstLine="0"/>
+              <w:jc w:val="left"/>
+              <w:rPr/>
+            </w:pPr>
+            <w:r>
+              <w:rPr>
+                <w:rtl w:val="0"/>
+              </w:rPr>
+            </w:r>
+          </w:p>
+        </w:tc>
+        <w:tc>
+          <w:tcPr>
+            <w:shd w:fill="auto" w:val="clear"/>
+            <w:tcMar>
+              <w:top w:w="100.0" w:type="dxa"/>
+              <w:left w:w="100.0" w:type="dxa"/>
+              <w:bottom w:w="100.0" w:type="dxa"/>
+              <w:right w:w="100.0" w:type="dxa"/>
+            </w:tcMar>
+            <w:vAlign w:val="top"/>
+          </w:tcPr>
+          <w:p>
+            <w:pPr>
+              <w:keepNext w:val="0"/>
+              <w:keepLines w:val="0"/>
+              <w:pageBreakBefore w:val="0"/>
+              <w:widowControl w:val="0"/>
+              <w:pBdr>
+                <w:top w:space="0" w:sz="0" w:val="nil"/>
+                <w:left w:space="0" w:sz="0" w:val="nil"/>
+                <w:bottom w:space="0" w:sz="0" w:val="nil"/>
+                <w:right w:space="0" w:sz="0" w:val="nil"/>
+                <w:between w:space="0" w:sz="0" w:val="nil"/>
+              </w:pBdr>
+              <w:shd w:fill="auto" w:val="clear"/>
+              <w:spacing w:after="0" w:before="0" w:line="240" w:lineRule="auto"/>
+              <w:ind w:left="0" w:right="0" w:firstLine="0"/>
+              <w:jc w:val="left"/>
+              <w:rPr/>
+            </w:pPr>
+            <w:r>
+              <w:rPr>
+                <w:rtl w:val="0"/>
+              </w:rPr>
+            </w:r>
+          </w:p>
+        </w:tc>
+        <w:tc>
+          <w:tcPr>
+            <w:shd w:fill="auto" w:val="clear"/>
+            <w:tcMar>
+              <w:top w:w="100.0" w:type="dxa"/>
+              <w:left w:w="100.0" w:type="dxa"/>
+              <w:bottom w:w="100.0" w:type="dxa"/>
+              <w:right w:w="100.0" w:type="dxa"/>
+            </w:tcMar>
+            <w:vAlign w:val="top"/>
+          </w:tcPr>
+          <w:p>
+            <w:pPr>
+              <w:keepNext w:val="0"/>
+              <w:keepLines w:val="0"/>
+              <w:pageBreakBefore w:val="0"/>
+              <w:widowControl w:val="0"/>
+              <w:pBdr>
+                <w:top w:space="0" w:sz="0" w:val="nil"/>
+                <w:left w:space="0" w:sz="0" w:val="nil"/>
+                <w:bottom w:space="0" w:sz="0" w:val="nil"/>
+                <w:right w:space="0" w:sz="0" w:val="nil"/>
+                <w:between w:space="0" w:sz="0" w:val="nil"/>
+              </w:pBdr>
+              <w:shd w:fill="auto" w:val="clear"/>
+              <w:spacing w:after="0" w:before="0" w:line="240" w:lineRule="auto"/>
+              <w:ind w:left="0" w:right="0" w:firstLine="0"/>
+              <w:jc w:val="left"/>
+              <w:rPr/>
+            </w:pPr>
+            <w:r>
+              <w:rPr>
+                <w:rtl w:val="0"/>
+              </w:rPr>
+            </w:r>
+          </w:p>
+        </w:tc>
+      </w:tr>
+      <w:tr>
+        <w:trPr>
+          <w:cantSplit w:val="0"/>
+          <w:tblHeader w:val="0"/>
+        </w:trPr>
+        <w:tc>
+          <w:tcPr>
+            <w:shd w:fill="auto" w:val="clear"/>
+            <w:tcMar>
+              <w:top w:w="100.0" w:type="dxa"/>
+              <w:left w:w="100.0" w:type="dxa"/>
+              <w:bottom w:w="100.0" w:type="dxa"/>
+              <w:right w:w="100.0" w:type="dxa"/>
+            </w:tcMar>
+            <w:vAlign w:val="top"/>
+          </w:tcPr>
+          <w:p>
+            <w:pPr>
+              <w:keepNext w:val="0"/>
+              <w:keepLines w:val="0"/>
+              <w:pageBreakBefore w:val="0"/>
+              <w:widowControl w:val="0"/>
+              <w:pBdr>
+                <w:top w:space="0" w:sz="0" w:val="nil"/>
+                <w:left w:space="0" w:sz="0" w:val="nil"/>
+                <w:bottom w:space="0" w:sz="0" w:val="nil"/>
+                <w:right w:space="0" w:sz="0" w:val="nil"/>
+                <w:between w:space="0" w:sz="0" w:val="nil"/>
+              </w:pBdr>
+              <w:shd w:fill="auto" w:val="clear"/>
+              <w:spacing w:after="0" w:before="0" w:line="240" w:lineRule="auto"/>
+              <w:ind w:left="0" w:right="0" w:firstLine="0"/>
+              <w:jc w:val="left"/>
+              <w:rPr/>
+            </w:pPr>
+            <w:r>
+              <w:rPr>
+                <w:rtl w:val="0"/>
+              </w:rPr>
+            </w:r>
+          </w:p>
+        </w:tc>
+        <w:tc>
+          <w:tcPr>
+            <w:shd w:fill="auto" w:val="clear"/>
+            <w:tcMar>
+              <w:top w:w="100.0" w:type="dxa"/>
+              <w:left w:w="100.0" w:type="dxa"/>
+              <w:bottom w:w="100.0" w:type="dxa"/>
+              <w:right w:w="100.0" w:type="dxa"/>
+            </w:tcMar>
+            <w:vAlign w:val="top"/>
+          </w:tcPr>
+          <w:p>
+            <w:pPr>
+              <w:keepNext w:val="0"/>
+              <w:keepLines w:val="0"/>
+              <w:pageBreakBefore w:val="0"/>
+              <w:widowControl w:val="0"/>
+              <w:pBdr>
+                <w:top w:space="0" w:sz="0" w:val="nil"/>
+                <w:left w:space="0" w:sz="0" w:val="nil"/>
+                <w:bottom w:space="0" w:sz="0" w:val="nil"/>
+                <w:right w:space="0" w:sz="0" w:val="nil"/>
+                <w:between w:space="0" w:sz="0" w:val="nil"/>
+              </w:pBdr>
+              <w:shd w:fill="auto" w:val="clear"/>
+              <w:spacing w:after="0" w:before="0" w:line="240" w:lineRule="auto"/>
+              <w:ind w:left="0" w:right="0" w:firstLine="0"/>
+              <w:jc w:val="left"/>
+              <w:rPr/>
+            </w:pPr>
+            <w:r>
+              <w:rPr>
+                <w:rtl w:val="0"/>
+              </w:rPr>
+            </w:r>
+          </w:p>
+        </w:tc>
+        <w:tc>
+          <w:tcPr>
+            <w:shd w:fill="auto" w:val="clear"/>
+            <w:tcMar>
+              <w:top w:w="100.0" w:type="dxa"/>
+              <w:left w:w="100.0" w:type="dxa"/>
+              <w:bottom w:w="100.0" w:type="dxa"/>
+              <w:right w:w="100.0" w:type="dxa"/>
+            </w:tcMar>
+            <w:vAlign w:val="top"/>
+          </w:tcPr>
+          <w:p>
+            <w:pPr>
+              <w:keepNext w:val="0"/>
+              <w:keepLines w:val="0"/>
+              <w:pageBreakBefore w:val="0"/>
+              <w:widowControl w:val="0"/>
+              <w:pBdr>
+                <w:top w:space="0" w:sz="0" w:val="nil"/>
+                <w:left w:space="0" w:sz="0" w:val="nil"/>
+                <w:bottom w:space="0" w:sz="0" w:val="nil"/>
+                <w:right w:space="0" w:sz="0" w:val="nil"/>
+                <w:between w:space="0" w:sz="0" w:val="nil"/>
+              </w:pBdr>
+              <w:shd w:fill="auto" w:val="clear"/>
+              <w:spacing w:after="0" w:before="0" w:line="240" w:lineRule="auto"/>
+              <w:ind w:left="0" w:right="0" w:firstLine="0"/>
+              <w:jc w:val="left"/>
+              <w:rPr/>
+            </w:pPr>
+            <w:r>
+              <w:rPr>
+                <w:rtl w:val="0"/>
+              </w:rPr>
+            </w:r>
+          </w:p>
+        </w:tc>
+        <w:tc>
+          <w:tcPr>
+            <w:shd w:fill="auto" w:val="clear"/>
+            <w:tcMar>
+              <w:top w:w="100.0" w:type="dxa"/>
+              <w:left w:w="100.0" w:type="dxa"/>
+              <w:bottom w:w="100.0" w:type="dxa"/>
+              <w:right w:w="100.0" w:type="dxa"/>
+            </w:tcMar>
+            <w:vAlign w:val="top"/>
+          </w:tcPr>
+          <w:p>
+            <w:pPr>
+              <w:keepNext w:val="0"/>
+              <w:keepLines w:val="0"/>
+              <w:pageBreakBefore w:val="0"/>
+              <w:widowControl w:val="0"/>
+              <w:pBdr>
+                <w:top w:space="0" w:sz="0" w:val="nil"/>
+                <w:left w:space="0" w:sz="0" w:val="nil"/>
+                <w:bottom w:space="0" w:sz="0" w:val="nil"/>
+                <w:right w:space="0" w:sz="0" w:val="nil"/>
+                <w:between w:space="0" w:sz="0" w:val="nil"/>
+              </w:pBdr>
+              <w:shd w:fill="auto" w:val="clear"/>
+              <w:spacing w:after="0" w:before="0" w:line="240" w:lineRule="auto"/>
+              <w:ind w:left="0" w:right="0" w:firstLine="0"/>
+              <w:jc w:val="left"/>
+              <w:rPr/>
+            </w:pPr>
+            <w:r>
+              <w:rPr>
+                <w:rtl w:val="0"/>
+              </w:rPr>
+            </w:r>
+          </w:p>
+        </w:tc>
+        <w:tc>
+          <w:tcPr>
+            <w:shd w:fill="auto" w:val="clear"/>
+            <w:tcMar>
+              <w:top w:w="100.0" w:type="dxa"/>
+              <w:left w:w="100.0" w:type="dxa"/>
+              <w:bottom w:w="100.0" w:type="dxa"/>
+              <w:right w:w="100.0" w:type="dxa"/>
+            </w:tcMar>
+            <w:vAlign w:val="top"/>
+          </w:tcPr>
+          <w:p>
+            <w:pPr>
+              <w:keepNext w:val="0"/>
+              <w:keepLines w:val="0"/>
+              <w:pageBreakBefore w:val="0"/>
+              <w:widowControl w:val="0"/>
+              <w:pBdr>
+                <w:top w:space="0" w:sz="0" w:val="nil"/>
+                <w:left w:space="0" w:sz="0" w:val="nil"/>
+                <w:bottom w:space="0" w:sz="0" w:val="nil"/>
+                <w:right w:space="0" w:sz="0" w:val="nil"/>
+                <w:between w:space="0" w:sz="0" w:val="nil"/>
+              </w:pBdr>
+              <w:shd w:fill="auto" w:val="clear"/>
+              <w:spacing w:after="0" w:before="0" w:line="240" w:lineRule="auto"/>
+              <w:ind w:left="0" w:right="0" w:firstLine="0"/>
+              <w:jc w:val="left"/>
+              <w:rPr/>
+            </w:pPr>
+            <w:r>
+              <w:rPr>
+                <w:rtl w:val="0"/>
+              </w:rPr>
+            </w:r>
+          </w:p>
+        </w:tc>
+        <w:tc>
+          <w:tcPr>
+            <w:shd w:fill="auto" w:val="clear"/>
+            <w:tcMar>
+              <w:top w:w="100.0" w:type="dxa"/>
+              <w:left w:w="100.0" w:type="dxa"/>
+              <w:bottom w:w="100.0" w:type="dxa"/>
+              <w:right w:w="100.0" w:type="dxa"/>
+            </w:tcMar>
+            <w:vAlign w:val="top"/>
+          </w:tcPr>
+          <w:p>
+            <w:pPr>
+              <w:keepNext w:val="0"/>
+              <w:keepLines w:val="0"/>
+              <w:pageBreakBefore w:val="0"/>
+              <w:widowControl w:val="0"/>
+              <w:pBdr>
+                <w:top w:space="0" w:sz="0" w:val="nil"/>
+                <w:left w:space="0" w:sz="0" w:val="nil"/>
+                <w:bottom w:space="0" w:sz="0" w:val="nil"/>
+                <w:right w:space="0" w:sz="0" w:val="nil"/>
+                <w:between w:space="0" w:sz="0" w:val="nil"/>
+              </w:pBdr>
+              <w:shd w:fill="auto" w:val="clear"/>
+              <w:spacing w:after="0" w:before="0" w:line="240" w:lineRule="auto"/>
+              <w:ind w:left="0" w:right="0" w:firstLine="0"/>
+              <w:jc w:val="left"/>
+              <w:rPr/>
+            </w:pPr>
+            <w:r>
+              <w:rPr>
+                <w:rtl w:val="0"/>
+              </w:rPr>
             </w:r>
           </w:p>
         </w:tc>
@@ -1598,6 +4649,13 @@
         <w:bottom w:w="0.0" w:type="dxa"/>
         <w:right w:w="108.0" w:type="dxa"/>
       </w:tblCellMar>
+    </w:tblPr>
+  </w:style>
+  <w:style w:type="table" w:styleId="Table2">
+    <w:basedOn w:val="TableNormal"/>
+    <w:tblPr>
+      <w:tblStyleRowBandSize w:val="1"/>
+      <w:tblStyleColBandSize w:val="1"/>
     </w:tblPr>
   </w:style>
 </w:styles>

</xml_diff>

<commit_message>
10/12/26-10/18/26 update time log Liza
</commit_message>
<xml_diff>
--- a/docs/Time Log Liza.docx
+++ b/docs/Time Log Liza.docx
@@ -1952,212 +1952,203 @@
           </w:tcPr>
           <w:p>
             <w:pPr>
-              <w:keepNext w:val="0"/>
-              <w:keepLines w:val="0"/>
-              <w:pageBreakBefore w:val="0"/>
-              <w:widowControl w:val="0"/>
-              <w:pBdr>
-                <w:top w:space="0" w:sz="0" w:val="nil"/>
-                <w:left w:space="0" w:sz="0" w:val="nil"/>
-                <w:bottom w:space="0" w:sz="0" w:val="nil"/>
-                <w:right w:space="0" w:sz="0" w:val="nil"/>
-                <w:between w:space="0" w:sz="0" w:val="nil"/>
-              </w:pBdr>
-              <w:shd w:fill="auto" w:val="clear"/>
-              <w:spacing w:after="0" w:before="0" w:line="240" w:lineRule="auto"/>
-              <w:ind w:left="0" w:right="0" w:firstLine="0"/>
-              <w:jc w:val="left"/>
-              <w:rPr/>
-            </w:pPr>
-            <w:r>
-              <w:rPr>
-                <w:rtl w:val="0"/>
-              </w:rPr>
-            </w:r>
-          </w:p>
-        </w:tc>
-        <w:tc>
-          <w:tcPr>
-            <w:shd w:fill="auto" w:val="clear"/>
-            <w:tcMar>
-              <w:top w:w="100.0" w:type="dxa"/>
-              <w:left w:w="100.0" w:type="dxa"/>
-              <w:bottom w:w="100.0" w:type="dxa"/>
-              <w:right w:w="100.0" w:type="dxa"/>
-            </w:tcMar>
-            <w:vAlign w:val="top"/>
-          </w:tcPr>
-          <w:p>
-            <w:pPr>
-              <w:keepNext w:val="0"/>
-              <w:keepLines w:val="0"/>
-              <w:pageBreakBefore w:val="0"/>
-              <w:widowControl w:val="0"/>
-              <w:pBdr>
-                <w:top w:space="0" w:sz="0" w:val="nil"/>
-                <w:left w:space="0" w:sz="0" w:val="nil"/>
-                <w:bottom w:space="0" w:sz="0" w:val="nil"/>
-                <w:right w:space="0" w:sz="0" w:val="nil"/>
-                <w:between w:space="0" w:sz="0" w:val="nil"/>
-              </w:pBdr>
-              <w:shd w:fill="auto" w:val="clear"/>
-              <w:spacing w:after="0" w:before="0" w:line="240" w:lineRule="auto"/>
-              <w:ind w:left="0" w:right="0" w:firstLine="0"/>
-              <w:jc w:val="left"/>
-              <w:rPr/>
-            </w:pPr>
-            <w:r>
-              <w:rPr>
-                <w:rtl w:val="0"/>
-              </w:rPr>
-            </w:r>
-          </w:p>
-        </w:tc>
-        <w:tc>
-          <w:tcPr>
-            <w:shd w:fill="auto" w:val="clear"/>
-            <w:tcMar>
-              <w:top w:w="100.0" w:type="dxa"/>
-              <w:left w:w="100.0" w:type="dxa"/>
-              <w:bottom w:w="100.0" w:type="dxa"/>
-              <w:right w:w="100.0" w:type="dxa"/>
-            </w:tcMar>
-            <w:vAlign w:val="top"/>
-          </w:tcPr>
-          <w:p>
-            <w:pPr>
-              <w:keepNext w:val="0"/>
-              <w:keepLines w:val="0"/>
-              <w:pageBreakBefore w:val="0"/>
-              <w:widowControl w:val="0"/>
-              <w:pBdr>
-                <w:top w:space="0" w:sz="0" w:val="nil"/>
-                <w:left w:space="0" w:sz="0" w:val="nil"/>
-                <w:bottom w:space="0" w:sz="0" w:val="nil"/>
-                <w:right w:space="0" w:sz="0" w:val="nil"/>
-                <w:between w:space="0" w:sz="0" w:val="nil"/>
-              </w:pBdr>
-              <w:shd w:fill="auto" w:val="clear"/>
-              <w:spacing w:after="0" w:before="0" w:line="240" w:lineRule="auto"/>
-              <w:ind w:left="0" w:right="0" w:firstLine="0"/>
-              <w:jc w:val="left"/>
-              <w:rPr/>
-            </w:pPr>
-            <w:r>
-              <w:rPr>
-                <w:rtl w:val="0"/>
-              </w:rPr>
-            </w:r>
-          </w:p>
-        </w:tc>
-        <w:tc>
-          <w:tcPr>
-            <w:shd w:fill="auto" w:val="clear"/>
-            <w:tcMar>
-              <w:top w:w="100.0" w:type="dxa"/>
-              <w:left w:w="100.0" w:type="dxa"/>
-              <w:bottom w:w="100.0" w:type="dxa"/>
-              <w:right w:w="100.0" w:type="dxa"/>
-            </w:tcMar>
-            <w:vAlign w:val="top"/>
-          </w:tcPr>
-          <w:p>
-            <w:pPr>
-              <w:keepNext w:val="0"/>
-              <w:keepLines w:val="0"/>
-              <w:pageBreakBefore w:val="0"/>
-              <w:widowControl w:val="0"/>
-              <w:pBdr>
-                <w:top w:space="0" w:sz="0" w:val="nil"/>
-                <w:left w:space="0" w:sz="0" w:val="nil"/>
-                <w:bottom w:space="0" w:sz="0" w:val="nil"/>
-                <w:right w:space="0" w:sz="0" w:val="nil"/>
-                <w:between w:space="0" w:sz="0" w:val="nil"/>
-              </w:pBdr>
-              <w:shd w:fill="auto" w:val="clear"/>
-              <w:spacing w:after="0" w:before="0" w:line="240" w:lineRule="auto"/>
-              <w:ind w:left="0" w:right="0" w:firstLine="0"/>
-              <w:jc w:val="left"/>
-              <w:rPr/>
-            </w:pPr>
-            <w:r>
-              <w:rPr>
-                <w:rtl w:val="0"/>
-              </w:rPr>
-            </w:r>
-          </w:p>
-        </w:tc>
-        <w:tc>
-          <w:tcPr>
-            <w:shd w:fill="auto" w:val="clear"/>
-            <w:tcMar>
-              <w:top w:w="100.0" w:type="dxa"/>
-              <w:left w:w="100.0" w:type="dxa"/>
-              <w:bottom w:w="100.0" w:type="dxa"/>
-              <w:right w:w="100.0" w:type="dxa"/>
-            </w:tcMar>
-            <w:vAlign w:val="top"/>
-          </w:tcPr>
-          <w:p>
-            <w:pPr>
-              <w:keepNext w:val="0"/>
-              <w:keepLines w:val="0"/>
-              <w:pageBreakBefore w:val="0"/>
-              <w:widowControl w:val="0"/>
-              <w:pBdr>
-                <w:top w:space="0" w:sz="0" w:val="nil"/>
-                <w:left w:space="0" w:sz="0" w:val="nil"/>
-                <w:bottom w:space="0" w:sz="0" w:val="nil"/>
-                <w:right w:space="0" w:sz="0" w:val="nil"/>
-                <w:between w:space="0" w:sz="0" w:val="nil"/>
-              </w:pBdr>
-              <w:shd w:fill="auto" w:val="clear"/>
-              <w:spacing w:after="0" w:before="0" w:line="240" w:lineRule="auto"/>
-              <w:ind w:left="0" w:right="0" w:firstLine="0"/>
-              <w:jc w:val="left"/>
-              <w:rPr/>
-            </w:pPr>
-            <w:r>
-              <w:rPr>
-                <w:rtl w:val="0"/>
-              </w:rPr>
-            </w:r>
-          </w:p>
-        </w:tc>
-        <w:tc>
-          <w:tcPr>
-            <w:shd w:fill="auto" w:val="clear"/>
-            <w:tcMar>
-              <w:top w:w="100.0" w:type="dxa"/>
-              <w:left w:w="100.0" w:type="dxa"/>
-              <w:bottom w:w="100.0" w:type="dxa"/>
-              <w:right w:w="100.0" w:type="dxa"/>
-            </w:tcMar>
-            <w:vAlign w:val="top"/>
-          </w:tcPr>
-          <w:p>
-            <w:pPr>
-              <w:keepNext w:val="0"/>
-              <w:keepLines w:val="0"/>
-              <w:pageBreakBefore w:val="0"/>
-              <w:widowControl w:val="0"/>
-              <w:pBdr>
-                <w:top w:space="0" w:sz="0" w:val="nil"/>
-                <w:left w:space="0" w:sz="0" w:val="nil"/>
-                <w:bottom w:space="0" w:sz="0" w:val="nil"/>
-                <w:right w:space="0" w:sz="0" w:val="nil"/>
-                <w:between w:space="0" w:sz="0" w:val="nil"/>
-              </w:pBdr>
-              <w:shd w:fill="auto" w:val="clear"/>
-              <w:spacing w:after="0" w:before="0" w:line="240" w:lineRule="auto"/>
-              <w:ind w:left="0" w:right="0" w:firstLine="0"/>
-              <w:jc w:val="left"/>
-              <w:rPr/>
-            </w:pPr>
-            <w:r>
-              <w:rPr>
-                <w:rtl w:val="0"/>
-              </w:rPr>
+              <w:rPr/>
+            </w:pPr>
+            <w:r>
+              <w:rPr>
+                <w:rtl w:val="0"/>
+              </w:rPr>
+              <w:t xml:space="preserve">Week 5: 10/12/26-10/18/26</w:t>
+            </w:r>
+          </w:p>
+        </w:tc>
+        <w:tc>
+          <w:tcPr>
+            <w:shd w:fill="auto" w:val="clear"/>
+            <w:tcMar>
+              <w:top w:w="100.0" w:type="dxa"/>
+              <w:left w:w="100.0" w:type="dxa"/>
+              <w:bottom w:w="100.0" w:type="dxa"/>
+              <w:right w:w="100.0" w:type="dxa"/>
+            </w:tcMar>
+            <w:vAlign w:val="top"/>
+          </w:tcPr>
+          <w:p>
+            <w:pPr>
+              <w:keepNext w:val="0"/>
+              <w:keepLines w:val="0"/>
+              <w:pageBreakBefore w:val="0"/>
+              <w:widowControl w:val="0"/>
+              <w:pBdr>
+                <w:top w:space="0" w:sz="0" w:val="nil"/>
+                <w:left w:space="0" w:sz="0" w:val="nil"/>
+                <w:bottom w:space="0" w:sz="0" w:val="nil"/>
+                <w:right w:space="0" w:sz="0" w:val="nil"/>
+                <w:between w:space="0" w:sz="0" w:val="nil"/>
+              </w:pBdr>
+              <w:shd w:fill="auto" w:val="clear"/>
+              <w:spacing w:after="0" w:before="0" w:line="240" w:lineRule="auto"/>
+              <w:ind w:left="0" w:right="0" w:firstLine="0"/>
+              <w:jc w:val="left"/>
+              <w:rPr/>
+            </w:pPr>
+            <w:r>
+              <w:rPr>
+                <w:rtl w:val="0"/>
+              </w:rPr>
+              <w:t xml:space="preserve">Group meeting</w:t>
+            </w:r>
+          </w:p>
+        </w:tc>
+        <w:tc>
+          <w:tcPr>
+            <w:shd w:fill="auto" w:val="clear"/>
+            <w:tcMar>
+              <w:top w:w="100.0" w:type="dxa"/>
+              <w:left w:w="100.0" w:type="dxa"/>
+              <w:bottom w:w="100.0" w:type="dxa"/>
+              <w:right w:w="100.0" w:type="dxa"/>
+            </w:tcMar>
+            <w:vAlign w:val="top"/>
+          </w:tcPr>
+          <w:p>
+            <w:pPr>
+              <w:keepNext w:val="0"/>
+              <w:keepLines w:val="0"/>
+              <w:pageBreakBefore w:val="0"/>
+              <w:widowControl w:val="0"/>
+              <w:pBdr>
+                <w:top w:space="0" w:sz="0" w:val="nil"/>
+                <w:left w:space="0" w:sz="0" w:val="nil"/>
+                <w:bottom w:space="0" w:sz="0" w:val="nil"/>
+                <w:right w:space="0" w:sz="0" w:val="nil"/>
+                <w:between w:space="0" w:sz="0" w:val="nil"/>
+              </w:pBdr>
+              <w:shd w:fill="auto" w:val="clear"/>
+              <w:spacing w:after="0" w:before="0" w:line="240" w:lineRule="auto"/>
+              <w:ind w:left="0" w:right="0" w:firstLine="0"/>
+              <w:jc w:val="left"/>
+              <w:rPr/>
+            </w:pPr>
+            <w:r>
+              <w:rPr>
+                <w:rtl w:val="0"/>
+              </w:rPr>
+              <w:t xml:space="preserve">10/16/26</w:t>
+            </w:r>
+          </w:p>
+        </w:tc>
+        <w:tc>
+          <w:tcPr>
+            <w:shd w:fill="auto" w:val="clear"/>
+            <w:tcMar>
+              <w:top w:w="100.0" w:type="dxa"/>
+              <w:left w:w="100.0" w:type="dxa"/>
+              <w:bottom w:w="100.0" w:type="dxa"/>
+              <w:right w:w="100.0" w:type="dxa"/>
+            </w:tcMar>
+            <w:vAlign w:val="top"/>
+          </w:tcPr>
+          <w:p>
+            <w:pPr>
+              <w:keepNext w:val="0"/>
+              <w:keepLines w:val="0"/>
+              <w:pageBreakBefore w:val="0"/>
+              <w:widowControl w:val="0"/>
+              <w:pBdr>
+                <w:top w:space="0" w:sz="0" w:val="nil"/>
+                <w:left w:space="0" w:sz="0" w:val="nil"/>
+                <w:bottom w:space="0" w:sz="0" w:val="nil"/>
+                <w:right w:space="0" w:sz="0" w:val="nil"/>
+                <w:between w:space="0" w:sz="0" w:val="nil"/>
+              </w:pBdr>
+              <w:shd w:fill="auto" w:val="clear"/>
+              <w:spacing w:after="0" w:before="0" w:line="240" w:lineRule="auto"/>
+              <w:ind w:left="0" w:right="0" w:firstLine="0"/>
+              <w:jc w:val="left"/>
+              <w:rPr/>
+            </w:pPr>
+            <w:r>
+              <w:rPr>
+                <w:rtl w:val="0"/>
+              </w:rPr>
+              <w:t xml:space="preserve">2.30pm</w:t>
+            </w:r>
+          </w:p>
+        </w:tc>
+        <w:tc>
+          <w:tcPr>
+            <w:shd w:fill="auto" w:val="clear"/>
+            <w:tcMar>
+              <w:top w:w="100.0" w:type="dxa"/>
+              <w:left w:w="100.0" w:type="dxa"/>
+              <w:bottom w:w="100.0" w:type="dxa"/>
+              <w:right w:w="100.0" w:type="dxa"/>
+            </w:tcMar>
+            <w:vAlign w:val="top"/>
+          </w:tcPr>
+          <w:p>
+            <w:pPr>
+              <w:keepNext w:val="0"/>
+              <w:keepLines w:val="0"/>
+              <w:pageBreakBefore w:val="0"/>
+              <w:widowControl w:val="0"/>
+              <w:pBdr>
+                <w:top w:space="0" w:sz="0" w:val="nil"/>
+                <w:left w:space="0" w:sz="0" w:val="nil"/>
+                <w:bottom w:space="0" w:sz="0" w:val="nil"/>
+                <w:right w:space="0" w:sz="0" w:val="nil"/>
+                <w:between w:space="0" w:sz="0" w:val="nil"/>
+              </w:pBdr>
+              <w:shd w:fill="auto" w:val="clear"/>
+              <w:spacing w:after="0" w:before="0" w:line="240" w:lineRule="auto"/>
+              <w:ind w:left="0" w:right="0" w:firstLine="0"/>
+              <w:jc w:val="left"/>
+              <w:rPr/>
+            </w:pPr>
+            <w:r>
+              <w:rPr>
+                <w:rtl w:val="0"/>
+              </w:rPr>
+              <w:t xml:space="preserve">3.30pm</w:t>
+            </w:r>
+          </w:p>
+        </w:tc>
+        <w:tc>
+          <w:tcPr>
+            <w:shd w:fill="auto" w:val="clear"/>
+            <w:tcMar>
+              <w:top w:w="100.0" w:type="dxa"/>
+              <w:left w:w="100.0" w:type="dxa"/>
+              <w:bottom w:w="100.0" w:type="dxa"/>
+              <w:right w:w="100.0" w:type="dxa"/>
+            </w:tcMar>
+            <w:vAlign w:val="top"/>
+          </w:tcPr>
+          <w:p>
+            <w:pPr>
+              <w:keepNext w:val="0"/>
+              <w:keepLines w:val="0"/>
+              <w:pageBreakBefore w:val="0"/>
+              <w:widowControl w:val="0"/>
+              <w:pBdr>
+                <w:top w:space="0" w:sz="0" w:val="nil"/>
+                <w:left w:space="0" w:sz="0" w:val="nil"/>
+                <w:bottom w:space="0" w:sz="0" w:val="nil"/>
+                <w:right w:space="0" w:sz="0" w:val="nil"/>
+                <w:between w:space="0" w:sz="0" w:val="nil"/>
+              </w:pBdr>
+              <w:shd w:fill="auto" w:val="clear"/>
+              <w:spacing w:after="0" w:before="0" w:line="240" w:lineRule="auto"/>
+              <w:ind w:left="0" w:right="0" w:firstLine="0"/>
+              <w:jc w:val="left"/>
+              <w:rPr/>
+            </w:pPr>
+            <w:r>
+              <w:rPr>
+                <w:rtl w:val="0"/>
+              </w:rPr>
+              <w:t xml:space="preserve">60min</w:t>
             </w:r>
           </w:p>
         </w:tc>
@@ -2238,154 +2229,146 @@
               <w:rPr>
                 <w:rtl w:val="0"/>
               </w:rPr>
-            </w:r>
-          </w:p>
-        </w:tc>
-        <w:tc>
-          <w:tcPr>
-            <w:shd w:fill="auto" w:val="clear"/>
-            <w:tcMar>
-              <w:top w:w="100.0" w:type="dxa"/>
-              <w:left w:w="100.0" w:type="dxa"/>
-              <w:bottom w:w="100.0" w:type="dxa"/>
-              <w:right w:w="100.0" w:type="dxa"/>
-            </w:tcMar>
-            <w:vAlign w:val="top"/>
-          </w:tcPr>
-          <w:p>
-            <w:pPr>
-              <w:keepNext w:val="0"/>
-              <w:keepLines w:val="0"/>
-              <w:pageBreakBefore w:val="0"/>
-              <w:widowControl w:val="0"/>
-              <w:pBdr>
-                <w:top w:space="0" w:sz="0" w:val="nil"/>
-                <w:left w:space="0" w:sz="0" w:val="nil"/>
-                <w:bottom w:space="0" w:sz="0" w:val="nil"/>
-                <w:right w:space="0" w:sz="0" w:val="nil"/>
-                <w:between w:space="0" w:sz="0" w:val="nil"/>
-              </w:pBdr>
-              <w:shd w:fill="auto" w:val="clear"/>
-              <w:spacing w:after="0" w:before="0" w:line="240" w:lineRule="auto"/>
-              <w:ind w:left="0" w:right="0" w:firstLine="0"/>
-              <w:jc w:val="left"/>
-              <w:rPr/>
-            </w:pPr>
-            <w:r>
-              <w:rPr>
-                <w:rtl w:val="0"/>
-              </w:rPr>
-            </w:r>
-          </w:p>
-        </w:tc>
-        <w:tc>
-          <w:tcPr>
-            <w:shd w:fill="auto" w:val="clear"/>
-            <w:tcMar>
-              <w:top w:w="100.0" w:type="dxa"/>
-              <w:left w:w="100.0" w:type="dxa"/>
-              <w:bottom w:w="100.0" w:type="dxa"/>
-              <w:right w:w="100.0" w:type="dxa"/>
-            </w:tcMar>
-            <w:vAlign w:val="top"/>
-          </w:tcPr>
-          <w:p>
-            <w:pPr>
-              <w:keepNext w:val="0"/>
-              <w:keepLines w:val="0"/>
-              <w:pageBreakBefore w:val="0"/>
-              <w:widowControl w:val="0"/>
-              <w:pBdr>
-                <w:top w:space="0" w:sz="0" w:val="nil"/>
-                <w:left w:space="0" w:sz="0" w:val="nil"/>
-                <w:bottom w:space="0" w:sz="0" w:val="nil"/>
-                <w:right w:space="0" w:sz="0" w:val="nil"/>
-                <w:between w:space="0" w:sz="0" w:val="nil"/>
-              </w:pBdr>
-              <w:shd w:fill="auto" w:val="clear"/>
-              <w:spacing w:after="0" w:before="0" w:line="240" w:lineRule="auto"/>
-              <w:ind w:left="0" w:right="0" w:firstLine="0"/>
-              <w:jc w:val="left"/>
-              <w:rPr/>
-            </w:pPr>
-            <w:r>
-              <w:rPr>
-                <w:rtl w:val="0"/>
-              </w:rPr>
-            </w:r>
-          </w:p>
-        </w:tc>
-        <w:tc>
-          <w:tcPr>
-            <w:shd w:fill="auto" w:val="clear"/>
-            <w:tcMar>
-              <w:top w:w="100.0" w:type="dxa"/>
-              <w:left w:w="100.0" w:type="dxa"/>
-              <w:bottom w:w="100.0" w:type="dxa"/>
-              <w:right w:w="100.0" w:type="dxa"/>
-            </w:tcMar>
-            <w:vAlign w:val="top"/>
-          </w:tcPr>
-          <w:p>
-            <w:pPr>
-              <w:keepNext w:val="0"/>
-              <w:keepLines w:val="0"/>
-              <w:pageBreakBefore w:val="0"/>
-              <w:widowControl w:val="0"/>
-              <w:pBdr>
-                <w:top w:space="0" w:sz="0" w:val="nil"/>
-                <w:left w:space="0" w:sz="0" w:val="nil"/>
-                <w:bottom w:space="0" w:sz="0" w:val="nil"/>
-                <w:right w:space="0" w:sz="0" w:val="nil"/>
-                <w:between w:space="0" w:sz="0" w:val="nil"/>
-              </w:pBdr>
-              <w:shd w:fill="auto" w:val="clear"/>
-              <w:spacing w:after="0" w:before="0" w:line="240" w:lineRule="auto"/>
-              <w:ind w:left="0" w:right="0" w:firstLine="0"/>
-              <w:jc w:val="left"/>
-              <w:rPr/>
-            </w:pPr>
-            <w:r>
-              <w:rPr>
-                <w:rtl w:val="0"/>
-              </w:rPr>
-            </w:r>
-          </w:p>
-        </w:tc>
-        <w:tc>
-          <w:tcPr>
-            <w:shd w:fill="auto" w:val="clear"/>
-            <w:tcMar>
-              <w:top w:w="100.0" w:type="dxa"/>
-              <w:left w:w="100.0" w:type="dxa"/>
-              <w:bottom w:w="100.0" w:type="dxa"/>
-              <w:right w:w="100.0" w:type="dxa"/>
-            </w:tcMar>
-            <w:vAlign w:val="top"/>
-          </w:tcPr>
-          <w:p>
-            <w:pPr>
-              <w:keepNext w:val="0"/>
-              <w:keepLines w:val="0"/>
-              <w:pageBreakBefore w:val="0"/>
-              <w:widowControl w:val="0"/>
-              <w:pBdr>
-                <w:top w:space="0" w:sz="0" w:val="nil"/>
-                <w:left w:space="0" w:sz="0" w:val="nil"/>
-                <w:bottom w:space="0" w:sz="0" w:val="nil"/>
-                <w:right w:space="0" w:sz="0" w:val="nil"/>
-                <w:between w:space="0" w:sz="0" w:val="nil"/>
-              </w:pBdr>
-              <w:shd w:fill="auto" w:val="clear"/>
-              <w:spacing w:after="0" w:before="0" w:line="240" w:lineRule="auto"/>
-              <w:ind w:left="0" w:right="0" w:firstLine="0"/>
-              <w:jc w:val="left"/>
-              <w:rPr/>
-            </w:pPr>
-            <w:r>
-              <w:rPr>
-                <w:rtl w:val="0"/>
-              </w:rPr>
+              <w:t xml:space="preserve">Checking document</w:t>
+            </w:r>
+          </w:p>
+        </w:tc>
+        <w:tc>
+          <w:tcPr>
+            <w:shd w:fill="auto" w:val="clear"/>
+            <w:tcMar>
+              <w:top w:w="100.0" w:type="dxa"/>
+              <w:left w:w="100.0" w:type="dxa"/>
+              <w:bottom w:w="100.0" w:type="dxa"/>
+              <w:right w:w="100.0" w:type="dxa"/>
+            </w:tcMar>
+            <w:vAlign w:val="top"/>
+          </w:tcPr>
+          <w:p>
+            <w:pPr>
+              <w:widowControl w:val="0"/>
+              <w:spacing w:after="0" w:line="240" w:lineRule="auto"/>
+              <w:rPr/>
+            </w:pPr>
+            <w:r>
+              <w:rPr>
+                <w:rtl w:val="0"/>
+              </w:rPr>
+              <w:t xml:space="preserve">10/16/26</w:t>
+            </w:r>
+          </w:p>
+        </w:tc>
+        <w:tc>
+          <w:tcPr>
+            <w:shd w:fill="auto" w:val="clear"/>
+            <w:tcMar>
+              <w:top w:w="100.0" w:type="dxa"/>
+              <w:left w:w="100.0" w:type="dxa"/>
+              <w:bottom w:w="100.0" w:type="dxa"/>
+              <w:right w:w="100.0" w:type="dxa"/>
+            </w:tcMar>
+            <w:vAlign w:val="top"/>
+          </w:tcPr>
+          <w:p>
+            <w:pPr>
+              <w:keepNext w:val="0"/>
+              <w:keepLines w:val="0"/>
+              <w:pageBreakBefore w:val="0"/>
+              <w:widowControl w:val="0"/>
+              <w:pBdr>
+                <w:top w:space="0" w:sz="0" w:val="nil"/>
+                <w:left w:space="0" w:sz="0" w:val="nil"/>
+                <w:bottom w:space="0" w:sz="0" w:val="nil"/>
+                <w:right w:space="0" w:sz="0" w:val="nil"/>
+                <w:between w:space="0" w:sz="0" w:val="nil"/>
+              </w:pBdr>
+              <w:shd w:fill="auto" w:val="clear"/>
+              <w:spacing w:after="0" w:before="0" w:line="240" w:lineRule="auto"/>
+              <w:ind w:left="0" w:right="0" w:firstLine="0"/>
+              <w:jc w:val="left"/>
+              <w:rPr/>
+            </w:pPr>
+            <w:r>
+              <w:rPr>
+                <w:rtl w:val="0"/>
+              </w:rPr>
+              <w:t xml:space="preserve">3.30pm</w:t>
+            </w:r>
+          </w:p>
+        </w:tc>
+        <w:tc>
+          <w:tcPr>
+            <w:shd w:fill="auto" w:val="clear"/>
+            <w:tcMar>
+              <w:top w:w="100.0" w:type="dxa"/>
+              <w:left w:w="100.0" w:type="dxa"/>
+              <w:bottom w:w="100.0" w:type="dxa"/>
+              <w:right w:w="100.0" w:type="dxa"/>
+            </w:tcMar>
+            <w:vAlign w:val="top"/>
+          </w:tcPr>
+          <w:p>
+            <w:pPr>
+              <w:keepNext w:val="0"/>
+              <w:keepLines w:val="0"/>
+              <w:pageBreakBefore w:val="0"/>
+              <w:widowControl w:val="0"/>
+              <w:pBdr>
+                <w:top w:space="0" w:sz="0" w:val="nil"/>
+                <w:left w:space="0" w:sz="0" w:val="nil"/>
+                <w:bottom w:space="0" w:sz="0" w:val="nil"/>
+                <w:right w:space="0" w:sz="0" w:val="nil"/>
+                <w:between w:space="0" w:sz="0" w:val="nil"/>
+              </w:pBdr>
+              <w:shd w:fill="auto" w:val="clear"/>
+              <w:spacing w:after="0" w:before="0" w:line="240" w:lineRule="auto"/>
+              <w:ind w:left="0" w:right="0" w:firstLine="0"/>
+              <w:jc w:val="left"/>
+              <w:rPr/>
+            </w:pPr>
+            <w:r>
+              <w:rPr>
+                <w:rtl w:val="0"/>
+              </w:rPr>
+              <w:t xml:space="preserve">4.30pm</w:t>
+            </w:r>
+          </w:p>
+        </w:tc>
+        <w:tc>
+          <w:tcPr>
+            <w:shd w:fill="auto" w:val="clear"/>
+            <w:tcMar>
+              <w:top w:w="100.0" w:type="dxa"/>
+              <w:left w:w="100.0" w:type="dxa"/>
+              <w:bottom w:w="100.0" w:type="dxa"/>
+              <w:right w:w="100.0" w:type="dxa"/>
+            </w:tcMar>
+            <w:vAlign w:val="top"/>
+          </w:tcPr>
+          <w:p>
+            <w:pPr>
+              <w:keepNext w:val="0"/>
+              <w:keepLines w:val="0"/>
+              <w:pageBreakBefore w:val="0"/>
+              <w:widowControl w:val="0"/>
+              <w:pBdr>
+                <w:top w:space="0" w:sz="0" w:val="nil"/>
+                <w:left w:space="0" w:sz="0" w:val="nil"/>
+                <w:bottom w:space="0" w:sz="0" w:val="nil"/>
+                <w:right w:space="0" w:sz="0" w:val="nil"/>
+                <w:between w:space="0" w:sz="0" w:val="nil"/>
+              </w:pBdr>
+              <w:shd w:fill="auto" w:val="clear"/>
+              <w:spacing w:after="0" w:before="0" w:line="240" w:lineRule="auto"/>
+              <w:ind w:left="0" w:right="0" w:firstLine="0"/>
+              <w:jc w:val="left"/>
+              <w:rPr/>
+            </w:pPr>
+            <w:r>
+              <w:rPr>
+                <w:rtl w:val="0"/>
+              </w:rPr>
+              <w:t xml:space="preserve">60min</w:t>
             </w:r>
           </w:p>
         </w:tc>
@@ -2593,27 +2576,14 @@
           </w:tcPr>
           <w:p>
             <w:pPr>
-              <w:keepNext w:val="0"/>
-              <w:keepLines w:val="0"/>
-              <w:pageBreakBefore w:val="0"/>
-              <w:widowControl w:val="0"/>
-              <w:pBdr>
-                <w:top w:space="0" w:sz="0" w:val="nil"/>
-                <w:left w:space="0" w:sz="0" w:val="nil"/>
-                <w:bottom w:space="0" w:sz="0" w:val="nil"/>
-                <w:right w:space="0" w:sz="0" w:val="nil"/>
-                <w:between w:space="0" w:sz="0" w:val="nil"/>
-              </w:pBdr>
-              <w:shd w:fill="auto" w:val="clear"/>
-              <w:spacing w:after="0" w:before="0" w:line="240" w:lineRule="auto"/>
-              <w:ind w:left="0" w:right="0" w:firstLine="0"/>
-              <w:jc w:val="left"/>
-              <w:rPr/>
-            </w:pPr>
-            <w:r>
-              <w:rPr>
-                <w:rtl w:val="0"/>
-              </w:rPr>
+              <w:spacing w:after="0" w:line="240" w:lineRule="auto"/>
+              <w:rPr/>
+            </w:pPr>
+            <w:r>
+              <w:rPr>
+                <w:rtl w:val="0"/>
+              </w:rPr>
+              <w:t xml:space="preserve">Week total: 120min</w:t>
             </w:r>
           </w:p>
         </w:tc>

</xml_diff>

<commit_message>
10/19/26-10/25/26 update time log Liza
</commit_message>
<xml_diff>
--- a/docs/Time Log Liza.docx
+++ b/docs/Time Log Liza.docx
@@ -2606,212 +2606,190 @@
           </w:tcPr>
           <w:p>
             <w:pPr>
-              <w:keepNext w:val="0"/>
-              <w:keepLines w:val="0"/>
-              <w:pageBreakBefore w:val="0"/>
-              <w:widowControl w:val="0"/>
-              <w:pBdr>
-                <w:top w:space="0" w:sz="0" w:val="nil"/>
-                <w:left w:space="0" w:sz="0" w:val="nil"/>
-                <w:bottom w:space="0" w:sz="0" w:val="nil"/>
-                <w:right w:space="0" w:sz="0" w:val="nil"/>
-                <w:between w:space="0" w:sz="0" w:val="nil"/>
-              </w:pBdr>
-              <w:shd w:fill="auto" w:val="clear"/>
-              <w:spacing w:after="0" w:before="0" w:line="240" w:lineRule="auto"/>
-              <w:ind w:left="0" w:right="0" w:firstLine="0"/>
-              <w:jc w:val="left"/>
-              <w:rPr/>
-            </w:pPr>
-            <w:r>
-              <w:rPr>
-                <w:rtl w:val="0"/>
-              </w:rPr>
-            </w:r>
-          </w:p>
-        </w:tc>
-        <w:tc>
-          <w:tcPr>
-            <w:shd w:fill="auto" w:val="clear"/>
-            <w:tcMar>
-              <w:top w:w="100.0" w:type="dxa"/>
-              <w:left w:w="100.0" w:type="dxa"/>
-              <w:bottom w:w="100.0" w:type="dxa"/>
-              <w:right w:w="100.0" w:type="dxa"/>
-            </w:tcMar>
-            <w:vAlign w:val="top"/>
-          </w:tcPr>
-          <w:p>
-            <w:pPr>
-              <w:keepNext w:val="0"/>
-              <w:keepLines w:val="0"/>
-              <w:pageBreakBefore w:val="0"/>
-              <w:widowControl w:val="0"/>
-              <w:pBdr>
-                <w:top w:space="0" w:sz="0" w:val="nil"/>
-                <w:left w:space="0" w:sz="0" w:val="nil"/>
-                <w:bottom w:space="0" w:sz="0" w:val="nil"/>
-                <w:right w:space="0" w:sz="0" w:val="nil"/>
-                <w:between w:space="0" w:sz="0" w:val="nil"/>
-              </w:pBdr>
-              <w:shd w:fill="auto" w:val="clear"/>
-              <w:spacing w:after="0" w:before="0" w:line="240" w:lineRule="auto"/>
-              <w:ind w:left="0" w:right="0" w:firstLine="0"/>
-              <w:jc w:val="left"/>
-              <w:rPr/>
-            </w:pPr>
-            <w:r>
-              <w:rPr>
-                <w:rtl w:val="0"/>
-              </w:rPr>
-            </w:r>
-          </w:p>
-        </w:tc>
-        <w:tc>
-          <w:tcPr>
-            <w:shd w:fill="auto" w:val="clear"/>
-            <w:tcMar>
-              <w:top w:w="100.0" w:type="dxa"/>
-              <w:left w:w="100.0" w:type="dxa"/>
-              <w:bottom w:w="100.0" w:type="dxa"/>
-              <w:right w:w="100.0" w:type="dxa"/>
-            </w:tcMar>
-            <w:vAlign w:val="top"/>
-          </w:tcPr>
-          <w:p>
-            <w:pPr>
-              <w:keepNext w:val="0"/>
-              <w:keepLines w:val="0"/>
-              <w:pageBreakBefore w:val="0"/>
-              <w:widowControl w:val="0"/>
-              <w:pBdr>
-                <w:top w:space="0" w:sz="0" w:val="nil"/>
-                <w:left w:space="0" w:sz="0" w:val="nil"/>
-                <w:bottom w:space="0" w:sz="0" w:val="nil"/>
-                <w:right w:space="0" w:sz="0" w:val="nil"/>
-                <w:between w:space="0" w:sz="0" w:val="nil"/>
-              </w:pBdr>
-              <w:shd w:fill="auto" w:val="clear"/>
-              <w:spacing w:after="0" w:before="0" w:line="240" w:lineRule="auto"/>
-              <w:ind w:left="0" w:right="0" w:firstLine="0"/>
-              <w:jc w:val="left"/>
-              <w:rPr/>
-            </w:pPr>
-            <w:r>
-              <w:rPr>
-                <w:rtl w:val="0"/>
-              </w:rPr>
-            </w:r>
-          </w:p>
-        </w:tc>
-        <w:tc>
-          <w:tcPr>
-            <w:shd w:fill="auto" w:val="clear"/>
-            <w:tcMar>
-              <w:top w:w="100.0" w:type="dxa"/>
-              <w:left w:w="100.0" w:type="dxa"/>
-              <w:bottom w:w="100.0" w:type="dxa"/>
-              <w:right w:w="100.0" w:type="dxa"/>
-            </w:tcMar>
-            <w:vAlign w:val="top"/>
-          </w:tcPr>
-          <w:p>
-            <w:pPr>
-              <w:keepNext w:val="0"/>
-              <w:keepLines w:val="0"/>
-              <w:pageBreakBefore w:val="0"/>
-              <w:widowControl w:val="0"/>
-              <w:pBdr>
-                <w:top w:space="0" w:sz="0" w:val="nil"/>
-                <w:left w:space="0" w:sz="0" w:val="nil"/>
-                <w:bottom w:space="0" w:sz="0" w:val="nil"/>
-                <w:right w:space="0" w:sz="0" w:val="nil"/>
-                <w:between w:space="0" w:sz="0" w:val="nil"/>
-              </w:pBdr>
-              <w:shd w:fill="auto" w:val="clear"/>
-              <w:spacing w:after="0" w:before="0" w:line="240" w:lineRule="auto"/>
-              <w:ind w:left="0" w:right="0" w:firstLine="0"/>
-              <w:jc w:val="left"/>
-              <w:rPr/>
-            </w:pPr>
-            <w:r>
-              <w:rPr>
-                <w:rtl w:val="0"/>
-              </w:rPr>
-            </w:r>
-          </w:p>
-        </w:tc>
-        <w:tc>
-          <w:tcPr>
-            <w:shd w:fill="auto" w:val="clear"/>
-            <w:tcMar>
-              <w:top w:w="100.0" w:type="dxa"/>
-              <w:left w:w="100.0" w:type="dxa"/>
-              <w:bottom w:w="100.0" w:type="dxa"/>
-              <w:right w:w="100.0" w:type="dxa"/>
-            </w:tcMar>
-            <w:vAlign w:val="top"/>
-          </w:tcPr>
-          <w:p>
-            <w:pPr>
-              <w:keepNext w:val="0"/>
-              <w:keepLines w:val="0"/>
-              <w:pageBreakBefore w:val="0"/>
-              <w:widowControl w:val="0"/>
-              <w:pBdr>
-                <w:top w:space="0" w:sz="0" w:val="nil"/>
-                <w:left w:space="0" w:sz="0" w:val="nil"/>
-                <w:bottom w:space="0" w:sz="0" w:val="nil"/>
-                <w:right w:space="0" w:sz="0" w:val="nil"/>
-                <w:between w:space="0" w:sz="0" w:val="nil"/>
-              </w:pBdr>
-              <w:shd w:fill="auto" w:val="clear"/>
-              <w:spacing w:after="0" w:before="0" w:line="240" w:lineRule="auto"/>
-              <w:ind w:left="0" w:right="0" w:firstLine="0"/>
-              <w:jc w:val="left"/>
-              <w:rPr/>
-            </w:pPr>
-            <w:r>
-              <w:rPr>
-                <w:rtl w:val="0"/>
-              </w:rPr>
-            </w:r>
-          </w:p>
-        </w:tc>
-        <w:tc>
-          <w:tcPr>
-            <w:shd w:fill="auto" w:val="clear"/>
-            <w:tcMar>
-              <w:top w:w="100.0" w:type="dxa"/>
-              <w:left w:w="100.0" w:type="dxa"/>
-              <w:bottom w:w="100.0" w:type="dxa"/>
-              <w:right w:w="100.0" w:type="dxa"/>
-            </w:tcMar>
-            <w:vAlign w:val="top"/>
-          </w:tcPr>
-          <w:p>
-            <w:pPr>
-              <w:keepNext w:val="0"/>
-              <w:keepLines w:val="0"/>
-              <w:pageBreakBefore w:val="0"/>
-              <w:widowControl w:val="0"/>
-              <w:pBdr>
-                <w:top w:space="0" w:sz="0" w:val="nil"/>
-                <w:left w:space="0" w:sz="0" w:val="nil"/>
-                <w:bottom w:space="0" w:sz="0" w:val="nil"/>
-                <w:right w:space="0" w:sz="0" w:val="nil"/>
-                <w:between w:space="0" w:sz="0" w:val="nil"/>
-              </w:pBdr>
-              <w:shd w:fill="auto" w:val="clear"/>
-              <w:spacing w:after="0" w:before="0" w:line="240" w:lineRule="auto"/>
-              <w:ind w:left="0" w:right="0" w:firstLine="0"/>
-              <w:jc w:val="left"/>
-              <w:rPr/>
-            </w:pPr>
-            <w:r>
-              <w:rPr>
-                <w:rtl w:val="0"/>
-              </w:rPr>
+              <w:rPr/>
+            </w:pPr>
+            <w:r>
+              <w:rPr>
+                <w:rtl w:val="0"/>
+              </w:rPr>
+              <w:t xml:space="preserve">Week 6: 10/19/26-10/25/26</w:t>
+            </w:r>
+          </w:p>
+        </w:tc>
+        <w:tc>
+          <w:tcPr>
+            <w:shd w:fill="auto" w:val="clear"/>
+            <w:tcMar>
+              <w:top w:w="100.0" w:type="dxa"/>
+              <w:left w:w="100.0" w:type="dxa"/>
+              <w:bottom w:w="100.0" w:type="dxa"/>
+              <w:right w:w="100.0" w:type="dxa"/>
+            </w:tcMar>
+            <w:vAlign w:val="top"/>
+          </w:tcPr>
+          <w:p>
+            <w:pPr>
+              <w:widowControl w:val="0"/>
+              <w:spacing w:after="0" w:line="240" w:lineRule="auto"/>
+              <w:rPr/>
+            </w:pPr>
+            <w:r>
+              <w:rPr>
+                <w:rtl w:val="0"/>
+              </w:rPr>
+              <w:t xml:space="preserve">Checking document for phase 2</w:t>
+            </w:r>
+          </w:p>
+        </w:tc>
+        <w:tc>
+          <w:tcPr>
+            <w:shd w:fill="auto" w:val="clear"/>
+            <w:tcMar>
+              <w:top w:w="100.0" w:type="dxa"/>
+              <w:left w:w="100.0" w:type="dxa"/>
+              <w:bottom w:w="100.0" w:type="dxa"/>
+              <w:right w:w="100.0" w:type="dxa"/>
+            </w:tcMar>
+            <w:vAlign w:val="top"/>
+          </w:tcPr>
+          <w:p>
+            <w:pPr>
+              <w:keepNext w:val="0"/>
+              <w:keepLines w:val="0"/>
+              <w:pageBreakBefore w:val="0"/>
+              <w:widowControl w:val="0"/>
+              <w:pBdr>
+                <w:top w:space="0" w:sz="0" w:val="nil"/>
+                <w:left w:space="0" w:sz="0" w:val="nil"/>
+                <w:bottom w:space="0" w:sz="0" w:val="nil"/>
+                <w:right w:space="0" w:sz="0" w:val="nil"/>
+                <w:between w:space="0" w:sz="0" w:val="nil"/>
+              </w:pBdr>
+              <w:shd w:fill="auto" w:val="clear"/>
+              <w:spacing w:after="0" w:before="0" w:line="240" w:lineRule="auto"/>
+              <w:ind w:left="0" w:right="0" w:firstLine="0"/>
+              <w:jc w:val="left"/>
+              <w:rPr/>
+            </w:pPr>
+            <w:r>
+              <w:rPr>
+                <w:rtl w:val="0"/>
+              </w:rPr>
+              <w:t xml:space="preserve">10/21/26</w:t>
+            </w:r>
+          </w:p>
+        </w:tc>
+        <w:tc>
+          <w:tcPr>
+            <w:shd w:fill="auto" w:val="clear"/>
+            <w:tcMar>
+              <w:top w:w="100.0" w:type="dxa"/>
+              <w:left w:w="100.0" w:type="dxa"/>
+              <w:bottom w:w="100.0" w:type="dxa"/>
+              <w:right w:w="100.0" w:type="dxa"/>
+            </w:tcMar>
+            <w:vAlign w:val="top"/>
+          </w:tcPr>
+          <w:p>
+            <w:pPr>
+              <w:keepNext w:val="0"/>
+              <w:keepLines w:val="0"/>
+              <w:pageBreakBefore w:val="0"/>
+              <w:widowControl w:val="0"/>
+              <w:pBdr>
+                <w:top w:space="0" w:sz="0" w:val="nil"/>
+                <w:left w:space="0" w:sz="0" w:val="nil"/>
+                <w:bottom w:space="0" w:sz="0" w:val="nil"/>
+                <w:right w:space="0" w:sz="0" w:val="nil"/>
+                <w:between w:space="0" w:sz="0" w:val="nil"/>
+              </w:pBdr>
+              <w:shd w:fill="auto" w:val="clear"/>
+              <w:spacing w:after="0" w:before="0" w:line="240" w:lineRule="auto"/>
+              <w:ind w:left="0" w:right="0" w:firstLine="0"/>
+              <w:jc w:val="left"/>
+              <w:rPr/>
+            </w:pPr>
+            <w:r>
+              <w:rPr>
+                <w:rtl w:val="0"/>
+              </w:rPr>
+              <w:t xml:space="preserve">3pm</w:t>
+            </w:r>
+          </w:p>
+        </w:tc>
+        <w:tc>
+          <w:tcPr>
+            <w:shd w:fill="auto" w:val="clear"/>
+            <w:tcMar>
+              <w:top w:w="100.0" w:type="dxa"/>
+              <w:left w:w="100.0" w:type="dxa"/>
+              <w:bottom w:w="100.0" w:type="dxa"/>
+              <w:right w:w="100.0" w:type="dxa"/>
+            </w:tcMar>
+            <w:vAlign w:val="top"/>
+          </w:tcPr>
+          <w:p>
+            <w:pPr>
+              <w:keepNext w:val="0"/>
+              <w:keepLines w:val="0"/>
+              <w:pageBreakBefore w:val="0"/>
+              <w:widowControl w:val="0"/>
+              <w:pBdr>
+                <w:top w:space="0" w:sz="0" w:val="nil"/>
+                <w:left w:space="0" w:sz="0" w:val="nil"/>
+                <w:bottom w:space="0" w:sz="0" w:val="nil"/>
+                <w:right w:space="0" w:sz="0" w:val="nil"/>
+                <w:between w:space="0" w:sz="0" w:val="nil"/>
+              </w:pBdr>
+              <w:shd w:fill="auto" w:val="clear"/>
+              <w:spacing w:after="0" w:before="0" w:line="240" w:lineRule="auto"/>
+              <w:ind w:left="0" w:right="0" w:firstLine="0"/>
+              <w:jc w:val="left"/>
+              <w:rPr/>
+            </w:pPr>
+            <w:r>
+              <w:rPr>
+                <w:rtl w:val="0"/>
+              </w:rPr>
+              <w:t xml:space="preserve">4:30pm</w:t>
+            </w:r>
+          </w:p>
+        </w:tc>
+        <w:tc>
+          <w:tcPr>
+            <w:shd w:fill="auto" w:val="clear"/>
+            <w:tcMar>
+              <w:top w:w="100.0" w:type="dxa"/>
+              <w:left w:w="100.0" w:type="dxa"/>
+              <w:bottom w:w="100.0" w:type="dxa"/>
+              <w:right w:w="100.0" w:type="dxa"/>
+            </w:tcMar>
+            <w:vAlign w:val="top"/>
+          </w:tcPr>
+          <w:p>
+            <w:pPr>
+              <w:keepNext w:val="0"/>
+              <w:keepLines w:val="0"/>
+              <w:pageBreakBefore w:val="0"/>
+              <w:widowControl w:val="0"/>
+              <w:pBdr>
+                <w:top w:space="0" w:sz="0" w:val="nil"/>
+                <w:left w:space="0" w:sz="0" w:val="nil"/>
+                <w:bottom w:space="0" w:sz="0" w:val="nil"/>
+                <w:right w:space="0" w:sz="0" w:val="nil"/>
+                <w:between w:space="0" w:sz="0" w:val="nil"/>
+              </w:pBdr>
+              <w:shd w:fill="auto" w:val="clear"/>
+              <w:spacing w:after="0" w:before="0" w:line="240" w:lineRule="auto"/>
+              <w:ind w:left="0" w:right="0" w:firstLine="0"/>
+              <w:jc w:val="left"/>
+              <w:rPr/>
+            </w:pPr>
+            <w:r>
+              <w:rPr>
+                <w:rtl w:val="0"/>
+              </w:rPr>
+              <w:t xml:space="preserve">90min</w:t>
             </w:r>
           </w:p>
         </w:tc>
@@ -2892,154 +2870,159 @@
               <w:rPr>
                 <w:rtl w:val="0"/>
               </w:rPr>
-            </w:r>
-          </w:p>
-        </w:tc>
-        <w:tc>
-          <w:tcPr>
-            <w:shd w:fill="auto" w:val="clear"/>
-            <w:tcMar>
-              <w:top w:w="100.0" w:type="dxa"/>
-              <w:left w:w="100.0" w:type="dxa"/>
-              <w:bottom w:w="100.0" w:type="dxa"/>
-              <w:right w:w="100.0" w:type="dxa"/>
-            </w:tcMar>
-            <w:vAlign w:val="top"/>
-          </w:tcPr>
-          <w:p>
-            <w:pPr>
-              <w:keepNext w:val="0"/>
-              <w:keepLines w:val="0"/>
-              <w:pageBreakBefore w:val="0"/>
-              <w:widowControl w:val="0"/>
-              <w:pBdr>
-                <w:top w:space="0" w:sz="0" w:val="nil"/>
-                <w:left w:space="0" w:sz="0" w:val="nil"/>
-                <w:bottom w:space="0" w:sz="0" w:val="nil"/>
-                <w:right w:space="0" w:sz="0" w:val="nil"/>
-                <w:between w:space="0" w:sz="0" w:val="nil"/>
-              </w:pBdr>
-              <w:shd w:fill="auto" w:val="clear"/>
-              <w:spacing w:after="0" w:before="0" w:line="240" w:lineRule="auto"/>
-              <w:ind w:left="0" w:right="0" w:firstLine="0"/>
-              <w:jc w:val="left"/>
-              <w:rPr/>
-            </w:pPr>
-            <w:r>
-              <w:rPr>
-                <w:rtl w:val="0"/>
-              </w:rPr>
-            </w:r>
-          </w:p>
-        </w:tc>
-        <w:tc>
-          <w:tcPr>
-            <w:shd w:fill="auto" w:val="clear"/>
-            <w:tcMar>
-              <w:top w:w="100.0" w:type="dxa"/>
-              <w:left w:w="100.0" w:type="dxa"/>
-              <w:bottom w:w="100.0" w:type="dxa"/>
-              <w:right w:w="100.0" w:type="dxa"/>
-            </w:tcMar>
-            <w:vAlign w:val="top"/>
-          </w:tcPr>
-          <w:p>
-            <w:pPr>
-              <w:keepNext w:val="0"/>
-              <w:keepLines w:val="0"/>
-              <w:pageBreakBefore w:val="0"/>
-              <w:widowControl w:val="0"/>
-              <w:pBdr>
-                <w:top w:space="0" w:sz="0" w:val="nil"/>
-                <w:left w:space="0" w:sz="0" w:val="nil"/>
-                <w:bottom w:space="0" w:sz="0" w:val="nil"/>
-                <w:right w:space="0" w:sz="0" w:val="nil"/>
-                <w:between w:space="0" w:sz="0" w:val="nil"/>
-              </w:pBdr>
-              <w:shd w:fill="auto" w:val="clear"/>
-              <w:spacing w:after="0" w:before="0" w:line="240" w:lineRule="auto"/>
-              <w:ind w:left="0" w:right="0" w:firstLine="0"/>
-              <w:jc w:val="left"/>
-              <w:rPr/>
-            </w:pPr>
-            <w:r>
-              <w:rPr>
-                <w:rtl w:val="0"/>
-              </w:rPr>
-            </w:r>
-          </w:p>
-        </w:tc>
-        <w:tc>
-          <w:tcPr>
-            <w:shd w:fill="auto" w:val="clear"/>
-            <w:tcMar>
-              <w:top w:w="100.0" w:type="dxa"/>
-              <w:left w:w="100.0" w:type="dxa"/>
-              <w:bottom w:w="100.0" w:type="dxa"/>
-              <w:right w:w="100.0" w:type="dxa"/>
-            </w:tcMar>
-            <w:vAlign w:val="top"/>
-          </w:tcPr>
-          <w:p>
-            <w:pPr>
-              <w:keepNext w:val="0"/>
-              <w:keepLines w:val="0"/>
-              <w:pageBreakBefore w:val="0"/>
-              <w:widowControl w:val="0"/>
-              <w:pBdr>
-                <w:top w:space="0" w:sz="0" w:val="nil"/>
-                <w:left w:space="0" w:sz="0" w:val="nil"/>
-                <w:bottom w:space="0" w:sz="0" w:val="nil"/>
-                <w:right w:space="0" w:sz="0" w:val="nil"/>
-                <w:between w:space="0" w:sz="0" w:val="nil"/>
-              </w:pBdr>
-              <w:shd w:fill="auto" w:val="clear"/>
-              <w:spacing w:after="0" w:before="0" w:line="240" w:lineRule="auto"/>
-              <w:ind w:left="0" w:right="0" w:firstLine="0"/>
-              <w:jc w:val="left"/>
-              <w:rPr/>
-            </w:pPr>
-            <w:r>
-              <w:rPr>
-                <w:rtl w:val="0"/>
-              </w:rPr>
-            </w:r>
-          </w:p>
-        </w:tc>
-        <w:tc>
-          <w:tcPr>
-            <w:shd w:fill="auto" w:val="clear"/>
-            <w:tcMar>
-              <w:top w:w="100.0" w:type="dxa"/>
-              <w:left w:w="100.0" w:type="dxa"/>
-              <w:bottom w:w="100.0" w:type="dxa"/>
-              <w:right w:w="100.0" w:type="dxa"/>
-            </w:tcMar>
-            <w:vAlign w:val="top"/>
-          </w:tcPr>
-          <w:p>
-            <w:pPr>
-              <w:keepNext w:val="0"/>
-              <w:keepLines w:val="0"/>
-              <w:pageBreakBefore w:val="0"/>
-              <w:widowControl w:val="0"/>
-              <w:pBdr>
-                <w:top w:space="0" w:sz="0" w:val="nil"/>
-                <w:left w:space="0" w:sz="0" w:val="nil"/>
-                <w:bottom w:space="0" w:sz="0" w:val="nil"/>
-                <w:right w:space="0" w:sz="0" w:val="nil"/>
-                <w:between w:space="0" w:sz="0" w:val="nil"/>
-              </w:pBdr>
-              <w:shd w:fill="auto" w:val="clear"/>
-              <w:spacing w:after="0" w:before="0" w:line="240" w:lineRule="auto"/>
-              <w:ind w:left="0" w:right="0" w:firstLine="0"/>
-              <w:jc w:val="left"/>
-              <w:rPr/>
-            </w:pPr>
-            <w:r>
-              <w:rPr>
-                <w:rtl w:val="0"/>
-              </w:rPr>
+              <w:t xml:space="preserve">Group meeting</w:t>
+            </w:r>
+          </w:p>
+        </w:tc>
+        <w:tc>
+          <w:tcPr>
+            <w:shd w:fill="auto" w:val="clear"/>
+            <w:tcMar>
+              <w:top w:w="100.0" w:type="dxa"/>
+              <w:left w:w="100.0" w:type="dxa"/>
+              <w:bottom w:w="100.0" w:type="dxa"/>
+              <w:right w:w="100.0" w:type="dxa"/>
+            </w:tcMar>
+            <w:vAlign w:val="top"/>
+          </w:tcPr>
+          <w:p>
+            <w:pPr>
+              <w:keepNext w:val="0"/>
+              <w:keepLines w:val="0"/>
+              <w:pageBreakBefore w:val="0"/>
+              <w:widowControl w:val="0"/>
+              <w:pBdr>
+                <w:top w:space="0" w:sz="0" w:val="nil"/>
+                <w:left w:space="0" w:sz="0" w:val="nil"/>
+                <w:bottom w:space="0" w:sz="0" w:val="nil"/>
+                <w:right w:space="0" w:sz="0" w:val="nil"/>
+                <w:between w:space="0" w:sz="0" w:val="nil"/>
+              </w:pBdr>
+              <w:shd w:fill="auto" w:val="clear"/>
+              <w:spacing w:after="0" w:before="0" w:line="240" w:lineRule="auto"/>
+              <w:ind w:left="0" w:right="0" w:firstLine="0"/>
+              <w:jc w:val="left"/>
+              <w:rPr/>
+            </w:pPr>
+            <w:r>
+              <w:rPr>
+                <w:rtl w:val="0"/>
+              </w:rPr>
+              <w:t xml:space="preserve">10/23/26</w:t>
+            </w:r>
+          </w:p>
+        </w:tc>
+        <w:tc>
+          <w:tcPr>
+            <w:shd w:fill="auto" w:val="clear"/>
+            <w:tcMar>
+              <w:top w:w="100.0" w:type="dxa"/>
+              <w:left w:w="100.0" w:type="dxa"/>
+              <w:bottom w:w="100.0" w:type="dxa"/>
+              <w:right w:w="100.0" w:type="dxa"/>
+            </w:tcMar>
+            <w:vAlign w:val="top"/>
+          </w:tcPr>
+          <w:p>
+            <w:pPr>
+              <w:keepNext w:val="0"/>
+              <w:keepLines w:val="0"/>
+              <w:pageBreakBefore w:val="0"/>
+              <w:widowControl w:val="0"/>
+              <w:pBdr>
+                <w:top w:space="0" w:sz="0" w:val="nil"/>
+                <w:left w:space="0" w:sz="0" w:val="nil"/>
+                <w:bottom w:space="0" w:sz="0" w:val="nil"/>
+                <w:right w:space="0" w:sz="0" w:val="nil"/>
+                <w:between w:space="0" w:sz="0" w:val="nil"/>
+              </w:pBdr>
+              <w:shd w:fill="auto" w:val="clear"/>
+              <w:spacing w:after="0" w:before="0" w:line="240" w:lineRule="auto"/>
+              <w:ind w:left="0" w:right="0" w:firstLine="0"/>
+              <w:jc w:val="left"/>
+              <w:rPr/>
+            </w:pPr>
+            <w:r>
+              <w:rPr>
+                <w:rtl w:val="0"/>
+              </w:rPr>
+              <w:t xml:space="preserve">11:30am</w:t>
+            </w:r>
+          </w:p>
+        </w:tc>
+        <w:tc>
+          <w:tcPr>
+            <w:shd w:fill="auto" w:val="clear"/>
+            <w:tcMar>
+              <w:top w:w="100.0" w:type="dxa"/>
+              <w:left w:w="100.0" w:type="dxa"/>
+              <w:bottom w:w="100.0" w:type="dxa"/>
+              <w:right w:w="100.0" w:type="dxa"/>
+            </w:tcMar>
+            <w:vAlign w:val="top"/>
+          </w:tcPr>
+          <w:p>
+            <w:pPr>
+              <w:keepNext w:val="0"/>
+              <w:keepLines w:val="0"/>
+              <w:pageBreakBefore w:val="0"/>
+              <w:widowControl w:val="0"/>
+              <w:pBdr>
+                <w:top w:space="0" w:sz="0" w:val="nil"/>
+                <w:left w:space="0" w:sz="0" w:val="nil"/>
+                <w:bottom w:space="0" w:sz="0" w:val="nil"/>
+                <w:right w:space="0" w:sz="0" w:val="nil"/>
+                <w:between w:space="0" w:sz="0" w:val="nil"/>
+              </w:pBdr>
+              <w:shd w:fill="auto" w:val="clear"/>
+              <w:spacing w:after="0" w:before="0" w:line="240" w:lineRule="auto"/>
+              <w:ind w:left="0" w:right="0" w:firstLine="0"/>
+              <w:jc w:val="left"/>
+              <w:rPr/>
+            </w:pPr>
+            <w:r>
+              <w:rPr>
+                <w:rtl w:val="0"/>
+              </w:rPr>
+              <w:t xml:space="preserve">12pm</w:t>
+            </w:r>
+          </w:p>
+        </w:tc>
+        <w:tc>
+          <w:tcPr>
+            <w:shd w:fill="auto" w:val="clear"/>
+            <w:tcMar>
+              <w:top w:w="100.0" w:type="dxa"/>
+              <w:left w:w="100.0" w:type="dxa"/>
+              <w:bottom w:w="100.0" w:type="dxa"/>
+              <w:right w:w="100.0" w:type="dxa"/>
+            </w:tcMar>
+            <w:vAlign w:val="top"/>
+          </w:tcPr>
+          <w:p>
+            <w:pPr>
+              <w:keepNext w:val="0"/>
+              <w:keepLines w:val="0"/>
+              <w:pageBreakBefore w:val="0"/>
+              <w:widowControl w:val="0"/>
+              <w:pBdr>
+                <w:top w:space="0" w:sz="0" w:val="nil"/>
+                <w:left w:space="0" w:sz="0" w:val="nil"/>
+                <w:bottom w:space="0" w:sz="0" w:val="nil"/>
+                <w:right w:space="0" w:sz="0" w:val="nil"/>
+                <w:between w:space="0" w:sz="0" w:val="nil"/>
+              </w:pBdr>
+              <w:shd w:fill="auto" w:val="clear"/>
+              <w:spacing w:after="0" w:before="0" w:line="240" w:lineRule="auto"/>
+              <w:ind w:left="0" w:right="0" w:firstLine="0"/>
+              <w:jc w:val="left"/>
+              <w:rPr/>
+            </w:pPr>
+            <w:r>
+              <w:rPr>
+                <w:rtl w:val="0"/>
+              </w:rPr>
+              <w:t xml:space="preserve">30min</w:t>
             </w:r>
           </w:p>
         </w:tc>
@@ -3247,27 +3230,14 @@
           </w:tcPr>
           <w:p>
             <w:pPr>
-              <w:keepNext w:val="0"/>
-              <w:keepLines w:val="0"/>
-              <w:pageBreakBefore w:val="0"/>
-              <w:widowControl w:val="0"/>
-              <w:pBdr>
-                <w:top w:space="0" w:sz="0" w:val="nil"/>
-                <w:left w:space="0" w:sz="0" w:val="nil"/>
-                <w:bottom w:space="0" w:sz="0" w:val="nil"/>
-                <w:right w:space="0" w:sz="0" w:val="nil"/>
-                <w:between w:space="0" w:sz="0" w:val="nil"/>
-              </w:pBdr>
-              <w:shd w:fill="auto" w:val="clear"/>
-              <w:spacing w:after="0" w:before="0" w:line="240" w:lineRule="auto"/>
-              <w:ind w:left="0" w:right="0" w:firstLine="0"/>
-              <w:jc w:val="left"/>
-              <w:rPr/>
-            </w:pPr>
-            <w:r>
-              <w:rPr>
-                <w:rtl w:val="0"/>
-              </w:rPr>
+              <w:spacing w:after="0" w:line="240" w:lineRule="auto"/>
+              <w:rPr/>
+            </w:pPr>
+            <w:r>
+              <w:rPr>
+                <w:rtl w:val="0"/>
+              </w:rPr>
+              <w:t xml:space="preserve">Week total: 120min</w:t>
             </w:r>
           </w:p>
         </w:tc>

</xml_diff>